<commit_message>
fix: corrige re-adicao de musicas excluidas e previne duplicatas no acervo
- Carrega acervo ao iniciar o app para verificacao de duplicatas em qualquer aba
- Adiciona verificacao local de duplicatas antes de salvar no acervo
- Mostra toast amarelo de aviso se musica ja estiver no acervo
- Mostra toast verde de sucesso ao salvar com sucesso e atualiza lista
- Renomeia botao 'Salvar Lista' para 'Add a Forja' (acao local/forja)
- Cria botao destacado laranja 'Salvar no Acervo' com texto visivel
- Corrige type hints e None comparisons no backend (database.py, main.py)
</commit_message>
<xml_diff>
--- a/backend/Livreto.docx
+++ b/backend/Livreto.docx
@@ -27,7 +27,7 @@
       <w:pPr>
         <w:pStyle w:val="Ttulo1"/>
       </w:pPr>
-      <w:bookmarkStart w:id="0" w:name="_Toc223419670"/>
+      <w:bookmarkStart w:id="0" w:name="_Toc223761058"/>
       <w:r>
         <w:lastRenderedPageBreak/>
         <w:t>Sumário</w:t>
@@ -60,7 +60,7 @@
       <w:r>
         <w:fldChar w:fldCharType="separate"/>
       </w:r>
-      <w:hyperlink w:anchor="_Toc223419670" w:history="1">
+      <w:hyperlink w:anchor="_Toc223761058" w:history="1">
         <w:r>
           <w:rPr>
             <w:rStyle w:val="Hyperlink"/>
@@ -87,7 +87,7 @@
             <w:noProof/>
             <w:webHidden/>
           </w:rPr>
-          <w:instrText xml:space="preserve"> PAGEREF _Toc223419670 \h </w:instrText>
+          <w:instrText xml:space="preserve"> PAGEREF _Toc223761058 \h </w:instrText>
         </w:r>
         <w:r>
           <w:rPr>
@@ -135,7 +135,7 @@
           <w14:ligatures w14:val="standardContextual"/>
         </w:rPr>
       </w:pPr>
-      <w:hyperlink w:anchor="_Toc223419671" w:history="1">
+      <w:hyperlink w:anchor="_Toc223761059" w:history="1">
         <w:r>
           <w:rPr>
             <w:rStyle w:val="Hyperlink"/>
@@ -162,7 +162,7 @@
             <w:noProof/>
             <w:webHidden/>
           </w:rPr>
-          <w:instrText xml:space="preserve"> PAGEREF _Toc223419671 \h </w:instrText>
+          <w:instrText xml:space="preserve"> PAGEREF _Toc223761059 \h </w:instrText>
         </w:r>
         <w:r>
           <w:rPr>
@@ -210,7 +210,7 @@
           <w14:ligatures w14:val="standardContextual"/>
         </w:rPr>
       </w:pPr>
-      <w:hyperlink w:anchor="_Toc223419672" w:history="1">
+      <w:hyperlink w:anchor="_Toc223761060" w:history="1">
         <w:r>
           <w:rPr>
             <w:rStyle w:val="Hyperlink"/>
@@ -237,7 +237,7 @@
             <w:noProof/>
             <w:webHidden/>
           </w:rPr>
-          <w:instrText xml:space="preserve"> PAGEREF _Toc223419672 \h </w:instrText>
+          <w:instrText xml:space="preserve"> PAGEREF _Toc223761060 \h </w:instrText>
         </w:r>
         <w:r>
           <w:rPr>
@@ -285,7 +285,7 @@
           <w14:ligatures w14:val="standardContextual"/>
         </w:rPr>
       </w:pPr>
-      <w:hyperlink w:anchor="_Toc223419673" w:history="1">
+      <w:hyperlink w:anchor="_Toc223761061" w:history="1">
         <w:r>
           <w:rPr>
             <w:rStyle w:val="Hyperlink"/>
@@ -312,7 +312,7 @@
             <w:noProof/>
             <w:webHidden/>
           </w:rPr>
-          <w:instrText xml:space="preserve"> PAGEREF _Toc223419673 \h </w:instrText>
+          <w:instrText xml:space="preserve"> PAGEREF _Toc223761061 \h </w:instrText>
         </w:r>
         <w:r>
           <w:rPr>
@@ -360,7 +360,7 @@
           <w14:ligatures w14:val="standardContextual"/>
         </w:rPr>
       </w:pPr>
-      <w:hyperlink w:anchor="_Toc223419674" w:history="1">
+      <w:hyperlink w:anchor="_Toc223761062" w:history="1">
         <w:r>
           <w:rPr>
             <w:rStyle w:val="Hyperlink"/>
@@ -387,7 +387,7 @@
             <w:noProof/>
             <w:webHidden/>
           </w:rPr>
-          <w:instrText xml:space="preserve"> PAGEREF _Toc223419674 \h </w:instrText>
+          <w:instrText xml:space="preserve"> PAGEREF _Toc223761062 \h </w:instrText>
         </w:r>
         <w:r>
           <w:rPr>
@@ -435,7 +435,7 @@
           <w14:ligatures w14:val="standardContextual"/>
         </w:rPr>
       </w:pPr>
-      <w:hyperlink w:anchor="_Toc223419675" w:history="1">
+      <w:hyperlink w:anchor="_Toc223761063" w:history="1">
         <w:r>
           <w:rPr>
             <w:rStyle w:val="Hyperlink"/>
@@ -462,7 +462,7 @@
             <w:noProof/>
             <w:webHidden/>
           </w:rPr>
-          <w:instrText xml:space="preserve"> PAGEREF _Toc223419675 \h </w:instrText>
+          <w:instrText xml:space="preserve"> PAGEREF _Toc223761063 \h </w:instrText>
         </w:r>
         <w:r>
           <w:rPr>
@@ -510,7 +510,7 @@
           <w14:ligatures w14:val="standardContextual"/>
         </w:rPr>
       </w:pPr>
-      <w:hyperlink w:anchor="_Toc223419676" w:history="1">
+      <w:hyperlink w:anchor="_Toc223761064" w:history="1">
         <w:r>
           <w:rPr>
             <w:rStyle w:val="Hyperlink"/>
@@ -537,7 +537,7 @@
             <w:noProof/>
             <w:webHidden/>
           </w:rPr>
-          <w:instrText xml:space="preserve"> PAGEREF _Toc223419676 \h </w:instrText>
+          <w:instrText xml:space="preserve"> PAGEREF _Toc223761064 \h </w:instrText>
         </w:r>
         <w:r>
           <w:rPr>
@@ -585,7 +585,7 @@
           <w14:ligatures w14:val="standardContextual"/>
         </w:rPr>
       </w:pPr>
-      <w:hyperlink w:anchor="_Toc223419677" w:history="1">
+      <w:hyperlink w:anchor="_Toc223761065" w:history="1">
         <w:r>
           <w:rPr>
             <w:rStyle w:val="Hyperlink"/>
@@ -612,7 +612,7 @@
             <w:noProof/>
             <w:webHidden/>
           </w:rPr>
-          <w:instrText xml:space="preserve"> PAGEREF _Toc223419677 \h </w:instrText>
+          <w:instrText xml:space="preserve"> PAGEREF _Toc223761065 \h </w:instrText>
         </w:r>
         <w:r>
           <w:rPr>
@@ -660,7 +660,7 @@
           <w14:ligatures w14:val="standardContextual"/>
         </w:rPr>
       </w:pPr>
-      <w:hyperlink w:anchor="_Toc223419678" w:history="1">
+      <w:hyperlink w:anchor="_Toc223761066" w:history="1">
         <w:r>
           <w:rPr>
             <w:rStyle w:val="Hyperlink"/>
@@ -687,7 +687,7 @@
             <w:noProof/>
             <w:webHidden/>
           </w:rPr>
-          <w:instrText xml:space="preserve"> PAGEREF _Toc223419678 \h </w:instrText>
+          <w:instrText xml:space="preserve"> PAGEREF _Toc223761066 \h </w:instrText>
         </w:r>
         <w:r>
           <w:rPr>
@@ -735,7 +735,7 @@
           <w14:ligatures w14:val="standardContextual"/>
         </w:rPr>
       </w:pPr>
-      <w:hyperlink w:anchor="_Toc223419679" w:history="1">
+      <w:hyperlink w:anchor="_Toc223761067" w:history="1">
         <w:r>
           <w:rPr>
             <w:rStyle w:val="Hyperlink"/>
@@ -762,7 +762,7 @@
             <w:noProof/>
             <w:webHidden/>
           </w:rPr>
-          <w:instrText xml:space="preserve"> PAGEREF _Toc223419679 \h </w:instrText>
+          <w:instrText xml:space="preserve"> PAGEREF _Toc223761067 \h </w:instrText>
         </w:r>
         <w:r>
           <w:rPr>
@@ -810,7 +810,7 @@
           <w14:ligatures w14:val="standardContextual"/>
         </w:rPr>
       </w:pPr>
-      <w:hyperlink w:anchor="_Toc223419680" w:history="1">
+      <w:hyperlink w:anchor="_Toc223761068" w:history="1">
         <w:r>
           <w:rPr>
             <w:rStyle w:val="Hyperlink"/>
@@ -837,7 +837,7 @@
             <w:noProof/>
             <w:webHidden/>
           </w:rPr>
-          <w:instrText xml:space="preserve"> PAGEREF _Toc223419680 \h </w:instrText>
+          <w:instrText xml:space="preserve"> PAGEREF _Toc223761068 \h </w:instrText>
         </w:r>
         <w:r>
           <w:rPr>
@@ -885,7 +885,7 @@
           <w14:ligatures w14:val="standardContextual"/>
         </w:rPr>
       </w:pPr>
-      <w:hyperlink w:anchor="_Toc223419681" w:history="1">
+      <w:hyperlink w:anchor="_Toc223761069" w:history="1">
         <w:r>
           <w:rPr>
             <w:rStyle w:val="Hyperlink"/>
@@ -912,7 +912,7 @@
             <w:noProof/>
             <w:webHidden/>
           </w:rPr>
-          <w:instrText xml:space="preserve"> PAGEREF _Toc223419681 \h </w:instrText>
+          <w:instrText xml:space="preserve"> PAGEREF _Toc223761069 \h </w:instrText>
         </w:r>
         <w:r>
           <w:rPr>
@@ -968,7 +968,7 @@
         <w:pStyle w:val="Ttulo1"/>
         <w:spacing w:before="0" w:after="40"/>
       </w:pPr>
-      <w:bookmarkStart w:id="1" w:name="_Toc223419671"/>
+      <w:bookmarkStart w:id="1" w:name="_Toc223761059"/>
       <w:r>
         <w:lastRenderedPageBreak/>
         <w:t>Amigo Que Bom Que Você Veio - Agape Uma Comunidade De Amor</w:t>
@@ -1430,7 +1430,7 @@
                 <w:noProof/>
               </w:rPr>
               <w:drawing>
-                <wp:inline distT="0" distB="0" distL="0" distR="0" wp14:anchorId="47F2D1CB" wp14:editId="49672CE4">
+                <wp:inline distT="0" distB="0" distL="0" distR="0" wp14:anchorId="4CFAEB65" wp14:editId="5125644C">
                   <wp:extent cx="621792" cy="829056"/>
                   <wp:effectExtent l="0" t="0" r="0" b="0"/>
                   <wp:docPr id="1" name="Picture 1"/>
@@ -1480,7 +1480,7 @@
                 <w:noProof/>
               </w:rPr>
               <w:drawing>
-                <wp:inline distT="0" distB="0" distL="0" distR="0" wp14:anchorId="1631FFFF" wp14:editId="173692F6">
+                <wp:inline distT="0" distB="0" distL="0" distR="0" wp14:anchorId="228592F3" wp14:editId="796337DC">
                   <wp:extent cx="621792" cy="829056"/>
                   <wp:effectExtent l="0" t="0" r="0" b="0"/>
                   <wp:docPr id="2" name="Picture 2"/>
@@ -1530,7 +1530,7 @@
                 <w:noProof/>
               </w:rPr>
               <w:drawing>
-                <wp:inline distT="0" distB="0" distL="0" distR="0" wp14:anchorId="23B0991F" wp14:editId="48EF051D">
+                <wp:inline distT="0" distB="0" distL="0" distR="0" wp14:anchorId="6E62ECFA" wp14:editId="642A2EFA">
                   <wp:extent cx="621792" cy="829056"/>
                   <wp:effectExtent l="0" t="0" r="0" b="0"/>
                   <wp:docPr id="3" name="Picture 3"/>
@@ -1580,7 +1580,7 @@
                 <w:noProof/>
               </w:rPr>
               <w:drawing>
-                <wp:inline distT="0" distB="0" distL="0" distR="0" wp14:anchorId="14A414FC" wp14:editId="75C5CD27">
+                <wp:inline distT="0" distB="0" distL="0" distR="0" wp14:anchorId="415905E9" wp14:editId="0F44945D">
                   <wp:extent cx="621792" cy="829056"/>
                   <wp:effectExtent l="0" t="0" r="0" b="0"/>
                   <wp:docPr id="4" name="Picture 4"/>
@@ -1630,7 +1630,7 @@
                 <w:noProof/>
               </w:rPr>
               <w:drawing>
-                <wp:inline distT="0" distB="0" distL="0" distR="0" wp14:anchorId="405C478E" wp14:editId="2F31EC20">
+                <wp:inline distT="0" distB="0" distL="0" distR="0" wp14:anchorId="54FC69A8" wp14:editId="726E42DF">
                   <wp:extent cx="621792" cy="829056"/>
                   <wp:effectExtent l="0" t="0" r="0" b="0"/>
                   <wp:docPr id="5" name="Picture 5"/>
@@ -1690,7 +1690,7 @@
         <w:pStyle w:val="Ttulo1"/>
         <w:spacing w:before="0" w:after="40"/>
       </w:pPr>
-      <w:bookmarkStart w:id="2" w:name="_Toc223419672"/>
+      <w:bookmarkStart w:id="2" w:name="_Toc223761060"/>
       <w:r>
         <w:lastRenderedPageBreak/>
         <w:t>Amigo Que Bom Que Você Veio - Agape Uma Comunidade De Amor</w:t>
@@ -2152,7 +2152,7 @@
                 <w:noProof/>
               </w:rPr>
               <w:drawing>
-                <wp:inline distT="0" distB="0" distL="0" distR="0" wp14:anchorId="293C63CA" wp14:editId="0CCCFFE6">
+                <wp:inline distT="0" distB="0" distL="0" distR="0" wp14:anchorId="0B0853FC" wp14:editId="598A9E79">
                   <wp:extent cx="621792" cy="829056"/>
                   <wp:effectExtent l="0" t="0" r="0" b="0"/>
                   <wp:docPr id="6" name="Picture 6"/>
@@ -2202,7 +2202,7 @@
                 <w:noProof/>
               </w:rPr>
               <w:drawing>
-                <wp:inline distT="0" distB="0" distL="0" distR="0" wp14:anchorId="2F81C0EB" wp14:editId="1FD2D136">
+                <wp:inline distT="0" distB="0" distL="0" distR="0" wp14:anchorId="35EE5D14" wp14:editId="147588EF">
                   <wp:extent cx="621792" cy="829056"/>
                   <wp:effectExtent l="0" t="0" r="0" b="0"/>
                   <wp:docPr id="7" name="Picture 7"/>
@@ -2252,7 +2252,7 @@
                 <w:noProof/>
               </w:rPr>
               <w:drawing>
-                <wp:inline distT="0" distB="0" distL="0" distR="0" wp14:anchorId="75B0D649" wp14:editId="1C19AE46">
+                <wp:inline distT="0" distB="0" distL="0" distR="0" wp14:anchorId="7C12E2EE" wp14:editId="7B98C7CF">
                   <wp:extent cx="621792" cy="829056"/>
                   <wp:effectExtent l="0" t="0" r="0" b="0"/>
                   <wp:docPr id="8" name="Picture 8"/>
@@ -2302,7 +2302,7 @@
                 <w:noProof/>
               </w:rPr>
               <w:drawing>
-                <wp:inline distT="0" distB="0" distL="0" distR="0" wp14:anchorId="203F81BB" wp14:editId="3F60B5A8">
+                <wp:inline distT="0" distB="0" distL="0" distR="0" wp14:anchorId="2F363A13" wp14:editId="4E5EB7B4">
                   <wp:extent cx="621792" cy="829056"/>
                   <wp:effectExtent l="0" t="0" r="0" b="0"/>
                   <wp:docPr id="9" name="Picture 9"/>
@@ -2352,7 +2352,7 @@
                 <w:noProof/>
               </w:rPr>
               <w:drawing>
-                <wp:inline distT="0" distB="0" distL="0" distR="0" wp14:anchorId="7C25B5E2" wp14:editId="4DBFA6B9">
+                <wp:inline distT="0" distB="0" distL="0" distR="0" wp14:anchorId="22BA5533" wp14:editId="61635314">
                   <wp:extent cx="621792" cy="829056"/>
                   <wp:effectExtent l="0" t="0" r="0" b="0"/>
                   <wp:docPr id="10" name="Picture 10"/>
@@ -2412,7 +2412,7 @@
         <w:pStyle w:val="Ttulo1"/>
         <w:spacing w:before="0" w:after="40"/>
       </w:pPr>
-      <w:bookmarkStart w:id="3" w:name="_Toc223419673"/>
+      <w:bookmarkStart w:id="3" w:name="_Toc223761061"/>
       <w:r>
         <w:lastRenderedPageBreak/>
         <w:t>Chuva De Graça - Agape Uma Comunidade De Amor</w:t>
@@ -3807,7 +3807,7 @@
                 <w:noProof/>
               </w:rPr>
               <w:drawing>
-                <wp:inline distT="0" distB="0" distL="0" distR="0" wp14:anchorId="4C6BD85B" wp14:editId="6057EA08">
+                <wp:inline distT="0" distB="0" distL="0" distR="0" wp14:anchorId="3A770008" wp14:editId="0248FD9D">
                   <wp:extent cx="621792" cy="829056"/>
                   <wp:effectExtent l="0" t="0" r="0" b="0"/>
                   <wp:docPr id="11" name="Picture 11"/>
@@ -3857,7 +3857,7 @@
                 <w:noProof/>
               </w:rPr>
               <w:drawing>
-                <wp:inline distT="0" distB="0" distL="0" distR="0" wp14:anchorId="27BA1FFB" wp14:editId="2A69A951">
+                <wp:inline distT="0" distB="0" distL="0" distR="0" wp14:anchorId="4536272F" wp14:editId="498A03ED">
                   <wp:extent cx="621792" cy="829056"/>
                   <wp:effectExtent l="0" t="0" r="0" b="0"/>
                   <wp:docPr id="12" name="Picture 12"/>
@@ -3907,7 +3907,7 @@
                 <w:noProof/>
               </w:rPr>
               <w:drawing>
-                <wp:inline distT="0" distB="0" distL="0" distR="0" wp14:anchorId="329146B1" wp14:editId="0A51CBF8">
+                <wp:inline distT="0" distB="0" distL="0" distR="0" wp14:anchorId="4EC58160" wp14:editId="0A011765">
                   <wp:extent cx="621792" cy="829056"/>
                   <wp:effectExtent l="0" t="0" r="0" b="0"/>
                   <wp:docPr id="13" name="Picture 13"/>
@@ -3957,7 +3957,7 @@
                 <w:noProof/>
               </w:rPr>
               <w:drawing>
-                <wp:inline distT="0" distB="0" distL="0" distR="0" wp14:anchorId="7F0AB07F" wp14:editId="5821FC4F">
+                <wp:inline distT="0" distB="0" distL="0" distR="0" wp14:anchorId="66EB3729" wp14:editId="68B005F2">
                   <wp:extent cx="621792" cy="829056"/>
                   <wp:effectExtent l="0" t="0" r="0" b="0"/>
                   <wp:docPr id="14" name="Picture 14"/>
@@ -4007,7 +4007,7 @@
                 <w:noProof/>
               </w:rPr>
               <w:drawing>
-                <wp:inline distT="0" distB="0" distL="0" distR="0" wp14:anchorId="2AD94C6D" wp14:editId="6D55B063">
+                <wp:inline distT="0" distB="0" distL="0" distR="0" wp14:anchorId="43E0FDE4" wp14:editId="2978D9AA">
                   <wp:extent cx="621792" cy="829056"/>
                   <wp:effectExtent l="0" t="0" r="0" b="0"/>
                   <wp:docPr id="15" name="Picture 15"/>
@@ -4057,7 +4057,7 @@
                 <w:noProof/>
               </w:rPr>
               <w:drawing>
-                <wp:inline distT="0" distB="0" distL="0" distR="0" wp14:anchorId="0B5CA80D" wp14:editId="7CA7A55A">
+                <wp:inline distT="0" distB="0" distL="0" distR="0" wp14:anchorId="1C430D53" wp14:editId="5362F654">
                   <wp:extent cx="621792" cy="829056"/>
                   <wp:effectExtent l="0" t="0" r="0" b="0"/>
                   <wp:docPr id="16" name="Picture 16"/>
@@ -4117,7 +4117,7 @@
         <w:pStyle w:val="Ttulo1"/>
         <w:spacing w:before="0" w:after="40"/>
       </w:pPr>
-      <w:bookmarkStart w:id="4" w:name="_Toc223419674"/>
+      <w:bookmarkStart w:id="4" w:name="_Toc223761062"/>
       <w:r>
         <w:lastRenderedPageBreak/>
         <w:t>Deus É Bom E Fiel - Agape Uma Comunidade De Amor</w:t>
@@ -6682,7 +6682,7 @@
                 <w:noProof/>
               </w:rPr>
               <w:drawing>
-                <wp:inline distT="0" distB="0" distL="0" distR="0" wp14:anchorId="467F7B76" wp14:editId="23B02AD2">
+                <wp:inline distT="0" distB="0" distL="0" distR="0" wp14:anchorId="1690D1CE" wp14:editId="4CCD84C8">
                   <wp:extent cx="530352" cy="707136"/>
                   <wp:effectExtent l="0" t="0" r="0" b="0"/>
                   <wp:docPr id="17" name="Picture 17"/>
@@ -6732,7 +6732,7 @@
                 <w:noProof/>
               </w:rPr>
               <w:drawing>
-                <wp:inline distT="0" distB="0" distL="0" distR="0" wp14:anchorId="386782AC" wp14:editId="760CC5CA">
+                <wp:inline distT="0" distB="0" distL="0" distR="0" wp14:anchorId="036BC84C" wp14:editId="58EFC4B4">
                   <wp:extent cx="530352" cy="707136"/>
                   <wp:effectExtent l="0" t="0" r="0" b="0"/>
                   <wp:docPr id="18" name="Picture 18"/>
@@ -6782,7 +6782,7 @@
                 <w:noProof/>
               </w:rPr>
               <w:drawing>
-                <wp:inline distT="0" distB="0" distL="0" distR="0" wp14:anchorId="630CD742" wp14:editId="7EAAE8FF">
+                <wp:inline distT="0" distB="0" distL="0" distR="0" wp14:anchorId="015A16F8" wp14:editId="782FD8F2">
                   <wp:extent cx="530352" cy="707136"/>
                   <wp:effectExtent l="0" t="0" r="0" b="0"/>
                   <wp:docPr id="19" name="Picture 19"/>
@@ -6832,7 +6832,7 @@
                 <w:noProof/>
               </w:rPr>
               <w:drawing>
-                <wp:inline distT="0" distB="0" distL="0" distR="0" wp14:anchorId="7DB97FA9" wp14:editId="50636E81">
+                <wp:inline distT="0" distB="0" distL="0" distR="0" wp14:anchorId="5EA2A63D" wp14:editId="20D04DF3">
                   <wp:extent cx="530352" cy="707136"/>
                   <wp:effectExtent l="0" t="0" r="0" b="0"/>
                   <wp:docPr id="20" name="Picture 20"/>
@@ -6882,7 +6882,7 @@
                 <w:noProof/>
               </w:rPr>
               <w:drawing>
-                <wp:inline distT="0" distB="0" distL="0" distR="0" wp14:anchorId="11932B4D" wp14:editId="55F0D3AE">
+                <wp:inline distT="0" distB="0" distL="0" distR="0" wp14:anchorId="724B2A4E" wp14:editId="48A2FA08">
                   <wp:extent cx="530352" cy="707136"/>
                   <wp:effectExtent l="0" t="0" r="0" b="0"/>
                   <wp:docPr id="21" name="Picture 21"/>
@@ -6932,7 +6932,7 @@
                 <w:noProof/>
               </w:rPr>
               <w:drawing>
-                <wp:inline distT="0" distB="0" distL="0" distR="0" wp14:anchorId="12F5A895" wp14:editId="755124F5">
+                <wp:inline distT="0" distB="0" distL="0" distR="0" wp14:anchorId="2F5EDCF3" wp14:editId="654F1A29">
                   <wp:extent cx="530352" cy="707136"/>
                   <wp:effectExtent l="0" t="0" r="0" b="0"/>
                   <wp:docPr id="22" name="Picture 22"/>
@@ -6984,7 +6984,7 @@
                 <w:noProof/>
               </w:rPr>
               <w:drawing>
-                <wp:inline distT="0" distB="0" distL="0" distR="0" wp14:anchorId="4503BA1F" wp14:editId="3B081F7D">
+                <wp:inline distT="0" distB="0" distL="0" distR="0" wp14:anchorId="26AB8677" wp14:editId="1D524877">
                   <wp:extent cx="530352" cy="707136"/>
                   <wp:effectExtent l="0" t="0" r="0" b="0"/>
                   <wp:docPr id="23" name="Picture 23"/>
@@ -7034,7 +7034,7 @@
                 <w:noProof/>
               </w:rPr>
               <w:drawing>
-                <wp:inline distT="0" distB="0" distL="0" distR="0" wp14:anchorId="41ACCB49" wp14:editId="1CFF974C">
+                <wp:inline distT="0" distB="0" distL="0" distR="0" wp14:anchorId="78B2D0C6" wp14:editId="7F002A12">
                   <wp:extent cx="530352" cy="707136"/>
                   <wp:effectExtent l="0" t="0" r="0" b="0"/>
                   <wp:docPr id="24" name="Picture 24"/>
@@ -7084,7 +7084,7 @@
                 <w:noProof/>
               </w:rPr>
               <w:drawing>
-                <wp:inline distT="0" distB="0" distL="0" distR="0" wp14:anchorId="145C080B" wp14:editId="29AD41C6">
+                <wp:inline distT="0" distB="0" distL="0" distR="0" wp14:anchorId="445AF557" wp14:editId="7082EDBC">
                   <wp:extent cx="530352" cy="707136"/>
                   <wp:effectExtent l="0" t="0" r="0" b="0"/>
                   <wp:docPr id="25" name="Picture 25"/>
@@ -7134,7 +7134,7 @@
                 <w:noProof/>
               </w:rPr>
               <w:drawing>
-                <wp:inline distT="0" distB="0" distL="0" distR="0" wp14:anchorId="76C1101C" wp14:editId="6793F170">
+                <wp:inline distT="0" distB="0" distL="0" distR="0" wp14:anchorId="69E72B0C" wp14:editId="646B5EF9">
                   <wp:extent cx="530352" cy="707136"/>
                   <wp:effectExtent l="0" t="0" r="0" b="0"/>
                   <wp:docPr id="26" name="Picture 26"/>
@@ -7184,7 +7184,7 @@
                 <w:noProof/>
               </w:rPr>
               <w:drawing>
-                <wp:inline distT="0" distB="0" distL="0" distR="0" wp14:anchorId="31A24BDA" wp14:editId="3A44AED5">
+                <wp:inline distT="0" distB="0" distL="0" distR="0" wp14:anchorId="06275AB7" wp14:editId="2ECFD34E">
                   <wp:extent cx="530352" cy="707136"/>
                   <wp:effectExtent l="0" t="0" r="0" b="0"/>
                   <wp:docPr id="27" name="Picture 27"/>
@@ -7234,7 +7234,7 @@
                 <w:noProof/>
               </w:rPr>
               <w:drawing>
-                <wp:inline distT="0" distB="0" distL="0" distR="0" wp14:anchorId="77F3E38A" wp14:editId="626D0DE1">
+                <wp:inline distT="0" distB="0" distL="0" distR="0" wp14:anchorId="75EA3358" wp14:editId="34C0B945">
                   <wp:extent cx="530352" cy="707136"/>
                   <wp:effectExtent l="0" t="0" r="0" b="0"/>
                   <wp:docPr id="28" name="Picture 28"/>
@@ -7286,7 +7286,7 @@
                 <w:noProof/>
               </w:rPr>
               <w:drawing>
-                <wp:inline distT="0" distB="0" distL="0" distR="0" wp14:anchorId="0CBA6E8C" wp14:editId="672FA35C">
+                <wp:inline distT="0" distB="0" distL="0" distR="0" wp14:anchorId="6090611C" wp14:editId="1DEA4F3B">
                   <wp:extent cx="530352" cy="707136"/>
                   <wp:effectExtent l="0" t="0" r="0" b="0"/>
                   <wp:docPr id="29" name="Picture 29"/>
@@ -7376,7 +7376,7 @@
         <w:pStyle w:val="Ttulo1"/>
         <w:spacing w:before="0" w:after="40"/>
       </w:pPr>
-      <w:bookmarkStart w:id="5" w:name="_Toc223419675"/>
+      <w:bookmarkStart w:id="5" w:name="_Toc223761063"/>
       <w:r>
         <w:lastRenderedPageBreak/>
         <w:t>Fala Que Teu Servo Escuta - Agape Uma Comunidade De Amor</w:t>
@@ -7648,7 +7648,7 @@
                 <w:noProof/>
               </w:rPr>
               <w:drawing>
-                <wp:inline distT="0" distB="0" distL="0" distR="0" wp14:anchorId="299AEA99" wp14:editId="3726B1D2">
+                <wp:inline distT="0" distB="0" distL="0" distR="0" wp14:anchorId="40EE5F07" wp14:editId="13C06C28">
                   <wp:extent cx="621792" cy="829056"/>
                   <wp:effectExtent l="0" t="0" r="0" b="0"/>
                   <wp:docPr id="30" name="Picture 30"/>
@@ -7698,7 +7698,7 @@
                 <w:noProof/>
               </w:rPr>
               <w:drawing>
-                <wp:inline distT="0" distB="0" distL="0" distR="0" wp14:anchorId="62808EA4" wp14:editId="78ED231C">
+                <wp:inline distT="0" distB="0" distL="0" distR="0" wp14:anchorId="5802017D" wp14:editId="5FFFF2C6">
                   <wp:extent cx="621792" cy="829056"/>
                   <wp:effectExtent l="0" t="0" r="0" b="0"/>
                   <wp:docPr id="31" name="Picture 31"/>
@@ -7758,7 +7758,7 @@
         <w:pStyle w:val="Ttulo1"/>
         <w:spacing w:before="0" w:after="40"/>
       </w:pPr>
-      <w:bookmarkStart w:id="6" w:name="_Toc223419676"/>
+      <w:bookmarkStart w:id="6" w:name="_Toc223761064"/>
       <w:r>
         <w:lastRenderedPageBreak/>
         <w:t>Hino Da Trindade - Agape Uma Comunidade De Amor</w:t>
@@ -8475,7 +8475,7 @@
                 <w:noProof/>
               </w:rPr>
               <w:drawing>
-                <wp:inline distT="0" distB="0" distL="0" distR="0" wp14:anchorId="3C68DAD7" wp14:editId="1DA032B7">
+                <wp:inline distT="0" distB="0" distL="0" distR="0" wp14:anchorId="79117203" wp14:editId="2D4FE65C">
                   <wp:extent cx="621792" cy="829056"/>
                   <wp:effectExtent l="0" t="0" r="0" b="0"/>
                   <wp:docPr id="32" name="Picture 32"/>
@@ -8525,7 +8525,7 @@
                 <w:noProof/>
               </w:rPr>
               <w:drawing>
-                <wp:inline distT="0" distB="0" distL="0" distR="0" wp14:anchorId="25C64A55" wp14:editId="431E6D07">
+                <wp:inline distT="0" distB="0" distL="0" distR="0" wp14:anchorId="6D452844" wp14:editId="1126B889">
                   <wp:extent cx="621792" cy="829056"/>
                   <wp:effectExtent l="0" t="0" r="0" b="0"/>
                   <wp:docPr id="33" name="Picture 33"/>
@@ -8575,7 +8575,7 @@
                 <w:noProof/>
               </w:rPr>
               <w:drawing>
-                <wp:inline distT="0" distB="0" distL="0" distR="0" wp14:anchorId="014990B2" wp14:editId="7E40A665">
+                <wp:inline distT="0" distB="0" distL="0" distR="0" wp14:anchorId="15820EC1" wp14:editId="397CB152">
                   <wp:extent cx="621792" cy="829056"/>
                   <wp:effectExtent l="0" t="0" r="0" b="0"/>
                   <wp:docPr id="34" name="Picture 34"/>
@@ -8625,7 +8625,7 @@
                 <w:noProof/>
               </w:rPr>
               <w:drawing>
-                <wp:inline distT="0" distB="0" distL="0" distR="0" wp14:anchorId="113C7791" wp14:editId="57C3B2E4">
+                <wp:inline distT="0" distB="0" distL="0" distR="0" wp14:anchorId="7FAB5AE5" wp14:editId="6BCB07AA">
                   <wp:extent cx="621792" cy="829056"/>
                   <wp:effectExtent l="0" t="0" r="0" b="0"/>
                   <wp:docPr id="35" name="Picture 35"/>
@@ -8675,7 +8675,7 @@
                 <w:noProof/>
               </w:rPr>
               <w:drawing>
-                <wp:inline distT="0" distB="0" distL="0" distR="0" wp14:anchorId="09B2BE08" wp14:editId="2930ED48">
+                <wp:inline distT="0" distB="0" distL="0" distR="0" wp14:anchorId="66F1E3FD" wp14:editId="68C45C04">
                   <wp:extent cx="621792" cy="829056"/>
                   <wp:effectExtent l="0" t="0" r="0" b="0"/>
                   <wp:docPr id="36" name="Picture 36"/>
@@ -8725,7 +8725,7 @@
                 <w:noProof/>
               </w:rPr>
               <w:drawing>
-                <wp:inline distT="0" distB="0" distL="0" distR="0" wp14:anchorId="550BBBB8" wp14:editId="3E2D7682">
+                <wp:inline distT="0" distB="0" distL="0" distR="0" wp14:anchorId="500AF000" wp14:editId="4EA61514">
                   <wp:extent cx="621792" cy="829056"/>
                   <wp:effectExtent l="0" t="0" r="0" b="0"/>
                   <wp:docPr id="37" name="Picture 37"/>
@@ -8777,7 +8777,7 @@
                 <w:noProof/>
               </w:rPr>
               <w:drawing>
-                <wp:inline distT="0" distB="0" distL="0" distR="0" wp14:anchorId="71282BF2" wp14:editId="2D2AD123">
+                <wp:inline distT="0" distB="0" distL="0" distR="0" wp14:anchorId="54837B61" wp14:editId="53210D48">
                   <wp:extent cx="621792" cy="829056"/>
                   <wp:effectExtent l="0" t="0" r="0" b="0"/>
                   <wp:docPr id="38" name="Picture 38"/>
@@ -8827,7 +8827,7 @@
                 <w:noProof/>
               </w:rPr>
               <w:drawing>
-                <wp:inline distT="0" distB="0" distL="0" distR="0" wp14:anchorId="5EA5E6AF" wp14:editId="1D8F9F8B">
+                <wp:inline distT="0" distB="0" distL="0" distR="0" wp14:anchorId="36076337" wp14:editId="54760993">
                   <wp:extent cx="621792" cy="829056"/>
                   <wp:effectExtent l="0" t="0" r="0" b="0"/>
                   <wp:docPr id="39" name="Picture 39"/>
@@ -8877,7 +8877,7 @@
                 <w:noProof/>
               </w:rPr>
               <w:drawing>
-                <wp:inline distT="0" distB="0" distL="0" distR="0" wp14:anchorId="29E8546A" wp14:editId="50FB33D5">
+                <wp:inline distT="0" distB="0" distL="0" distR="0" wp14:anchorId="4F5A2903" wp14:editId="50E44569">
                   <wp:extent cx="621792" cy="829056"/>
                   <wp:effectExtent l="0" t="0" r="0" b="0"/>
                   <wp:docPr id="40" name="Picture 40"/>
@@ -8927,7 +8927,7 @@
                 <w:noProof/>
               </w:rPr>
               <w:drawing>
-                <wp:inline distT="0" distB="0" distL="0" distR="0" wp14:anchorId="50005D9A" wp14:editId="3913B403">
+                <wp:inline distT="0" distB="0" distL="0" distR="0" wp14:anchorId="6047A782" wp14:editId="37F20250">
                   <wp:extent cx="621792" cy="829056"/>
                   <wp:effectExtent l="0" t="0" r="0" b="0"/>
                   <wp:docPr id="41" name="Picture 41"/>
@@ -8999,7 +8999,7 @@
         <w:pStyle w:val="Ttulo1"/>
         <w:spacing w:before="0" w:after="40"/>
       </w:pPr>
-      <w:bookmarkStart w:id="7" w:name="_Toc223419677"/>
+      <w:bookmarkStart w:id="7" w:name="_Toc223761065"/>
       <w:r>
         <w:lastRenderedPageBreak/>
         <w:t>O Senhor Oferecemos E</w:t>
@@ -9295,7 +9295,7 @@
                 <w:noProof/>
               </w:rPr>
               <w:drawing>
-                <wp:inline distT="0" distB="0" distL="0" distR="0" wp14:anchorId="43EDB37A" wp14:editId="110B27BD">
+                <wp:inline distT="0" distB="0" distL="0" distR="0" wp14:anchorId="5A4F99F7" wp14:editId="3AD28FF1">
                   <wp:extent cx="621792" cy="829056"/>
                   <wp:effectExtent l="0" t="0" r="0" b="0"/>
                   <wp:docPr id="42" name="Picture 42"/>
@@ -9345,7 +9345,7 @@
                 <w:noProof/>
               </w:rPr>
               <w:drawing>
-                <wp:inline distT="0" distB="0" distL="0" distR="0" wp14:anchorId="74003E05" wp14:editId="48584724">
+                <wp:inline distT="0" distB="0" distL="0" distR="0" wp14:anchorId="3AE8EA04" wp14:editId="146670A6">
                   <wp:extent cx="621792" cy="829056"/>
                   <wp:effectExtent l="0" t="0" r="0" b="0"/>
                   <wp:docPr id="43" name="Picture 43"/>
@@ -9395,7 +9395,7 @@
                 <w:noProof/>
               </w:rPr>
               <w:drawing>
-                <wp:inline distT="0" distB="0" distL="0" distR="0" wp14:anchorId="7DAE1DB2" wp14:editId="1BB62BE7">
+                <wp:inline distT="0" distB="0" distL="0" distR="0" wp14:anchorId="38FC57F0" wp14:editId="43C65E8A">
                   <wp:extent cx="621792" cy="829056"/>
                   <wp:effectExtent l="0" t="0" r="0" b="0"/>
                   <wp:docPr id="44" name="Picture 44"/>
@@ -9445,7 +9445,7 @@
                 <w:noProof/>
               </w:rPr>
               <w:drawing>
-                <wp:inline distT="0" distB="0" distL="0" distR="0" wp14:anchorId="36BF08AC" wp14:editId="59BC7A76">
+                <wp:inline distT="0" distB="0" distL="0" distR="0" wp14:anchorId="2C25B17F" wp14:editId="3D17150D">
                   <wp:extent cx="621792" cy="829056"/>
                   <wp:effectExtent l="0" t="0" r="0" b="0"/>
                   <wp:docPr id="45" name="Picture 45"/>
@@ -9495,7 +9495,7 @@
                 <w:noProof/>
               </w:rPr>
               <w:drawing>
-                <wp:inline distT="0" distB="0" distL="0" distR="0" wp14:anchorId="2EB2E1C0" wp14:editId="1F8B5745">
+                <wp:inline distT="0" distB="0" distL="0" distR="0" wp14:anchorId="398F6B3D" wp14:editId="4E11E2FE">
                   <wp:extent cx="621792" cy="829056"/>
                   <wp:effectExtent l="0" t="0" r="0" b="0"/>
                   <wp:docPr id="46" name="Picture 46"/>
@@ -9555,7 +9555,7 @@
         <w:pStyle w:val="Ttulo1"/>
         <w:spacing w:before="0" w:after="40"/>
       </w:pPr>
-      <w:bookmarkStart w:id="8" w:name="_Toc223419678"/>
+      <w:bookmarkStart w:id="8" w:name="_Toc223761066"/>
       <w:r>
         <w:lastRenderedPageBreak/>
         <w:t>Quero Louvar-Te - Agape Uma Comunidade De Amor</w:t>
@@ -10404,7 +10404,7 @@
                 <w:noProof/>
               </w:rPr>
               <w:drawing>
-                <wp:inline distT="0" distB="0" distL="0" distR="0" wp14:anchorId="3F9FC7B6" wp14:editId="6FBD5C31">
+                <wp:inline distT="0" distB="0" distL="0" distR="0" wp14:anchorId="1F3E1054" wp14:editId="2B052921">
                   <wp:extent cx="621792" cy="829056"/>
                   <wp:effectExtent l="0" t="0" r="0" b="0"/>
                   <wp:docPr id="47" name="Picture 47"/>
@@ -10454,7 +10454,7 @@
                 <w:noProof/>
               </w:rPr>
               <w:drawing>
-                <wp:inline distT="0" distB="0" distL="0" distR="0" wp14:anchorId="4E86C427" wp14:editId="231FEBDA">
+                <wp:inline distT="0" distB="0" distL="0" distR="0" wp14:anchorId="00079CD3" wp14:editId="3F180938">
                   <wp:extent cx="621792" cy="829056"/>
                   <wp:effectExtent l="0" t="0" r="0" b="0"/>
                   <wp:docPr id="48" name="Picture 48"/>
@@ -10504,7 +10504,7 @@
                 <w:noProof/>
               </w:rPr>
               <w:drawing>
-                <wp:inline distT="0" distB="0" distL="0" distR="0" wp14:anchorId="1AA7E250" wp14:editId="35A1E1EB">
+                <wp:inline distT="0" distB="0" distL="0" distR="0" wp14:anchorId="18267686" wp14:editId="169DB73E">
                   <wp:extent cx="621792" cy="829056"/>
                   <wp:effectExtent l="0" t="0" r="0" b="0"/>
                   <wp:docPr id="49" name="Picture 49"/>
@@ -10554,7 +10554,7 @@
                 <w:noProof/>
               </w:rPr>
               <w:drawing>
-                <wp:inline distT="0" distB="0" distL="0" distR="0" wp14:anchorId="1E64B975" wp14:editId="192B831D">
+                <wp:inline distT="0" distB="0" distL="0" distR="0" wp14:anchorId="3B8B80B8" wp14:editId="71D5D959">
                   <wp:extent cx="621792" cy="829056"/>
                   <wp:effectExtent l="0" t="0" r="0" b="0"/>
                   <wp:docPr id="50" name="Picture 50"/>
@@ -10604,7 +10604,7 @@
                 <w:noProof/>
               </w:rPr>
               <w:drawing>
-                <wp:inline distT="0" distB="0" distL="0" distR="0" wp14:anchorId="3551BF8F" wp14:editId="1C2EAA7E">
+                <wp:inline distT="0" distB="0" distL="0" distR="0" wp14:anchorId="3400289D" wp14:editId="0522DD7D">
                   <wp:extent cx="621792" cy="829056"/>
                   <wp:effectExtent l="0" t="0" r="0" b="0"/>
                   <wp:docPr id="51" name="Picture 51"/>
@@ -10654,7 +10654,7 @@
                 <w:noProof/>
               </w:rPr>
               <w:drawing>
-                <wp:inline distT="0" distB="0" distL="0" distR="0" wp14:anchorId="454F5992" wp14:editId="102C1FEA">
+                <wp:inline distT="0" distB="0" distL="0" distR="0" wp14:anchorId="2597BEB5" wp14:editId="497BE55E">
                   <wp:extent cx="621792" cy="829056"/>
                   <wp:effectExtent l="0" t="0" r="0" b="0"/>
                   <wp:docPr id="52" name="Picture 52"/>
@@ -10714,7 +10714,7 @@
         <w:pStyle w:val="Ttulo1"/>
         <w:spacing w:before="0" w:after="40"/>
       </w:pPr>
-      <w:bookmarkStart w:id="9" w:name="_Toc223419679"/>
+      <w:bookmarkStart w:id="9" w:name="_Toc223761067"/>
       <w:r>
         <w:lastRenderedPageBreak/>
         <w:t>Reunidos Aqui - Agape Uma Comunidade De Amor</w:t>
@@ -11056,7 +11056,7 @@
                 <w:noProof/>
               </w:rPr>
               <w:drawing>
-                <wp:inline distT="0" distB="0" distL="0" distR="0" wp14:anchorId="07D120BD" wp14:editId="7CE1A622">
+                <wp:inline distT="0" distB="0" distL="0" distR="0" wp14:anchorId="311B2928" wp14:editId="7A06AD7B">
                   <wp:extent cx="621792" cy="829056"/>
                   <wp:effectExtent l="0" t="0" r="0" b="0"/>
                   <wp:docPr id="53" name="Picture 53"/>
@@ -11106,7 +11106,7 @@
                 <w:noProof/>
               </w:rPr>
               <w:drawing>
-                <wp:inline distT="0" distB="0" distL="0" distR="0" wp14:anchorId="77AF5E62" wp14:editId="1DC4D582">
+                <wp:inline distT="0" distB="0" distL="0" distR="0" wp14:anchorId="6D3A5299" wp14:editId="717FAECA">
                   <wp:extent cx="621792" cy="829056"/>
                   <wp:effectExtent l="0" t="0" r="0" b="0"/>
                   <wp:docPr id="54" name="Picture 54"/>
@@ -11156,7 +11156,7 @@
                 <w:noProof/>
               </w:rPr>
               <w:drawing>
-                <wp:inline distT="0" distB="0" distL="0" distR="0" wp14:anchorId="233F921A" wp14:editId="58D4B9EC">
+                <wp:inline distT="0" distB="0" distL="0" distR="0" wp14:anchorId="4A617B49" wp14:editId="18C37BC2">
                   <wp:extent cx="621792" cy="829056"/>
                   <wp:effectExtent l="0" t="0" r="0" b="0"/>
                   <wp:docPr id="55" name="Picture 55"/>
@@ -11206,7 +11206,7 @@
                 <w:noProof/>
               </w:rPr>
               <w:drawing>
-                <wp:inline distT="0" distB="0" distL="0" distR="0" wp14:anchorId="73ED81B3" wp14:editId="7995B09A">
+                <wp:inline distT="0" distB="0" distL="0" distR="0" wp14:anchorId="1E6F8BF5" wp14:editId="3858FE9C">
                   <wp:extent cx="621792" cy="829056"/>
                   <wp:effectExtent l="0" t="0" r="0" b="0"/>
                   <wp:docPr id="56" name="Picture 56"/>
@@ -11256,7 +11256,7 @@
                 <w:noProof/>
               </w:rPr>
               <w:drawing>
-                <wp:inline distT="0" distB="0" distL="0" distR="0" wp14:anchorId="7EA4F875" wp14:editId="19DC8BBB">
+                <wp:inline distT="0" distB="0" distL="0" distR="0" wp14:anchorId="492C80E3" wp14:editId="4B59529D">
                   <wp:extent cx="621792" cy="829056"/>
                   <wp:effectExtent l="0" t="0" r="0" b="0"/>
                   <wp:docPr id="57" name="Picture 57"/>
@@ -11316,7 +11316,7 @@
         <w:pStyle w:val="Ttulo1"/>
         <w:spacing w:before="0" w:after="40"/>
       </w:pPr>
-      <w:bookmarkStart w:id="10" w:name="_Toc223419680"/>
+      <w:bookmarkStart w:id="10" w:name="_Toc223761068"/>
       <w:r>
         <w:lastRenderedPageBreak/>
         <w:t>Terra Seca - Agape Uma Comunidade De Amor</w:t>
@@ -12426,7 +12426,7 @@
                 <w:noProof/>
               </w:rPr>
               <w:drawing>
-                <wp:inline distT="0" distB="0" distL="0" distR="0" wp14:anchorId="3CE935B6" wp14:editId="59BE6A79">
+                <wp:inline distT="0" distB="0" distL="0" distR="0" wp14:anchorId="3CC33C2F" wp14:editId="28E8A72D">
                   <wp:extent cx="621792" cy="829056"/>
                   <wp:effectExtent l="0" t="0" r="0" b="0"/>
                   <wp:docPr id="58" name="Picture 58"/>
@@ -12476,7 +12476,7 @@
                 <w:noProof/>
               </w:rPr>
               <w:drawing>
-                <wp:inline distT="0" distB="0" distL="0" distR="0" wp14:anchorId="79077840" wp14:editId="2E9D165A">
+                <wp:inline distT="0" distB="0" distL="0" distR="0" wp14:anchorId="0062237F" wp14:editId="4FF870D0">
                   <wp:extent cx="621792" cy="829056"/>
                   <wp:effectExtent l="0" t="0" r="0" b="0"/>
                   <wp:docPr id="59" name="Picture 59"/>
@@ -12526,7 +12526,7 @@
                 <w:noProof/>
               </w:rPr>
               <w:drawing>
-                <wp:inline distT="0" distB="0" distL="0" distR="0" wp14:anchorId="5B6F5223" wp14:editId="58AEE194">
+                <wp:inline distT="0" distB="0" distL="0" distR="0" wp14:anchorId="090CC5D1" wp14:editId="4A0D9427">
                   <wp:extent cx="621792" cy="829056"/>
                   <wp:effectExtent l="0" t="0" r="0" b="0"/>
                   <wp:docPr id="60" name="Picture 60"/>
@@ -12576,7 +12576,7 @@
                 <w:noProof/>
               </w:rPr>
               <w:drawing>
-                <wp:inline distT="0" distB="0" distL="0" distR="0" wp14:anchorId="4810D4F0" wp14:editId="48C5E3CA">
+                <wp:inline distT="0" distB="0" distL="0" distR="0" wp14:anchorId="05F982F9" wp14:editId="50224606">
                   <wp:extent cx="621792" cy="829056"/>
                   <wp:effectExtent l="0" t="0" r="0" b="0"/>
                   <wp:docPr id="61" name="Picture 61"/>
@@ -12626,7 +12626,7 @@
                 <w:noProof/>
               </w:rPr>
               <w:drawing>
-                <wp:inline distT="0" distB="0" distL="0" distR="0" wp14:anchorId="6AC085BC" wp14:editId="76D776D4">
+                <wp:inline distT="0" distB="0" distL="0" distR="0" wp14:anchorId="4DE53D87" wp14:editId="6E764CB7">
                   <wp:extent cx="621792" cy="829056"/>
                   <wp:effectExtent l="0" t="0" r="0" b="0"/>
                   <wp:docPr id="62" name="Picture 62"/>
@@ -12676,7 +12676,7 @@
                 <w:noProof/>
               </w:rPr>
               <w:drawing>
-                <wp:inline distT="0" distB="0" distL="0" distR="0" wp14:anchorId="42F694AF" wp14:editId="08B2C62F">
+                <wp:inline distT="0" distB="0" distL="0" distR="0" wp14:anchorId="4B69FF2B" wp14:editId="3C6EE3AC">
                   <wp:extent cx="621792" cy="829056"/>
                   <wp:effectExtent l="0" t="0" r="0" b="0"/>
                   <wp:docPr id="63" name="Picture 63"/>
@@ -12728,7 +12728,7 @@
                 <w:noProof/>
               </w:rPr>
               <w:drawing>
-                <wp:inline distT="0" distB="0" distL="0" distR="0" wp14:anchorId="4D69ACED" wp14:editId="6A1BCE3F">
+                <wp:inline distT="0" distB="0" distL="0" distR="0" wp14:anchorId="0521092A" wp14:editId="5F695544">
                   <wp:extent cx="621792" cy="829056"/>
                   <wp:effectExtent l="0" t="0" r="0" b="0"/>
                   <wp:docPr id="64" name="Picture 64"/>
@@ -12778,7 +12778,7 @@
                 <w:noProof/>
               </w:rPr>
               <w:drawing>
-                <wp:inline distT="0" distB="0" distL="0" distR="0" wp14:anchorId="47C43209" wp14:editId="4CC0535E">
+                <wp:inline distT="0" distB="0" distL="0" distR="0" wp14:anchorId="66F8F6B4" wp14:editId="781D51E5">
                   <wp:extent cx="621792" cy="829056"/>
                   <wp:effectExtent l="0" t="0" r="0" b="0"/>
                   <wp:docPr id="65" name="Picture 65"/>
@@ -12862,7 +12862,7 @@
         <w:pStyle w:val="Ttulo1"/>
         <w:spacing w:before="0" w:after="40"/>
       </w:pPr>
-      <w:bookmarkStart w:id="11" w:name="_Toc223419681"/>
+      <w:bookmarkStart w:id="11" w:name="_Toc223761069"/>
       <w:r>
         <w:lastRenderedPageBreak/>
         <w:t>Um Novo Caminho - Agape Uma Comunidade De Amor</w:t>
@@ -14235,7 +14235,7 @@
                 <w:noProof/>
               </w:rPr>
               <w:drawing>
-                <wp:inline distT="0" distB="0" distL="0" distR="0" wp14:anchorId="094B1DA9" wp14:editId="21BD8E13">
+                <wp:inline distT="0" distB="0" distL="0" distR="0" wp14:anchorId="17DBBDB9" wp14:editId="640A1BAD">
                   <wp:extent cx="621792" cy="829056"/>
                   <wp:effectExtent l="0" t="0" r="0" b="0"/>
                   <wp:docPr id="66" name="Picture 66"/>
@@ -14285,7 +14285,7 @@
                 <w:noProof/>
               </w:rPr>
               <w:drawing>
-                <wp:inline distT="0" distB="0" distL="0" distR="0" wp14:anchorId="000032CB" wp14:editId="22A93897">
+                <wp:inline distT="0" distB="0" distL="0" distR="0" wp14:anchorId="72D4A1E6" wp14:editId="6253DD87">
                   <wp:extent cx="621792" cy="829056"/>
                   <wp:effectExtent l="0" t="0" r="0" b="0"/>
                   <wp:docPr id="67" name="Picture 67"/>
@@ -14335,7 +14335,7 @@
                 <w:noProof/>
               </w:rPr>
               <w:drawing>
-                <wp:inline distT="0" distB="0" distL="0" distR="0" wp14:anchorId="50ECBE17" wp14:editId="254559B0">
+                <wp:inline distT="0" distB="0" distL="0" distR="0" wp14:anchorId="46667050" wp14:editId="62EF98F5">
                   <wp:extent cx="621792" cy="829056"/>
                   <wp:effectExtent l="0" t="0" r="0" b="0"/>
                   <wp:docPr id="68" name="Picture 68"/>
@@ -14385,7 +14385,7 @@
                 <w:noProof/>
               </w:rPr>
               <w:drawing>
-                <wp:inline distT="0" distB="0" distL="0" distR="0" wp14:anchorId="708E8CE7" wp14:editId="27C05D33">
+                <wp:inline distT="0" distB="0" distL="0" distR="0" wp14:anchorId="1CCBDE6D" wp14:editId="5420B2E5">
                   <wp:extent cx="621792" cy="829056"/>
                   <wp:effectExtent l="0" t="0" r="0" b="0"/>
                   <wp:docPr id="69" name="Picture 69"/>
@@ -14435,7 +14435,7 @@
                 <w:noProof/>
               </w:rPr>
               <w:drawing>
-                <wp:inline distT="0" distB="0" distL="0" distR="0" wp14:anchorId="19C43AEE" wp14:editId="1815884B">
+                <wp:inline distT="0" distB="0" distL="0" distR="0" wp14:anchorId="057BD6FC" wp14:editId="7AF32236">
                   <wp:extent cx="621792" cy="829056"/>
                   <wp:effectExtent l="0" t="0" r="0" b="0"/>
                   <wp:docPr id="70" name="Picture 70"/>
@@ -14485,7 +14485,7 @@
                 <w:noProof/>
               </w:rPr>
               <w:drawing>
-                <wp:inline distT="0" distB="0" distL="0" distR="0" wp14:anchorId="0D1A51D5" wp14:editId="45C20EC7">
+                <wp:inline distT="0" distB="0" distL="0" distR="0" wp14:anchorId="5C747950" wp14:editId="7B5ECA1A">
                   <wp:extent cx="621792" cy="829056"/>
                   <wp:effectExtent l="0" t="0" r="0" b="0"/>
                   <wp:docPr id="71" name="Picture 71"/>
@@ -14537,7 +14537,7 @@
                 <w:noProof/>
               </w:rPr>
               <w:drawing>
-                <wp:inline distT="0" distB="0" distL="0" distR="0" wp14:anchorId="40BDBD30" wp14:editId="4A0FAC8F">
+                <wp:inline distT="0" distB="0" distL="0" distR="0" wp14:anchorId="7E7C31B1" wp14:editId="7D8B4304">
                   <wp:extent cx="621792" cy="829056"/>
                   <wp:effectExtent l="0" t="0" r="0" b="0"/>
                   <wp:docPr id="72" name="Picture 72"/>
@@ -14791,31 +14791,31 @@
       </w:rPr>
     </w:lvl>
   </w:abstractNum>
-  <w:num w:numId="1" w16cid:durableId="1492208723">
+  <w:num w:numId="1" w16cid:durableId="917322139">
     <w:abstractNumId w:val="8"/>
   </w:num>
-  <w:num w:numId="2" w16cid:durableId="1454639587">
+  <w:num w:numId="2" w16cid:durableId="1549687143">
     <w:abstractNumId w:val="6"/>
   </w:num>
-  <w:num w:numId="3" w16cid:durableId="1249921038">
+  <w:num w:numId="3" w16cid:durableId="1940723317">
     <w:abstractNumId w:val="5"/>
   </w:num>
-  <w:num w:numId="4" w16cid:durableId="1666738449">
+  <w:num w:numId="4" w16cid:durableId="644240966">
     <w:abstractNumId w:val="4"/>
   </w:num>
-  <w:num w:numId="5" w16cid:durableId="405690844">
+  <w:num w:numId="5" w16cid:durableId="1809785669">
     <w:abstractNumId w:val="7"/>
   </w:num>
-  <w:num w:numId="6" w16cid:durableId="1594316649">
+  <w:num w:numId="6" w16cid:durableId="1930767765">
     <w:abstractNumId w:val="3"/>
   </w:num>
-  <w:num w:numId="7" w16cid:durableId="705838213">
+  <w:num w:numId="7" w16cid:durableId="1412384683">
     <w:abstractNumId w:val="2"/>
   </w:num>
-  <w:num w:numId="8" w16cid:durableId="53547265">
+  <w:num w:numId="8" w16cid:durableId="329792321">
     <w:abstractNumId w:val="1"/>
   </w:num>
-  <w:num w:numId="9" w16cid:durableId="1170100787">
+  <w:num w:numId="9" w16cid:durableId="1928222946">
     <w:abstractNumId w:val="0"/>
   </w:num>
 </w:numbering>
@@ -26206,7 +26206,7 @@
     <w:autoRedefine/>
     <w:uiPriority w:val="39"/>
     <w:unhideWhenUsed/>
-    <w:rsid w:val="00034F3E"/>
+    <w:rsid w:val="005A26F6"/>
     <w:pPr>
       <w:spacing w:after="100"/>
     </w:pPr>
@@ -26216,7 +26216,7 @@
     <w:basedOn w:val="Fontepargpadro"/>
     <w:uiPriority w:val="99"/>
     <w:unhideWhenUsed/>
-    <w:rsid w:val="00034F3E"/>
+    <w:rsid w:val="005A26F6"/>
     <w:rPr>
       <w:color w:val="0000FF" w:themeColor="hyperlink"/>
       <w:u w:val="single"/>

</xml_diff>

<commit_message>
Implement Share Link Shortening and Social Preview Support
</commit_message>
<xml_diff>
--- a/backend/Livreto.docx
+++ b/backend/Livreto.docx
@@ -45,7 +45,7 @@
       <w:pPr>
         <w:pStyle w:val="Ttulo1"/>
       </w:pPr>
-      <w:bookmarkStart w:id="0" w:name="_Toc224070911"/>
+      <w:bookmarkStart w:id="0" w:name="_Toc224140729"/>
       <w:r>
         <w:lastRenderedPageBreak/>
         <w:t>Sumário</w:t>
@@ -80,7 +80,7 @@
         </w:rPr>
         <w:fldChar w:fldCharType="separate"/>
       </w:r>
-      <w:hyperlink w:anchor="_Toc224070911" w:history="1">
+      <w:hyperlink w:anchor="_Toc224140729" w:history="1">
         <w:r>
           <w:rPr>
             <w:rStyle w:val="Hyperlink"/>
@@ -107,7 +107,7 @@
             <w:noProof/>
             <w:webHidden/>
           </w:rPr>
-          <w:instrText xml:space="preserve"> PAGEREF _Toc224070911 \h </w:instrText>
+          <w:instrText xml:space="preserve"> PAGEREF _Toc224140729 \h </w:instrText>
         </w:r>
         <w:r>
           <w:rPr>
@@ -154,13 +154,13 @@
           <w14:ligatures w14:val="standardContextual"/>
         </w:rPr>
       </w:pPr>
-      <w:hyperlink w:anchor="_Toc224070912" w:history="1">
+      <w:hyperlink w:anchor="_Toc224140730" w:history="1">
         <w:r>
           <w:rPr>
             <w:rStyle w:val="Hyperlink"/>
             <w:noProof/>
           </w:rPr>
-          <w:t>Hino Ágape - Agape Uma Comunidade De Amor</w:t>
+          <w:t>Kyrie Eleison - Jmj Rio 2013</w:t>
         </w:r>
         <w:r>
           <w:rPr>
@@ -181,7 +181,7 @@
             <w:noProof/>
             <w:webHidden/>
           </w:rPr>
-          <w:instrText xml:space="preserve"> PAGEREF _Toc224070912 \h </w:instrText>
+          <w:instrText xml:space="preserve"> PAGEREF _Toc224140730 \h </w:instrText>
         </w:r>
         <w:r>
           <w:rPr>
@@ -251,10 +251,10 @@
         <w:pStyle w:val="Ttulo1"/>
         <w:spacing w:before="0" w:after="40"/>
       </w:pPr>
-      <w:bookmarkStart w:id="1" w:name="_Toc224070912"/>
+      <w:bookmarkStart w:id="1" w:name="_Toc224140730"/>
       <w:r>
         <w:lastRenderedPageBreak/>
-        <w:t>Hino Ágape - Agape Uma Comunidade De Amor</w:t>
+        <w:t>Kyrie Eleison - Jmj Rio 2013</w:t>
       </w:r>
       <w:bookmarkEnd w:id="1"/>
     </w:p>
@@ -266,7 +266,7 @@
         </w:rPr>
       </w:pPr>
       <w:r>
-        <w:t>Tom: G</w:t>
+        <w:t>Tom: Bm</w:t>
       </w:r>
     </w:p>
     <w:p>
@@ -284,6 +284,21 @@
     </w:p>
     <w:p>
       <w:pPr>
+        <w:keepLines/>
+        <w:spacing w:after="0" w:line="240" w:lineRule="auto"/>
+        <w:rPr>
+          <w:rFonts w:hint="eastAsia"/>
+        </w:rPr>
+      </w:pPr>
+      <w:r>
+        <w:rPr>
+          <w:sz w:val="15"/>
+        </w:rPr>
+        <w:t>[Intro] Bm7  G7M</w:t>
+      </w:r>
+    </w:p>
+    <w:p>
+      <w:pPr>
         <w:keepNext/>
         <w:keepLines/>
         <w:spacing w:after="0" w:line="240" w:lineRule="auto"/>
@@ -293,45 +308,21 @@
       </w:pPr>
       <w:r>
         <w:rPr>
-          <w:sz w:val="20"/>
-        </w:rPr>
-        <w:t>G</w:t>
-      </w:r>
-      <w:r>
-        <w:rPr>
-          <w:sz w:val="20"/>
-        </w:rPr>
-        <w:t xml:space="preserve">         </w:t>
-      </w:r>
-      <w:r>
-        <w:rPr>
-          <w:sz w:val="20"/>
-        </w:rPr>
-        <w:t>Em</w:t>
-      </w:r>
-      <w:r>
-        <w:rPr>
-          <w:sz w:val="20"/>
-        </w:rPr>
-        <w:t xml:space="preserve">                  </w:t>
-      </w:r>
-      <w:r>
-        <w:rPr>
-          <w:sz w:val="20"/>
-        </w:rPr>
-        <w:t>C</w:t>
-      </w:r>
-      <w:r>
-        <w:rPr>
-          <w:sz w:val="20"/>
-        </w:rPr>
-        <w:t xml:space="preserve">       </w:t>
-      </w:r>
-      <w:r>
-        <w:rPr>
-          <w:sz w:val="20"/>
-        </w:rPr>
-        <w:t>D</w:t>
+          <w:sz w:val="15"/>
+        </w:rPr>
+        <w:t xml:space="preserve">        </w:t>
+      </w:r>
+      <w:r>
+        <w:rPr>
+          <w:sz w:val="15"/>
+        </w:rPr>
+        <w:t>Bm7</w:t>
+      </w:r>
+      <w:r>
+        <w:rPr>
+          <w:sz w:val="15"/>
+        </w:rPr>
+        <w:t xml:space="preserve">  G7M</w:t>
       </w:r>
     </w:p>
     <w:p>
@@ -342,12 +333,30 @@
           <w:rFonts w:hint="eastAsia"/>
         </w:rPr>
       </w:pPr>
-      <w:r>
-        <w:rPr>
-          <w:sz w:val="20"/>
-        </w:rPr>
-        <w:t>Partilhar todo amor que há dentro de nós</w:t>
-      </w:r>
+    </w:p>
+    <w:p>
+      <w:pPr>
+        <w:keepLines/>
+        <w:spacing w:after="0" w:line="240" w:lineRule="auto"/>
+        <w:rPr>
+          <w:rFonts w:hint="eastAsia"/>
+        </w:rPr>
+      </w:pPr>
+      <w:r>
+        <w:rPr>
+          <w:sz w:val="15"/>
+        </w:rPr>
+        <w:t>[Primeira Parte]</w:t>
+      </w:r>
+    </w:p>
+    <w:p>
+      <w:pPr>
+        <w:keepLines/>
+        <w:spacing w:after="0" w:line="240" w:lineRule="auto"/>
+        <w:rPr>
+          <w:rFonts w:hint="eastAsia"/>
+        </w:rPr>
+      </w:pPr>
     </w:p>
     <w:p>
       <w:pPr>
@@ -360,45 +369,33 @@
       </w:pPr>
       <w:r>
         <w:rPr>
-          <w:sz w:val="20"/>
-        </w:rPr>
-        <w:t>G</w:t>
-      </w:r>
-      <w:r>
-        <w:rPr>
-          <w:sz w:val="20"/>
-        </w:rPr>
-        <w:t xml:space="preserve">         </w:t>
-      </w:r>
-      <w:r>
-        <w:rPr>
-          <w:sz w:val="20"/>
-        </w:rPr>
-        <w:t>Em</w:t>
-      </w:r>
-      <w:r>
-        <w:rPr>
-          <w:sz w:val="20"/>
-        </w:rPr>
-        <w:t xml:space="preserve">                  </w:t>
-      </w:r>
-      <w:r>
-        <w:rPr>
-          <w:sz w:val="20"/>
-        </w:rPr>
-        <w:t>C</w:t>
-      </w:r>
-      <w:r>
-        <w:rPr>
-          <w:sz w:val="20"/>
+          <w:sz w:val="15"/>
+        </w:rPr>
+        <w:t xml:space="preserve">    </w:t>
+      </w:r>
+      <w:r>
+        <w:rPr>
+          <w:sz w:val="15"/>
+        </w:rPr>
+        <w:t>Bm7</w:t>
+      </w:r>
+      <w:r>
+        <w:rPr>
+          <w:sz w:val="15"/>
         </w:rPr>
         <w:t xml:space="preserve">       </w:t>
       </w:r>
       <w:r>
         <w:rPr>
-          <w:sz w:val="20"/>
-        </w:rPr>
-        <w:t>D</w:t>
+          <w:sz w:val="15"/>
+        </w:rPr>
+        <w:t>A</w:t>
+      </w:r>
+      <w:r>
+        <w:rPr>
+          <w:sz w:val="15"/>
+        </w:rPr>
+        <w:t xml:space="preserve">      G7M</w:t>
       </w:r>
     </w:p>
     <w:p>
@@ -411,9 +408,9 @@
       </w:pPr>
       <w:r>
         <w:rPr>
-          <w:sz w:val="20"/>
-        </w:rPr>
-        <w:t>Repartir tudo que há de bom</w:t>
+          <w:sz w:val="15"/>
+        </w:rPr>
+        <w:t>Senhor, que viestes salvar</w:t>
       </w:r>
     </w:p>
     <w:p>
@@ -427,45 +424,51 @@
       </w:pPr>
       <w:r>
         <w:rPr>
-          <w:sz w:val="20"/>
-        </w:rPr>
-        <w:t>G</w:t>
-      </w:r>
-      <w:r>
-        <w:rPr>
-          <w:sz w:val="20"/>
-        </w:rPr>
-        <w:t xml:space="preserve">            </w:t>
-      </w:r>
-      <w:r>
-        <w:rPr>
-          <w:sz w:val="20"/>
-        </w:rPr>
-        <w:t>Em</w:t>
-      </w:r>
-      <w:r>
-        <w:rPr>
-          <w:sz w:val="20"/>
-        </w:rPr>
-        <w:t xml:space="preserve">               </w:t>
-      </w:r>
-      <w:r>
-        <w:rPr>
-          <w:sz w:val="20"/>
-        </w:rPr>
-        <w:t>C</w:t>
-      </w:r>
-      <w:r>
-        <w:rPr>
-          <w:sz w:val="20"/>
-        </w:rPr>
-        <w:t xml:space="preserve">    </w:t>
-      </w:r>
-      <w:r>
-        <w:rPr>
-          <w:sz w:val="20"/>
-        </w:rPr>
-        <w:t>D</w:t>
+          <w:sz w:val="15"/>
+        </w:rPr>
+        <w:t xml:space="preserve">        </w:t>
+      </w:r>
+      <w:r>
+        <w:rPr>
+          <w:sz w:val="15"/>
+        </w:rPr>
+        <w:t>Bm7</w:t>
+      </w:r>
+      <w:r>
+        <w:rPr>
+          <w:sz w:val="15"/>
+        </w:rPr>
+        <w:t xml:space="preserve">         </w:t>
+      </w:r>
+      <w:r>
+        <w:rPr>
+          <w:sz w:val="15"/>
+        </w:rPr>
+        <w:t>A/C#</w:t>
+      </w:r>
+      <w:r>
+        <w:rPr>
+          <w:sz w:val="15"/>
+        </w:rPr>
+        <w:t xml:space="preserve">  </w:t>
+      </w:r>
+      <w:r>
+        <w:rPr>
+          <w:sz w:val="15"/>
+        </w:rPr>
+        <w:t>F#4</w:t>
+      </w:r>
+      <w:r>
+        <w:rPr>
+          <w:sz w:val="15"/>
+        </w:rPr>
+        <w:t xml:space="preserve">  </w:t>
+      </w:r>
+      <w:r>
+        <w:rPr>
+          <w:sz w:val="15"/>
+        </w:rPr>
+        <w:t>F#</w:t>
       </w:r>
     </w:p>
     <w:p>
@@ -478,10 +481,43 @@
       </w:pPr>
       <w:r>
         <w:rPr>
-          <w:sz w:val="20"/>
-        </w:rPr>
-        <w:t>Não fugir ao compromisso com o irmão</w:t>
-      </w:r>
+          <w:sz w:val="15"/>
+        </w:rPr>
+        <w:t>Os corações arrependi____dos</w:t>
+      </w:r>
+    </w:p>
+    <w:p>
+      <w:pPr>
+        <w:keepLines/>
+        <w:spacing w:after="0" w:line="240" w:lineRule="auto"/>
+        <w:rPr>
+          <w:rFonts w:hint="eastAsia"/>
+        </w:rPr>
+      </w:pPr>
+    </w:p>
+    <w:p>
+      <w:pPr>
+        <w:keepLines/>
+        <w:spacing w:after="0" w:line="240" w:lineRule="auto"/>
+        <w:rPr>
+          <w:rFonts w:hint="eastAsia"/>
+        </w:rPr>
+      </w:pPr>
+      <w:r>
+        <w:rPr>
+          <w:sz w:val="15"/>
+        </w:rPr>
+        <w:t>[Refrão]</w:t>
+      </w:r>
+    </w:p>
+    <w:p>
+      <w:pPr>
+        <w:keepLines/>
+        <w:spacing w:after="0" w:line="240" w:lineRule="auto"/>
+        <w:rPr>
+          <w:rFonts w:hint="eastAsia"/>
+        </w:rPr>
+      </w:pPr>
     </w:p>
     <w:p>
       <w:pPr>
@@ -494,45 +530,51 @@
       </w:pPr>
       <w:r>
         <w:rPr>
-          <w:sz w:val="20"/>
-        </w:rPr>
-        <w:t>G</w:t>
-      </w:r>
-      <w:r>
-        <w:rPr>
-          <w:sz w:val="20"/>
-        </w:rPr>
-        <w:t xml:space="preserve">         </w:t>
-      </w:r>
-      <w:r>
-        <w:rPr>
-          <w:sz w:val="20"/>
-        </w:rPr>
-        <w:t>Em</w:t>
-      </w:r>
-      <w:r>
-        <w:rPr>
-          <w:sz w:val="20"/>
+          <w:sz w:val="15"/>
         </w:rPr>
         <w:t xml:space="preserve">       </w:t>
       </w:r>
       <w:r>
         <w:rPr>
-          <w:sz w:val="20"/>
-        </w:rPr>
-        <w:t>C</w:t>
-      </w:r>
-      <w:r>
-        <w:rPr>
-          <w:sz w:val="20"/>
-        </w:rPr>
-        <w:t xml:space="preserve">        </w:t>
-      </w:r>
-      <w:r>
-        <w:rPr>
-          <w:sz w:val="20"/>
+          <w:sz w:val="15"/>
         </w:rPr>
         <w:t>D</w:t>
+      </w:r>
+      <w:r>
+        <w:rPr>
+          <w:sz w:val="15"/>
+        </w:rPr>
+        <w:t xml:space="preserve">  </w:t>
+      </w:r>
+      <w:r>
+        <w:rPr>
+          <w:sz w:val="15"/>
+        </w:rPr>
+        <w:t>D4</w:t>
+      </w:r>
+      <w:r>
+        <w:rPr>
+          <w:sz w:val="15"/>
+        </w:rPr>
+        <w:t xml:space="preserve">  </w:t>
+      </w:r>
+      <w:r>
+        <w:rPr>
+          <w:sz w:val="15"/>
+        </w:rPr>
+        <w:t>D</w:t>
+      </w:r>
+      <w:r>
+        <w:rPr>
+          <w:sz w:val="15"/>
+        </w:rPr>
+        <w:t xml:space="preserve">  </w:t>
+      </w:r>
+      <w:r>
+        <w:rPr>
+          <w:sz w:val="15"/>
+        </w:rPr>
+        <w:t>A/C#</w:t>
       </w:r>
     </w:p>
     <w:p>
@@ -545,19 +587,10 @@
       </w:pPr>
       <w:r>
         <w:rPr>
-          <w:sz w:val="20"/>
-        </w:rPr>
-        <w:t>Entregar a Jesus o coração</w:t>
-      </w:r>
-    </w:p>
-    <w:p>
-      <w:pPr>
-        <w:keepLines/>
-        <w:spacing w:after="0" w:line="240" w:lineRule="auto"/>
-        <w:rPr>
-          <w:rFonts w:hint="eastAsia"/>
-        </w:rPr>
-      </w:pPr>
+          <w:sz w:val="15"/>
+        </w:rPr>
+        <w:t>Kyrie  elei____son</w:t>
+      </w:r>
     </w:p>
     <w:p>
       <w:pPr>
@@ -570,45 +603,39 @@
       </w:pPr>
       <w:r>
         <w:rPr>
-          <w:sz w:val="20"/>
-        </w:rPr>
-        <w:t>G</w:t>
-      </w:r>
-      <w:r>
-        <w:rPr>
-          <w:sz w:val="20"/>
-        </w:rPr>
-        <w:t xml:space="preserve">        </w:t>
-      </w:r>
-      <w:r>
-        <w:rPr>
-          <w:sz w:val="20"/>
-        </w:rPr>
-        <w:t>Em</w:t>
-      </w:r>
-      <w:r>
-        <w:rPr>
-          <w:sz w:val="20"/>
-        </w:rPr>
-        <w:t xml:space="preserve">       </w:t>
-      </w:r>
-      <w:r>
-        <w:rPr>
-          <w:sz w:val="20"/>
-        </w:rPr>
-        <w:t>C</w:t>
-      </w:r>
-      <w:r>
-        <w:rPr>
-          <w:sz w:val="20"/>
-        </w:rPr>
-        <w:t xml:space="preserve">    </w:t>
-      </w:r>
-      <w:r>
-        <w:rPr>
-          <w:sz w:val="20"/>
-        </w:rPr>
-        <w:t>D</w:t>
+          <w:sz w:val="15"/>
+        </w:rPr>
+        <w:t xml:space="preserve">  </w:t>
+      </w:r>
+      <w:r>
+        <w:rPr>
+          <w:sz w:val="15"/>
+        </w:rPr>
+        <w:t>F#7/A#</w:t>
+      </w:r>
+      <w:r>
+        <w:rPr>
+          <w:sz w:val="15"/>
+        </w:rPr>
+        <w:t xml:space="preserve">  </w:t>
+      </w:r>
+      <w:r>
+        <w:rPr>
+          <w:sz w:val="15"/>
+        </w:rPr>
+        <w:t>F#7</w:t>
+      </w:r>
+      <w:r>
+        <w:rPr>
+          <w:sz w:val="15"/>
+        </w:rPr>
+        <w:t xml:space="preserve">  </w:t>
+      </w:r>
+      <w:r>
+        <w:rPr>
+          <w:sz w:val="15"/>
+        </w:rPr>
+        <w:t>Bm7</w:t>
       </w:r>
     </w:p>
     <w:p>
@@ -621,9 +648,9 @@
       </w:pPr>
       <w:r>
         <w:rPr>
-          <w:sz w:val="20"/>
-        </w:rPr>
-        <w:t>Ágape, partilha do amor</w:t>
+          <w:sz w:val="15"/>
+        </w:rPr>
+        <w:t>Elei__________son</w:t>
       </w:r>
     </w:p>
     <w:p>
@@ -637,45 +664,39 @@
       </w:pPr>
       <w:r>
         <w:rPr>
-          <w:sz w:val="20"/>
-        </w:rPr>
-        <w:t>G</w:t>
-      </w:r>
-      <w:r>
-        <w:rPr>
-          <w:sz w:val="20"/>
-        </w:rPr>
-        <w:t xml:space="preserve">        </w:t>
-      </w:r>
-      <w:r>
-        <w:rPr>
-          <w:sz w:val="20"/>
-        </w:rPr>
-        <w:t>Em</w:t>
-      </w:r>
-      <w:r>
-        <w:rPr>
-          <w:sz w:val="20"/>
-        </w:rPr>
-        <w:t xml:space="preserve">           </w:t>
-      </w:r>
-      <w:r>
-        <w:rPr>
-          <w:sz w:val="20"/>
-        </w:rPr>
-        <w:t>C</w:t>
-      </w:r>
-      <w:r>
-        <w:rPr>
-          <w:sz w:val="20"/>
+          <w:sz w:val="15"/>
         </w:rPr>
         <w:t xml:space="preserve">  </w:t>
       </w:r>
       <w:r>
         <w:rPr>
-          <w:sz w:val="20"/>
-        </w:rPr>
-        <w:t>D</w:t>
+          <w:sz w:val="15"/>
+        </w:rPr>
+        <w:t>E4</w:t>
+      </w:r>
+      <w:r>
+        <w:rPr>
+          <w:sz w:val="15"/>
+        </w:rPr>
+        <w:t xml:space="preserve">  </w:t>
+      </w:r>
+      <w:r>
+        <w:rPr>
+          <w:sz w:val="15"/>
+        </w:rPr>
+        <w:t>E</w:t>
+      </w:r>
+      <w:r>
+        <w:rPr>
+          <w:sz w:val="15"/>
+        </w:rPr>
+        <w:t xml:space="preserve">  </w:t>
+      </w:r>
+      <w:r>
+        <w:rPr>
+          <w:sz w:val="15"/>
+        </w:rPr>
+        <w:t>A</w:t>
       </w:r>
     </w:p>
     <w:p>
@@ -688,10 +709,19 @@
       </w:pPr>
       <w:r>
         <w:rPr>
-          <w:sz w:val="20"/>
-        </w:rPr>
-        <w:t>Ágape, louvemos ao senhor</w:t>
-      </w:r>
+          <w:sz w:val="15"/>
+        </w:rPr>
+        <w:t>Elei____son</w:t>
+      </w:r>
+    </w:p>
+    <w:p>
+      <w:pPr>
+        <w:keepLines/>
+        <w:spacing w:after="0" w:line="240" w:lineRule="auto"/>
+        <w:rPr>
+          <w:rFonts w:hint="eastAsia"/>
+        </w:rPr>
+      </w:pPr>
     </w:p>
     <w:p>
       <w:pPr>
@@ -704,45 +734,51 @@
       </w:pPr>
       <w:r>
         <w:rPr>
-          <w:sz w:val="20"/>
-        </w:rPr>
-        <w:t>G</w:t>
-      </w:r>
-      <w:r>
-        <w:rPr>
-          <w:sz w:val="20"/>
-        </w:rPr>
-        <w:t xml:space="preserve">        </w:t>
-      </w:r>
-      <w:r>
-        <w:rPr>
-          <w:sz w:val="20"/>
-        </w:rPr>
-        <w:t>Em</w:t>
-      </w:r>
-      <w:r>
-        <w:rPr>
-          <w:sz w:val="20"/>
+          <w:sz w:val="15"/>
+        </w:rPr>
+        <w:t xml:space="preserve"> </w:t>
+      </w:r>
+      <w:r>
+        <w:rPr>
+          <w:sz w:val="15"/>
+        </w:rPr>
+        <w:t>D</w:t>
+      </w:r>
+      <w:r>
+        <w:rPr>
+          <w:sz w:val="15"/>
         </w:rPr>
         <w:t xml:space="preserve">       </w:t>
       </w:r>
       <w:r>
         <w:rPr>
-          <w:sz w:val="20"/>
-        </w:rPr>
-        <w:t>C</w:t>
-      </w:r>
-      <w:r>
-        <w:rPr>
-          <w:sz w:val="20"/>
-        </w:rPr>
-        <w:t xml:space="preserve">    </w:t>
-      </w:r>
-      <w:r>
-        <w:rPr>
-          <w:sz w:val="20"/>
+          <w:sz w:val="15"/>
+        </w:rPr>
+        <w:t>D4</w:t>
+      </w:r>
+      <w:r>
+        <w:rPr>
+          <w:sz w:val="15"/>
+        </w:rPr>
+        <w:t xml:space="preserve">  </w:t>
+      </w:r>
+      <w:r>
+        <w:rPr>
+          <w:sz w:val="15"/>
         </w:rPr>
         <w:t>D</w:t>
+      </w:r>
+      <w:r>
+        <w:rPr>
+          <w:sz w:val="15"/>
+        </w:rPr>
+        <w:t xml:space="preserve">  </w:t>
+      </w:r>
+      <w:r>
+        <w:rPr>
+          <w:sz w:val="15"/>
+        </w:rPr>
+        <w:t>A/C#</w:t>
       </w:r>
     </w:p>
     <w:p>
@@ -755,9 +791,9 @@
       </w:pPr>
       <w:r>
         <w:rPr>
-          <w:sz w:val="20"/>
-        </w:rPr>
-        <w:t>Ágape, partilha do amor</w:t>
+          <w:sz w:val="15"/>
+        </w:rPr>
+        <w:t>Kyrie  elei____son</w:t>
       </w:r>
     </w:p>
     <w:p>
@@ -771,45 +807,39 @@
       </w:pPr>
       <w:r>
         <w:rPr>
-          <w:sz w:val="20"/>
-        </w:rPr>
-        <w:t>G</w:t>
-      </w:r>
-      <w:r>
-        <w:rPr>
-          <w:sz w:val="20"/>
-        </w:rPr>
-        <w:t xml:space="preserve">        </w:t>
-      </w:r>
-      <w:r>
-        <w:rPr>
-          <w:sz w:val="20"/>
-        </w:rPr>
-        <w:t>Em</w:t>
-      </w:r>
-      <w:r>
-        <w:rPr>
-          <w:sz w:val="20"/>
-        </w:rPr>
-        <w:t xml:space="preserve">           </w:t>
-      </w:r>
-      <w:r>
-        <w:rPr>
-          <w:sz w:val="20"/>
-        </w:rPr>
-        <w:t>C</w:t>
-      </w:r>
-      <w:r>
-        <w:rPr>
-          <w:sz w:val="20"/>
+          <w:sz w:val="15"/>
         </w:rPr>
         <w:t xml:space="preserve">  </w:t>
       </w:r>
       <w:r>
         <w:rPr>
-          <w:sz w:val="20"/>
-        </w:rPr>
-        <w:t>D</w:t>
+          <w:sz w:val="15"/>
+        </w:rPr>
+        <w:t>F#7/A#</w:t>
+      </w:r>
+      <w:r>
+        <w:rPr>
+          <w:sz w:val="15"/>
+        </w:rPr>
+        <w:t xml:space="preserve">  </w:t>
+      </w:r>
+      <w:r>
+        <w:rPr>
+          <w:sz w:val="15"/>
+        </w:rPr>
+        <w:t>F#7</w:t>
+      </w:r>
+      <w:r>
+        <w:rPr>
+          <w:sz w:val="15"/>
+        </w:rPr>
+        <w:t xml:space="preserve">  </w:t>
+      </w:r>
+      <w:r>
+        <w:rPr>
+          <w:sz w:val="15"/>
+        </w:rPr>
+        <w:t>Bm7</w:t>
       </w:r>
     </w:p>
     <w:p>
@@ -822,19 +852,10 @@
       </w:pPr>
       <w:r>
         <w:rPr>
-          <w:sz w:val="20"/>
-        </w:rPr>
-        <w:t>Ágape, louvemos ao senhor</w:t>
-      </w:r>
-    </w:p>
-    <w:p>
-      <w:pPr>
-        <w:keepLines/>
-        <w:spacing w:after="0" w:line="240" w:lineRule="auto"/>
-        <w:rPr>
-          <w:rFonts w:hint="eastAsia"/>
-        </w:rPr>
-      </w:pPr>
+          <w:sz w:val="15"/>
+        </w:rPr>
+        <w:t>Elei__________son,</w:t>
+      </w:r>
     </w:p>
     <w:p>
       <w:pPr>
@@ -847,45 +868,39 @@
       </w:pPr>
       <w:r>
         <w:rPr>
-          <w:sz w:val="20"/>
-        </w:rPr>
-        <w:t>G</w:t>
-      </w:r>
-      <w:r>
-        <w:rPr>
-          <w:sz w:val="20"/>
-        </w:rPr>
-        <w:t xml:space="preserve">        </w:t>
-      </w:r>
-      <w:r>
-        <w:rPr>
-          <w:sz w:val="20"/>
-        </w:rPr>
-        <w:t>Em</w:t>
-      </w:r>
-      <w:r>
-        <w:rPr>
-          <w:sz w:val="20"/>
-        </w:rPr>
-        <w:t xml:space="preserve">           </w:t>
-      </w:r>
-      <w:r>
-        <w:rPr>
-          <w:sz w:val="20"/>
-        </w:rPr>
-        <w:t>C</w:t>
-      </w:r>
-      <w:r>
-        <w:rPr>
-          <w:sz w:val="20"/>
-        </w:rPr>
-        <w:t xml:space="preserve">             </w:t>
-      </w:r>
-      <w:r>
-        <w:rPr>
-          <w:sz w:val="20"/>
-        </w:rPr>
-        <w:t>D</w:t>
+          <w:sz w:val="15"/>
+        </w:rPr>
+        <w:t xml:space="preserve">  </w:t>
+      </w:r>
+      <w:r>
+        <w:rPr>
+          <w:sz w:val="15"/>
+        </w:rPr>
+        <w:t>E4</w:t>
+      </w:r>
+      <w:r>
+        <w:rPr>
+          <w:sz w:val="15"/>
+        </w:rPr>
+        <w:t xml:space="preserve">  </w:t>
+      </w:r>
+      <w:r>
+        <w:rPr>
+          <w:sz w:val="15"/>
+        </w:rPr>
+        <w:t>E</w:t>
+      </w:r>
+      <w:r>
+        <w:rPr>
+          <w:sz w:val="15"/>
+        </w:rPr>
+        <w:t xml:space="preserve">  </w:t>
+      </w:r>
+      <w:r>
+        <w:rPr>
+          <w:sz w:val="15"/>
+        </w:rPr>
+        <w:t>A</w:t>
       </w:r>
     </w:p>
     <w:p>
@@ -898,10 +913,67 @@
       </w:pPr>
       <w:r>
         <w:rPr>
-          <w:sz w:val="20"/>
-        </w:rPr>
-        <w:t>Derrubar o muro que separa-me do irmão</w:t>
-      </w:r>
+          <w:sz w:val="15"/>
+        </w:rPr>
+        <w:t>Elei____son</w:t>
+      </w:r>
+    </w:p>
+    <w:p>
+      <w:pPr>
+        <w:keepLines/>
+        <w:spacing w:after="0" w:line="240" w:lineRule="auto"/>
+        <w:rPr>
+          <w:rFonts w:hint="eastAsia"/>
+        </w:rPr>
+      </w:pPr>
+    </w:p>
+    <w:p>
+      <w:pPr>
+        <w:keepLines/>
+        <w:spacing w:after="0" w:line="240" w:lineRule="auto"/>
+        <w:rPr>
+          <w:rFonts w:hint="eastAsia"/>
+        </w:rPr>
+      </w:pPr>
+      <w:r>
+        <w:rPr>
+          <w:sz w:val="15"/>
+        </w:rPr>
+        <w:t>( Bm7  F#m7  G7M )</w:t>
+      </w:r>
+    </w:p>
+    <w:p>
+      <w:pPr>
+        <w:keepLines/>
+        <w:spacing w:after="0" w:line="240" w:lineRule="auto"/>
+        <w:rPr>
+          <w:rFonts w:hint="eastAsia"/>
+        </w:rPr>
+      </w:pPr>
+    </w:p>
+    <w:p>
+      <w:pPr>
+        <w:keepLines/>
+        <w:spacing w:after="0" w:line="240" w:lineRule="auto"/>
+        <w:rPr>
+          <w:rFonts w:hint="eastAsia"/>
+        </w:rPr>
+      </w:pPr>
+      <w:r>
+        <w:rPr>
+          <w:sz w:val="15"/>
+        </w:rPr>
+        <w:t>[Segunda Parte]</w:t>
+      </w:r>
+    </w:p>
+    <w:p>
+      <w:pPr>
+        <w:keepLines/>
+        <w:spacing w:after="0" w:line="240" w:lineRule="auto"/>
+        <w:rPr>
+          <w:rFonts w:hint="eastAsia"/>
+        </w:rPr>
+      </w:pPr>
     </w:p>
     <w:p>
       <w:pPr>
@@ -914,45 +986,33 @@
       </w:pPr>
       <w:r>
         <w:rPr>
-          <w:sz w:val="20"/>
-        </w:rPr>
-        <w:t>G</w:t>
-      </w:r>
-      <w:r>
-        <w:rPr>
-          <w:sz w:val="20"/>
-        </w:rPr>
-        <w:t xml:space="preserve">            </w:t>
-      </w:r>
-      <w:r>
-        <w:rPr>
-          <w:sz w:val="20"/>
-        </w:rPr>
-        <w:t>Em</w:t>
-      </w:r>
-      <w:r>
-        <w:rPr>
-          <w:sz w:val="20"/>
-        </w:rPr>
-        <w:t xml:space="preserve">       </w:t>
-      </w:r>
-      <w:r>
-        <w:rPr>
-          <w:sz w:val="20"/>
-        </w:rPr>
-        <w:t>C</w:t>
-      </w:r>
-      <w:r>
-        <w:rPr>
-          <w:sz w:val="20"/>
-        </w:rPr>
-        <w:t xml:space="preserve">            </w:t>
-      </w:r>
-      <w:r>
-        <w:rPr>
-          <w:sz w:val="20"/>
-        </w:rPr>
-        <w:t>D</w:t>
+          <w:sz w:val="15"/>
+        </w:rPr>
+        <w:t xml:space="preserve">     </w:t>
+      </w:r>
+      <w:r>
+        <w:rPr>
+          <w:sz w:val="15"/>
+        </w:rPr>
+        <w:t>Bm7</w:t>
+      </w:r>
+      <w:r>
+        <w:rPr>
+          <w:sz w:val="15"/>
+        </w:rPr>
+        <w:t xml:space="preserve">         </w:t>
+      </w:r>
+      <w:r>
+        <w:rPr>
+          <w:sz w:val="15"/>
+        </w:rPr>
+        <w:t>A9</w:t>
+      </w:r>
+      <w:r>
+        <w:rPr>
+          <w:sz w:val="15"/>
+        </w:rPr>
+        <w:t xml:space="preserve">        G7M</w:t>
       </w:r>
     </w:p>
     <w:p>
@@ -965,9 +1025,9 @@
       </w:pPr>
       <w:r>
         <w:rPr>
-          <w:sz w:val="20"/>
-        </w:rPr>
-        <w:t>Permitir que ele possa amar de coração</w:t>
+          <w:sz w:val="15"/>
+        </w:rPr>
+        <w:t>Ó, Cristo, que viestes chamar</w:t>
       </w:r>
     </w:p>
     <w:p>
@@ -981,45 +1041,51 @@
       </w:pPr>
       <w:r>
         <w:rPr>
-          <w:sz w:val="20"/>
-        </w:rPr>
-        <w:t>G</w:t>
-      </w:r>
-      <w:r>
-        <w:rPr>
-          <w:sz w:val="20"/>
-        </w:rPr>
-        <w:t xml:space="preserve">           </w:t>
-      </w:r>
-      <w:r>
-        <w:rPr>
-          <w:sz w:val="20"/>
-        </w:rPr>
-        <w:t>Em</w:t>
-      </w:r>
-      <w:r>
-        <w:rPr>
-          <w:sz w:val="20"/>
+          <w:sz w:val="15"/>
         </w:rPr>
         <w:t xml:space="preserve">        </w:t>
       </w:r>
       <w:r>
         <w:rPr>
-          <w:sz w:val="20"/>
-        </w:rPr>
-        <w:t>C</w:t>
-      </w:r>
-      <w:r>
-        <w:rPr>
-          <w:sz w:val="20"/>
-        </w:rPr>
-        <w:t xml:space="preserve">          </w:t>
-      </w:r>
-      <w:r>
-        <w:rPr>
-          <w:sz w:val="20"/>
-        </w:rPr>
-        <w:t>D</w:t>
+          <w:sz w:val="15"/>
+        </w:rPr>
+        <w:t>Bm7</w:t>
+      </w:r>
+      <w:r>
+        <w:rPr>
+          <w:sz w:val="15"/>
+        </w:rPr>
+        <w:t xml:space="preserve">        </w:t>
+      </w:r>
+      <w:r>
+        <w:rPr>
+          <w:sz w:val="15"/>
+        </w:rPr>
+        <w:t>A/C#</w:t>
+      </w:r>
+      <w:r>
+        <w:rPr>
+          <w:sz w:val="15"/>
+        </w:rPr>
+        <w:t xml:space="preserve">  </w:t>
+      </w:r>
+      <w:r>
+        <w:rPr>
+          <w:sz w:val="15"/>
+        </w:rPr>
+        <w:t>F#4</w:t>
+      </w:r>
+      <w:r>
+        <w:rPr>
+          <w:sz w:val="15"/>
+        </w:rPr>
+        <w:t xml:space="preserve">  </w:t>
+      </w:r>
+      <w:r>
+        <w:rPr>
+          <w:sz w:val="15"/>
+        </w:rPr>
+        <w:t>F#</w:t>
       </w:r>
     </w:p>
     <w:p>
@@ -1032,10 +1098,43 @@
       </w:pPr>
       <w:r>
         <w:rPr>
-          <w:sz w:val="20"/>
-        </w:rPr>
-        <w:t>É chegada a hora de vivermos o amor</w:t>
-      </w:r>
+          <w:sz w:val="15"/>
+        </w:rPr>
+        <w:t>Os pecadores humilhados</w:t>
+      </w:r>
+    </w:p>
+    <w:p>
+      <w:pPr>
+        <w:keepLines/>
+        <w:spacing w:after="0" w:line="240" w:lineRule="auto"/>
+        <w:rPr>
+          <w:rFonts w:hint="eastAsia"/>
+        </w:rPr>
+      </w:pPr>
+    </w:p>
+    <w:p>
+      <w:pPr>
+        <w:keepLines/>
+        <w:spacing w:after="0" w:line="240" w:lineRule="auto"/>
+        <w:rPr>
+          <w:rFonts w:hint="eastAsia"/>
+        </w:rPr>
+      </w:pPr>
+      <w:r>
+        <w:rPr>
+          <w:sz w:val="15"/>
+        </w:rPr>
+        <w:t>[Refrão 2]</w:t>
+      </w:r>
+    </w:p>
+    <w:p>
+      <w:pPr>
+        <w:keepLines/>
+        <w:spacing w:after="0" w:line="240" w:lineRule="auto"/>
+        <w:rPr>
+          <w:rFonts w:hint="eastAsia"/>
+        </w:rPr>
+      </w:pPr>
     </w:p>
     <w:p>
       <w:pPr>
@@ -1048,45 +1147,51 @@
       </w:pPr>
       <w:r>
         <w:rPr>
-          <w:sz w:val="20"/>
-        </w:rPr>
-        <w:t>G</w:t>
-      </w:r>
-      <w:r>
-        <w:rPr>
-          <w:sz w:val="20"/>
-        </w:rPr>
-        <w:t xml:space="preserve">        </w:t>
-      </w:r>
-      <w:r>
-        <w:rPr>
-          <w:sz w:val="20"/>
-        </w:rPr>
-        <w:t>Em</w:t>
-      </w:r>
-      <w:r>
-        <w:rPr>
-          <w:sz w:val="20"/>
-        </w:rPr>
-        <w:t xml:space="preserve">         </w:t>
-      </w:r>
-      <w:r>
-        <w:rPr>
-          <w:sz w:val="20"/>
-        </w:rPr>
-        <w:t>C</w:t>
-      </w:r>
-      <w:r>
-        <w:rPr>
-          <w:sz w:val="20"/>
-        </w:rPr>
-        <w:t xml:space="preserve">       </w:t>
-      </w:r>
-      <w:r>
-        <w:rPr>
-          <w:sz w:val="20"/>
+          <w:sz w:val="15"/>
+        </w:rPr>
+        <w:t xml:space="preserve">      </w:t>
+      </w:r>
+      <w:r>
+        <w:rPr>
+          <w:sz w:val="15"/>
         </w:rPr>
         <w:t>D</w:t>
+      </w:r>
+      <w:r>
+        <w:rPr>
+          <w:sz w:val="15"/>
+        </w:rPr>
+        <w:t xml:space="preserve">    </w:t>
+      </w:r>
+      <w:r>
+        <w:rPr>
+          <w:sz w:val="15"/>
+        </w:rPr>
+        <w:t>D4</w:t>
+      </w:r>
+      <w:r>
+        <w:rPr>
+          <w:sz w:val="15"/>
+        </w:rPr>
+        <w:t xml:space="preserve">  </w:t>
+      </w:r>
+      <w:r>
+        <w:rPr>
+          <w:sz w:val="15"/>
+        </w:rPr>
+        <w:t>D</w:t>
+      </w:r>
+      <w:r>
+        <w:rPr>
+          <w:sz w:val="15"/>
+        </w:rPr>
+        <w:t xml:space="preserve">  </w:t>
+      </w:r>
+      <w:r>
+        <w:rPr>
+          <w:sz w:val="15"/>
+        </w:rPr>
+        <w:t>A/C#</w:t>
       </w:r>
     </w:p>
     <w:p>
@@ -1099,19 +1204,10 @@
       </w:pPr>
       <w:r>
         <w:rPr>
-          <w:sz w:val="20"/>
-        </w:rPr>
-        <w:t>Entregar agora a vida ao senhor</w:t>
-      </w:r>
-    </w:p>
-    <w:p>
-      <w:pPr>
-        <w:keepLines/>
-        <w:spacing w:after="0" w:line="240" w:lineRule="auto"/>
-        <w:rPr>
-          <w:rFonts w:hint="eastAsia"/>
-        </w:rPr>
-      </w:pPr>
+          <w:sz w:val="15"/>
+        </w:rPr>
+        <w:t>Christe  ele____ison</w:t>
+      </w:r>
     </w:p>
     <w:p>
       <w:pPr>
@@ -1124,45 +1220,39 @@
       </w:pPr>
       <w:r>
         <w:rPr>
-          <w:sz w:val="20"/>
-        </w:rPr>
-        <w:t>G</w:t>
-      </w:r>
-      <w:r>
-        <w:rPr>
-          <w:sz w:val="20"/>
-        </w:rPr>
-        <w:t xml:space="preserve">        </w:t>
-      </w:r>
-      <w:r>
-        <w:rPr>
-          <w:sz w:val="20"/>
-        </w:rPr>
-        <w:t>Em</w:t>
-      </w:r>
-      <w:r>
-        <w:rPr>
-          <w:sz w:val="20"/>
-        </w:rPr>
-        <w:t xml:space="preserve">       </w:t>
-      </w:r>
-      <w:r>
-        <w:rPr>
-          <w:sz w:val="20"/>
-        </w:rPr>
-        <w:t>C</w:t>
-      </w:r>
-      <w:r>
-        <w:rPr>
-          <w:sz w:val="20"/>
-        </w:rPr>
-        <w:t xml:space="preserve">    </w:t>
-      </w:r>
-      <w:r>
-        <w:rPr>
-          <w:sz w:val="20"/>
-        </w:rPr>
-        <w:t>D</w:t>
+          <w:sz w:val="15"/>
+        </w:rPr>
+        <w:t xml:space="preserve">  </w:t>
+      </w:r>
+      <w:r>
+        <w:rPr>
+          <w:sz w:val="15"/>
+        </w:rPr>
+        <w:t>F#7/A#</w:t>
+      </w:r>
+      <w:r>
+        <w:rPr>
+          <w:sz w:val="15"/>
+        </w:rPr>
+        <w:t xml:space="preserve">  </w:t>
+      </w:r>
+      <w:r>
+        <w:rPr>
+          <w:sz w:val="15"/>
+        </w:rPr>
+        <w:t>F#7</w:t>
+      </w:r>
+      <w:r>
+        <w:rPr>
+          <w:sz w:val="15"/>
+        </w:rPr>
+        <w:t xml:space="preserve">  </w:t>
+      </w:r>
+      <w:r>
+        <w:rPr>
+          <w:sz w:val="15"/>
+        </w:rPr>
+        <w:t>Bm7</w:t>
       </w:r>
     </w:p>
     <w:p>
@@ -1175,9 +1265,9 @@
       </w:pPr>
       <w:r>
         <w:rPr>
-          <w:sz w:val="20"/>
-        </w:rPr>
-        <w:t>Ágape, partilha do amor</w:t>
+          <w:sz w:val="15"/>
+        </w:rPr>
+        <w:t>Elei__________son</w:t>
       </w:r>
     </w:p>
     <w:p>
@@ -1191,45 +1281,75 @@
       </w:pPr>
       <w:r>
         <w:rPr>
-          <w:sz w:val="20"/>
-        </w:rPr>
-        <w:t>G</w:t>
-      </w:r>
-      <w:r>
-        <w:rPr>
-          <w:sz w:val="20"/>
-        </w:rPr>
-        <w:t xml:space="preserve">        </w:t>
-      </w:r>
-      <w:r>
-        <w:rPr>
-          <w:sz w:val="20"/>
-        </w:rPr>
-        <w:t>Em</w:t>
-      </w:r>
-      <w:r>
-        <w:rPr>
-          <w:sz w:val="20"/>
-        </w:rPr>
-        <w:t xml:space="preserve">           </w:t>
-      </w:r>
-      <w:r>
-        <w:rPr>
-          <w:sz w:val="20"/>
-        </w:rPr>
-        <w:t>C</w:t>
-      </w:r>
-      <w:r>
-        <w:rPr>
-          <w:sz w:val="20"/>
+          <w:sz w:val="15"/>
         </w:rPr>
         <w:t xml:space="preserve">  </w:t>
       </w:r>
       <w:r>
         <w:rPr>
-          <w:sz w:val="20"/>
-        </w:rPr>
-        <w:t>D</w:t>
+          <w:sz w:val="15"/>
+        </w:rPr>
+        <w:t>E4</w:t>
+      </w:r>
+      <w:r>
+        <w:rPr>
+          <w:sz w:val="15"/>
+        </w:rPr>
+        <w:t xml:space="preserve">  </w:t>
+      </w:r>
+      <w:r>
+        <w:rPr>
+          <w:sz w:val="15"/>
+        </w:rPr>
+        <w:t>E</w:t>
+      </w:r>
+      <w:r>
+        <w:rPr>
+          <w:sz w:val="15"/>
+        </w:rPr>
+        <w:t xml:space="preserve">  </w:t>
+      </w:r>
+      <w:r>
+        <w:rPr>
+          <w:sz w:val="15"/>
+        </w:rPr>
+        <w:t>A</w:t>
+      </w:r>
+      <w:r>
+        <w:rPr>
+          <w:sz w:val="15"/>
+        </w:rPr>
+        <w:t xml:space="preserve">  </w:t>
+      </w:r>
+      <w:r>
+        <w:rPr>
+          <w:sz w:val="15"/>
+        </w:rPr>
+        <w:t>G/A</w:t>
+      </w:r>
+      <w:r>
+        <w:rPr>
+          <w:sz w:val="15"/>
+        </w:rPr>
+        <w:t xml:space="preserve">  </w:t>
+      </w:r>
+      <w:r>
+        <w:rPr>
+          <w:sz w:val="15"/>
+        </w:rPr>
+        <w:t>A</w:t>
+      </w:r>
+      <w:r>
+        <w:rPr>
+          <w:sz w:val="15"/>
+        </w:rPr>
+        <w:t xml:space="preserve">  </w:t>
+      </w:r>
+      <w:r>
+        <w:rPr>
+          <w:sz w:val="15"/>
+        </w:rPr>
+        <w:t>G/A</w:t>
       </w:r>
     </w:p>
     <w:p>
@@ -1242,10 +1362,19 @@
       </w:pPr>
       <w:r>
         <w:rPr>
-          <w:sz w:val="20"/>
-        </w:rPr>
-        <w:t>Ágape, louvemos ao senhor</w:t>
-      </w:r>
+          <w:sz w:val="15"/>
+        </w:rPr>
+        <w:t>Ele____ison</w:t>
+      </w:r>
+    </w:p>
+    <w:p>
+      <w:pPr>
+        <w:keepLines/>
+        <w:spacing w:after="0" w:line="240" w:lineRule="auto"/>
+        <w:rPr>
+          <w:rFonts w:hint="eastAsia"/>
+        </w:rPr>
+      </w:pPr>
     </w:p>
     <w:p>
       <w:pPr>
@@ -1258,45 +1387,63 @@
       </w:pPr>
       <w:r>
         <w:rPr>
-          <w:sz w:val="20"/>
-        </w:rPr>
-        <w:t>G</w:t>
-      </w:r>
-      <w:r>
-        <w:rPr>
-          <w:sz w:val="20"/>
-        </w:rPr>
-        <w:t xml:space="preserve">        </w:t>
-      </w:r>
-      <w:r>
-        <w:rPr>
-          <w:sz w:val="20"/>
-        </w:rPr>
-        <w:t>Em</w:t>
-      </w:r>
-      <w:r>
-        <w:rPr>
-          <w:sz w:val="20"/>
-        </w:rPr>
-        <w:t xml:space="preserve">       </w:t>
-      </w:r>
-      <w:r>
-        <w:rPr>
-          <w:sz w:val="20"/>
-        </w:rPr>
-        <w:t>C</w:t>
-      </w:r>
-      <w:r>
-        <w:rPr>
-          <w:sz w:val="20"/>
-        </w:rPr>
-        <w:t xml:space="preserve">    </w:t>
-      </w:r>
-      <w:r>
-        <w:rPr>
-          <w:sz w:val="20"/>
+          <w:sz w:val="15"/>
+        </w:rPr>
+        <w:t xml:space="preserve"> </w:t>
+      </w:r>
+      <w:r>
+        <w:rPr>
+          <w:sz w:val="15"/>
         </w:rPr>
         <w:t>D</w:t>
+      </w:r>
+      <w:r>
+        <w:rPr>
+          <w:sz w:val="15"/>
+        </w:rPr>
+        <w:t xml:space="preserve">         </w:t>
+      </w:r>
+      <w:r>
+        <w:rPr>
+          <w:sz w:val="15"/>
+        </w:rPr>
+        <w:t>D4</w:t>
+      </w:r>
+      <w:r>
+        <w:rPr>
+          <w:sz w:val="15"/>
+        </w:rPr>
+        <w:t xml:space="preserve">  </w:t>
+      </w:r>
+      <w:r>
+        <w:rPr>
+          <w:sz w:val="15"/>
+        </w:rPr>
+        <w:t>D</w:t>
+      </w:r>
+      <w:r>
+        <w:rPr>
+          <w:sz w:val="15"/>
+        </w:rPr>
+        <w:t xml:space="preserve">  </w:t>
+      </w:r>
+      <w:r>
+        <w:rPr>
+          <w:sz w:val="15"/>
+        </w:rPr>
+        <w:t>A/C#</w:t>
+      </w:r>
+      <w:r>
+        <w:rPr>
+          <w:sz w:val="15"/>
+        </w:rPr>
+        <w:t xml:space="preserve">  </w:t>
+      </w:r>
+      <w:r>
+        <w:rPr>
+          <w:sz w:val="15"/>
+        </w:rPr>
+        <w:t>A/B</w:t>
       </w:r>
     </w:p>
     <w:p>
@@ -1309,9 +1456,9 @@
       </w:pPr>
       <w:r>
         <w:rPr>
-          <w:sz w:val="20"/>
-        </w:rPr>
-        <w:t>Ágape, partilha do amor</w:t>
+          <w:sz w:val="15"/>
+        </w:rPr>
+        <w:t>Christe  elei____son</w:t>
       </w:r>
     </w:p>
     <w:p>
@@ -1325,45 +1472,51 @@
       </w:pPr>
       <w:r>
         <w:rPr>
-          <w:sz w:val="20"/>
-        </w:rPr>
-        <w:t>G</w:t>
-      </w:r>
-      <w:r>
-        <w:rPr>
-          <w:sz w:val="20"/>
-        </w:rPr>
-        <w:t xml:space="preserve">        </w:t>
-      </w:r>
-      <w:r>
-        <w:rPr>
-          <w:sz w:val="20"/>
-        </w:rPr>
-        <w:t>Em</w:t>
-      </w:r>
-      <w:r>
-        <w:rPr>
-          <w:sz w:val="20"/>
-        </w:rPr>
-        <w:t xml:space="preserve">           </w:t>
-      </w:r>
-      <w:r>
-        <w:rPr>
-          <w:sz w:val="20"/>
-        </w:rPr>
-        <w:t>C</w:t>
-      </w:r>
-      <w:r>
-        <w:rPr>
-          <w:sz w:val="20"/>
+          <w:sz w:val="15"/>
         </w:rPr>
         <w:t xml:space="preserve">  </w:t>
       </w:r>
       <w:r>
         <w:rPr>
-          <w:sz w:val="20"/>
-        </w:rPr>
-        <w:t>D</w:t>
+          <w:sz w:val="15"/>
+        </w:rPr>
+        <w:t>F#7/A#</w:t>
+      </w:r>
+      <w:r>
+        <w:rPr>
+          <w:sz w:val="15"/>
+        </w:rPr>
+        <w:t xml:space="preserve">  </w:t>
+      </w:r>
+      <w:r>
+        <w:rPr>
+          <w:sz w:val="15"/>
+        </w:rPr>
+        <w:t>F#/C#</w:t>
+      </w:r>
+      <w:r>
+        <w:rPr>
+          <w:sz w:val="15"/>
+        </w:rPr>
+        <w:t xml:space="preserve">  </w:t>
+      </w:r>
+      <w:r>
+        <w:rPr>
+          <w:sz w:val="15"/>
+        </w:rPr>
+        <w:t>Bm7</w:t>
+      </w:r>
+      <w:r>
+        <w:rPr>
+          <w:sz w:val="15"/>
+        </w:rPr>
+        <w:t xml:space="preserve">  </w:t>
+      </w:r>
+      <w:r>
+        <w:rPr>
+          <w:sz w:val="15"/>
+        </w:rPr>
+        <w:t>Bm7/A</w:t>
       </w:r>
     </w:p>
     <w:p>
@@ -1376,9 +1529,9 @@
       </w:pPr>
       <w:r>
         <w:rPr>
-          <w:sz w:val="20"/>
-        </w:rPr>
-        <w:t>Ágape, louvemos ao senhor</w:t>
+          <w:sz w:val="15"/>
+        </w:rPr>
+        <w:t>Ele____________ison</w:t>
       </w:r>
     </w:p>
     <w:p>
@@ -1392,9 +1545,39 @@
       </w:pPr>
       <w:r>
         <w:rPr>
-          <w:sz w:val="20"/>
-        </w:rPr>
-        <w:t>G</w:t>
+          <w:sz w:val="15"/>
+        </w:rPr>
+        <w:t xml:space="preserve">  </w:t>
+      </w:r>
+      <w:r>
+        <w:rPr>
+          <w:sz w:val="15"/>
+        </w:rPr>
+        <w:t>E/G#</w:t>
+      </w:r>
+      <w:r>
+        <w:rPr>
+          <w:sz w:val="15"/>
+        </w:rPr>
+        <w:t xml:space="preserve">  </w:t>
+      </w:r>
+      <w:r>
+        <w:rPr>
+          <w:sz w:val="15"/>
+        </w:rPr>
+        <w:t>E</w:t>
+      </w:r>
+      <w:r>
+        <w:rPr>
+          <w:sz w:val="15"/>
+        </w:rPr>
+        <w:t xml:space="preserve">  </w:t>
+      </w:r>
+      <w:r>
+        <w:rPr>
+          <w:sz w:val="15"/>
+        </w:rPr>
+        <w:t>A</w:t>
       </w:r>
     </w:p>
     <w:p>
@@ -1407,9 +1590,872 @@
       </w:pPr>
       <w:r>
         <w:rPr>
-          <w:sz w:val="20"/>
-        </w:rPr>
-        <w:t>Ágapeee!</w:t>
+          <w:sz w:val="15"/>
+        </w:rPr>
+        <w:t>Ele______ison</w:t>
+      </w:r>
+    </w:p>
+    <w:p>
+      <w:pPr>
+        <w:keepLines/>
+        <w:spacing w:after="0" w:line="240" w:lineRule="auto"/>
+        <w:rPr>
+          <w:rFonts w:hint="eastAsia"/>
+        </w:rPr>
+      </w:pPr>
+    </w:p>
+    <w:p>
+      <w:pPr>
+        <w:keepNext/>
+        <w:keepLines/>
+        <w:spacing w:after="0" w:line="240" w:lineRule="auto"/>
+        <w:rPr>
+          <w:rFonts w:hint="eastAsia"/>
+        </w:rPr>
+      </w:pPr>
+      <w:r>
+        <w:rPr>
+          <w:sz w:val="15"/>
+        </w:rPr>
+        <w:t xml:space="preserve">( </w:t>
+      </w:r>
+      <w:r>
+        <w:rPr>
+          <w:sz w:val="15"/>
+        </w:rPr>
+        <w:t>G#m7</w:t>
+      </w:r>
+      <w:r>
+        <w:rPr>
+          <w:sz w:val="15"/>
+        </w:rPr>
+        <w:t xml:space="preserve">(5-)  </w:t>
+      </w:r>
+      <w:r>
+        <w:rPr>
+          <w:sz w:val="15"/>
+        </w:rPr>
+        <w:t>C#7</w:t>
+      </w:r>
+      <w:r>
+        <w:rPr>
+          <w:sz w:val="15"/>
+        </w:rPr>
+        <w:t xml:space="preserve">  </w:t>
+      </w:r>
+      <w:r>
+        <w:rPr>
+          <w:sz w:val="15"/>
+        </w:rPr>
+        <w:t>F#m7</w:t>
+      </w:r>
+      <w:r>
+        <w:rPr>
+          <w:sz w:val="15"/>
+        </w:rPr>
+        <w:t xml:space="preserve">  </w:t>
+      </w:r>
+      <w:r>
+        <w:rPr>
+          <w:sz w:val="15"/>
+        </w:rPr>
+        <w:t>A/B</w:t>
+      </w:r>
+      <w:r>
+        <w:rPr>
+          <w:sz w:val="15"/>
+        </w:rPr>
+        <w:t xml:space="preserve"> )</w:t>
+      </w:r>
+    </w:p>
+    <w:p>
+      <w:pPr>
+        <w:keepLines/>
+        <w:spacing w:after="0" w:line="240" w:lineRule="auto"/>
+        <w:rPr>
+          <w:rFonts w:hint="eastAsia"/>
+        </w:rPr>
+      </w:pPr>
+      <w:r>
+        <w:rPr>
+          <w:sz w:val="15"/>
+        </w:rPr>
+        <w:t>( D7M(6/9)  E7(4) )</w:t>
+      </w:r>
+    </w:p>
+    <w:p>
+      <w:pPr>
+        <w:keepLines/>
+        <w:spacing w:after="0" w:line="240" w:lineRule="auto"/>
+        <w:rPr>
+          <w:rFonts w:hint="eastAsia"/>
+        </w:rPr>
+      </w:pPr>
+    </w:p>
+    <w:p>
+      <w:pPr>
+        <w:keepLines/>
+        <w:spacing w:after="0" w:line="240" w:lineRule="auto"/>
+        <w:rPr>
+          <w:rFonts w:hint="eastAsia"/>
+        </w:rPr>
+      </w:pPr>
+      <w:r>
+        <w:rPr>
+          <w:sz w:val="15"/>
+        </w:rPr>
+        <w:t>[Terceira Parte]</w:t>
+      </w:r>
+    </w:p>
+    <w:p>
+      <w:pPr>
+        <w:keepLines/>
+        <w:spacing w:after="0" w:line="240" w:lineRule="auto"/>
+        <w:rPr>
+          <w:rFonts w:hint="eastAsia"/>
+        </w:rPr>
+      </w:pPr>
+    </w:p>
+    <w:p>
+      <w:pPr>
+        <w:keepNext/>
+        <w:keepLines/>
+        <w:spacing w:after="0" w:line="240" w:lineRule="auto"/>
+        <w:rPr>
+          <w:rFonts w:hint="eastAsia"/>
+        </w:rPr>
+      </w:pPr>
+      <w:r>
+        <w:rPr>
+          <w:sz w:val="15"/>
+        </w:rPr>
+        <w:t xml:space="preserve">    </w:t>
+      </w:r>
+      <w:r>
+        <w:rPr>
+          <w:sz w:val="15"/>
+        </w:rPr>
+        <w:t>F#m7</w:t>
+      </w:r>
+      <w:r>
+        <w:rPr>
+          <w:sz w:val="15"/>
+        </w:rPr>
+        <w:t xml:space="preserve">            </w:t>
+      </w:r>
+      <w:r>
+        <w:rPr>
+          <w:sz w:val="15"/>
+        </w:rPr>
+        <w:t>E6</w:t>
+      </w:r>
+      <w:r>
+        <w:rPr>
+          <w:sz w:val="15"/>
+        </w:rPr>
+        <w:t xml:space="preserve">   D7M</w:t>
+      </w:r>
+    </w:p>
+    <w:p>
+      <w:pPr>
+        <w:keepLines/>
+        <w:spacing w:after="0" w:line="240" w:lineRule="auto"/>
+        <w:rPr>
+          <w:rFonts w:hint="eastAsia"/>
+        </w:rPr>
+      </w:pPr>
+      <w:r>
+        <w:rPr>
+          <w:sz w:val="15"/>
+        </w:rPr>
+        <w:t>Senhor, que intercedeis por nós</w:t>
+      </w:r>
+    </w:p>
+    <w:p>
+      <w:pPr>
+        <w:keepNext/>
+        <w:keepLines/>
+        <w:spacing w:after="0" w:line="240" w:lineRule="auto"/>
+        <w:rPr>
+          <w:rFonts w:hint="eastAsia"/>
+        </w:rPr>
+      </w:pPr>
+      <w:r>
+        <w:rPr>
+          <w:sz w:val="15"/>
+        </w:rPr>
+        <w:t xml:space="preserve">              </w:t>
+      </w:r>
+      <w:r>
+        <w:rPr>
+          <w:sz w:val="15"/>
+        </w:rPr>
+        <w:t>F#m7</w:t>
+      </w:r>
+      <w:r>
+        <w:rPr>
+          <w:sz w:val="15"/>
+        </w:rPr>
+        <w:t xml:space="preserve">           </w:t>
+      </w:r>
+      <w:r>
+        <w:rPr>
+          <w:sz w:val="15"/>
+        </w:rPr>
+        <w:t>E/G#</w:t>
+      </w:r>
+      <w:r>
+        <w:rPr>
+          <w:sz w:val="15"/>
+        </w:rPr>
+        <w:t xml:space="preserve">  </w:t>
+      </w:r>
+      <w:r>
+        <w:rPr>
+          <w:sz w:val="15"/>
+        </w:rPr>
+        <w:t>C#4</w:t>
+      </w:r>
+    </w:p>
+    <w:p>
+      <w:pPr>
+        <w:keepLines/>
+        <w:spacing w:after="0" w:line="240" w:lineRule="auto"/>
+        <w:rPr>
+          <w:rFonts w:hint="eastAsia"/>
+        </w:rPr>
+      </w:pPr>
+      <w:r>
+        <w:rPr>
+          <w:sz w:val="15"/>
+        </w:rPr>
+        <w:t>Junto a Deus Pai que nos perdo_____a</w:t>
+      </w:r>
+    </w:p>
+    <w:p>
+      <w:pPr>
+        <w:keepLines/>
+        <w:spacing w:after="0" w:line="240" w:lineRule="auto"/>
+        <w:rPr>
+          <w:rFonts w:hint="eastAsia"/>
+        </w:rPr>
+      </w:pPr>
+    </w:p>
+    <w:p>
+      <w:pPr>
+        <w:keepNext/>
+        <w:keepLines/>
+        <w:spacing w:after="0" w:line="240" w:lineRule="auto"/>
+        <w:rPr>
+          <w:rFonts w:hint="eastAsia"/>
+        </w:rPr>
+      </w:pPr>
+      <w:r>
+        <w:rPr>
+          <w:sz w:val="15"/>
+        </w:rPr>
+        <w:t xml:space="preserve">( </w:t>
+      </w:r>
+      <w:r>
+        <w:rPr>
+          <w:sz w:val="15"/>
+        </w:rPr>
+        <w:t>E/F#</w:t>
+      </w:r>
+      <w:r>
+        <w:rPr>
+          <w:sz w:val="15"/>
+        </w:rPr>
+        <w:t xml:space="preserve">  </w:t>
+      </w:r>
+      <w:r>
+        <w:rPr>
+          <w:sz w:val="15"/>
+        </w:rPr>
+        <w:t>F#</w:t>
+      </w:r>
+      <w:r>
+        <w:rPr>
+          <w:sz w:val="15"/>
+        </w:rPr>
+        <w:t xml:space="preserve">  </w:t>
+      </w:r>
+      <w:r>
+        <w:rPr>
+          <w:sz w:val="15"/>
+        </w:rPr>
+        <w:t>E/F#</w:t>
+      </w:r>
+      <w:r>
+        <w:rPr>
+          <w:sz w:val="15"/>
+        </w:rPr>
+        <w:t xml:space="preserve"> )</w:t>
+      </w:r>
+    </w:p>
+    <w:p>
+      <w:pPr>
+        <w:keepLines/>
+        <w:spacing w:after="0" w:line="240" w:lineRule="auto"/>
+        <w:rPr>
+          <w:rFonts w:hint="eastAsia"/>
+        </w:rPr>
+      </w:pPr>
+    </w:p>
+    <w:p>
+      <w:pPr>
+        <w:keepLines/>
+        <w:spacing w:after="0" w:line="240" w:lineRule="auto"/>
+        <w:rPr>
+          <w:rFonts w:hint="eastAsia"/>
+        </w:rPr>
+      </w:pPr>
+      <w:r>
+        <w:rPr>
+          <w:sz w:val="15"/>
+        </w:rPr>
+        <w:t>[Refrão]</w:t>
+      </w:r>
+    </w:p>
+    <w:p>
+      <w:pPr>
+        <w:keepLines/>
+        <w:spacing w:after="0" w:line="240" w:lineRule="auto"/>
+        <w:rPr>
+          <w:rFonts w:hint="eastAsia"/>
+        </w:rPr>
+      </w:pPr>
+    </w:p>
+    <w:p>
+      <w:pPr>
+        <w:keepNext/>
+        <w:keepLines/>
+        <w:spacing w:after="0" w:line="240" w:lineRule="auto"/>
+        <w:rPr>
+          <w:rFonts w:hint="eastAsia"/>
+        </w:rPr>
+      </w:pPr>
+      <w:r>
+        <w:rPr>
+          <w:sz w:val="15"/>
+        </w:rPr>
+        <w:t xml:space="preserve">    </w:t>
+      </w:r>
+      <w:r>
+        <w:rPr>
+          <w:sz w:val="15"/>
+        </w:rPr>
+        <w:t>B</w:t>
+      </w:r>
+      <w:r>
+        <w:rPr>
+          <w:sz w:val="15"/>
+        </w:rPr>
+        <w:t xml:space="preserve">  </w:t>
+      </w:r>
+      <w:r>
+        <w:rPr>
+          <w:sz w:val="15"/>
+        </w:rPr>
+        <w:t>B/D#</w:t>
+      </w:r>
+      <w:r>
+        <w:rPr>
+          <w:sz w:val="15"/>
+        </w:rPr>
+        <w:t xml:space="preserve">  </w:t>
+      </w:r>
+      <w:r>
+        <w:rPr>
+          <w:sz w:val="15"/>
+        </w:rPr>
+        <w:t>E</w:t>
+      </w:r>
+      <w:r>
+        <w:rPr>
+          <w:sz w:val="15"/>
+        </w:rPr>
+        <w:t xml:space="preserve">  </w:t>
+      </w:r>
+      <w:r>
+        <w:rPr>
+          <w:sz w:val="15"/>
+        </w:rPr>
+        <w:t>B/D#</w:t>
+      </w:r>
+      <w:r>
+        <w:rPr>
+          <w:sz w:val="15"/>
+        </w:rPr>
+        <w:t xml:space="preserve">  </w:t>
+      </w:r>
+      <w:r>
+        <w:rPr>
+          <w:sz w:val="15"/>
+        </w:rPr>
+        <w:t>C#m7</w:t>
+      </w:r>
+      <w:r>
+        <w:rPr>
+          <w:sz w:val="15"/>
+        </w:rPr>
+        <w:t xml:space="preserve">  </w:t>
+      </w:r>
+      <w:r>
+        <w:rPr>
+          <w:sz w:val="15"/>
+        </w:rPr>
+        <w:t>C#m7/B</w:t>
+      </w:r>
+    </w:p>
+    <w:p>
+      <w:pPr>
+        <w:keepLines/>
+        <w:spacing w:after="0" w:line="240" w:lineRule="auto"/>
+        <w:rPr>
+          <w:rFonts w:hint="eastAsia"/>
+        </w:rPr>
+      </w:pPr>
+      <w:r>
+        <w:rPr>
+          <w:sz w:val="15"/>
+        </w:rPr>
+        <w:t>Kyrie      ele______ison</w:t>
+      </w:r>
+    </w:p>
+    <w:p>
+      <w:pPr>
+        <w:keepNext/>
+        <w:keepLines/>
+        <w:spacing w:after="0" w:line="240" w:lineRule="auto"/>
+        <w:rPr>
+          <w:rFonts w:hint="eastAsia"/>
+        </w:rPr>
+      </w:pPr>
+      <w:r>
+        <w:rPr>
+          <w:sz w:val="15"/>
+        </w:rPr>
+        <w:t xml:space="preserve">  </w:t>
+      </w:r>
+      <w:r>
+        <w:rPr>
+          <w:sz w:val="15"/>
+        </w:rPr>
+        <w:t>A</w:t>
+      </w:r>
+      <w:r>
+        <w:rPr>
+          <w:sz w:val="15"/>
+        </w:rPr>
+        <w:t xml:space="preserve">#m11  </w:t>
+      </w:r>
+      <w:r>
+        <w:rPr>
+          <w:sz w:val="15"/>
+        </w:rPr>
+        <w:t>D#7</w:t>
+      </w:r>
+      <w:r>
+        <w:rPr>
+          <w:sz w:val="15"/>
+        </w:rPr>
+        <w:t xml:space="preserve">  </w:t>
+      </w:r>
+      <w:r>
+        <w:rPr>
+          <w:sz w:val="15"/>
+        </w:rPr>
+        <w:t>G#m7</w:t>
+      </w:r>
+    </w:p>
+    <w:p>
+      <w:pPr>
+        <w:keepLines/>
+        <w:spacing w:after="0" w:line="240" w:lineRule="auto"/>
+        <w:rPr>
+          <w:rFonts w:hint="eastAsia"/>
+        </w:rPr>
+      </w:pPr>
+      <w:r>
+        <w:rPr>
+          <w:sz w:val="15"/>
+        </w:rPr>
+        <w:t>Ele_________ison</w:t>
+      </w:r>
+    </w:p>
+    <w:p>
+      <w:pPr>
+        <w:keepNext/>
+        <w:keepLines/>
+        <w:spacing w:after="0" w:line="240" w:lineRule="auto"/>
+        <w:rPr>
+          <w:rFonts w:hint="eastAsia"/>
+        </w:rPr>
+      </w:pPr>
+      <w:r>
+        <w:rPr>
+          <w:sz w:val="15"/>
+        </w:rPr>
+        <w:t xml:space="preserve">  </w:t>
+      </w:r>
+      <w:r>
+        <w:rPr>
+          <w:sz w:val="15"/>
+        </w:rPr>
+        <w:t>C#4</w:t>
+      </w:r>
+      <w:r>
+        <w:rPr>
+          <w:sz w:val="15"/>
+        </w:rPr>
+        <w:t xml:space="preserve">  </w:t>
+      </w:r>
+      <w:r>
+        <w:rPr>
+          <w:sz w:val="15"/>
+        </w:rPr>
+        <w:t>C#7</w:t>
+      </w:r>
+      <w:r>
+        <w:rPr>
+          <w:sz w:val="15"/>
+        </w:rPr>
+        <w:t xml:space="preserve">  </w:t>
+      </w:r>
+      <w:r>
+        <w:rPr>
+          <w:sz w:val="15"/>
+        </w:rPr>
+        <w:t>F#</w:t>
+      </w:r>
+      <w:r>
+        <w:rPr>
+          <w:sz w:val="15"/>
+        </w:rPr>
+        <w:t xml:space="preserve">  </w:t>
+      </w:r>
+      <w:r>
+        <w:rPr>
+          <w:sz w:val="15"/>
+        </w:rPr>
+        <w:t>E/F#</w:t>
+      </w:r>
+      <w:r>
+        <w:rPr>
+          <w:sz w:val="15"/>
+        </w:rPr>
+        <w:t xml:space="preserve">  </w:t>
+      </w:r>
+      <w:r>
+        <w:rPr>
+          <w:sz w:val="15"/>
+        </w:rPr>
+        <w:t>F#</w:t>
+      </w:r>
+      <w:r>
+        <w:rPr>
+          <w:sz w:val="15"/>
+        </w:rPr>
+        <w:t xml:space="preserve">  </w:t>
+      </w:r>
+      <w:r>
+        <w:rPr>
+          <w:sz w:val="15"/>
+        </w:rPr>
+        <w:t>E/F#</w:t>
+      </w:r>
+    </w:p>
+    <w:p>
+      <w:pPr>
+        <w:keepLines/>
+        <w:spacing w:after="0" w:line="240" w:lineRule="auto"/>
+        <w:rPr>
+          <w:rFonts w:hint="eastAsia"/>
+        </w:rPr>
+      </w:pPr>
+      <w:r>
+        <w:rPr>
+          <w:sz w:val="15"/>
+        </w:rPr>
+        <w:t>Ele_______ison</w:t>
+      </w:r>
+    </w:p>
+    <w:p>
+      <w:pPr>
+        <w:keepLines/>
+        <w:spacing w:after="0" w:line="240" w:lineRule="auto"/>
+        <w:rPr>
+          <w:rFonts w:hint="eastAsia"/>
+        </w:rPr>
+      </w:pPr>
+    </w:p>
+    <w:p>
+      <w:pPr>
+        <w:keepNext/>
+        <w:keepLines/>
+        <w:spacing w:after="0" w:line="240" w:lineRule="auto"/>
+        <w:rPr>
+          <w:rFonts w:hint="eastAsia"/>
+        </w:rPr>
+      </w:pPr>
+      <w:r>
+        <w:rPr>
+          <w:sz w:val="15"/>
+        </w:rPr>
+        <w:t xml:space="preserve">    </w:t>
+      </w:r>
+      <w:r>
+        <w:rPr>
+          <w:sz w:val="15"/>
+        </w:rPr>
+        <w:t>B</w:t>
+      </w:r>
+      <w:r>
+        <w:rPr>
+          <w:sz w:val="15"/>
+        </w:rPr>
+        <w:t xml:space="preserve">  </w:t>
+      </w:r>
+      <w:r>
+        <w:rPr>
+          <w:sz w:val="15"/>
+        </w:rPr>
+        <w:t>B/D#</w:t>
+      </w:r>
+      <w:r>
+        <w:rPr>
+          <w:sz w:val="15"/>
+        </w:rPr>
+        <w:t xml:space="preserve">  </w:t>
+      </w:r>
+      <w:r>
+        <w:rPr>
+          <w:sz w:val="15"/>
+        </w:rPr>
+        <w:t>E</w:t>
+      </w:r>
+      <w:r>
+        <w:rPr>
+          <w:sz w:val="15"/>
+        </w:rPr>
+        <w:t xml:space="preserve">  </w:t>
+      </w:r>
+      <w:r>
+        <w:rPr>
+          <w:sz w:val="15"/>
+        </w:rPr>
+        <w:t>B/D#</w:t>
+      </w:r>
+      <w:r>
+        <w:rPr>
+          <w:sz w:val="15"/>
+        </w:rPr>
+        <w:t xml:space="preserve">  </w:t>
+      </w:r>
+      <w:r>
+        <w:rPr>
+          <w:sz w:val="15"/>
+        </w:rPr>
+        <w:t>C#m7</w:t>
+      </w:r>
+      <w:r>
+        <w:rPr>
+          <w:sz w:val="15"/>
+        </w:rPr>
+        <w:t xml:space="preserve">  </w:t>
+      </w:r>
+      <w:r>
+        <w:rPr>
+          <w:sz w:val="15"/>
+        </w:rPr>
+        <w:t>C#m7/B</w:t>
+      </w:r>
+    </w:p>
+    <w:p>
+      <w:pPr>
+        <w:keepLines/>
+        <w:spacing w:after="0" w:line="240" w:lineRule="auto"/>
+        <w:rPr>
+          <w:rFonts w:hint="eastAsia"/>
+        </w:rPr>
+      </w:pPr>
+      <w:r>
+        <w:rPr>
+          <w:sz w:val="15"/>
+        </w:rPr>
+        <w:t>Kyrie      ele______ison</w:t>
+      </w:r>
+    </w:p>
+    <w:p>
+      <w:pPr>
+        <w:keepNext/>
+        <w:keepLines/>
+        <w:spacing w:after="0" w:line="240" w:lineRule="auto"/>
+        <w:rPr>
+          <w:rFonts w:hint="eastAsia"/>
+        </w:rPr>
+      </w:pPr>
+      <w:r>
+        <w:rPr>
+          <w:sz w:val="15"/>
+        </w:rPr>
+        <w:t xml:space="preserve">  </w:t>
+      </w:r>
+      <w:r>
+        <w:rPr>
+          <w:sz w:val="15"/>
+        </w:rPr>
+        <w:t>A</w:t>
+      </w:r>
+      <w:r>
+        <w:rPr>
+          <w:sz w:val="15"/>
+        </w:rPr>
+        <w:t xml:space="preserve">#m11  </w:t>
+      </w:r>
+      <w:r>
+        <w:rPr>
+          <w:sz w:val="15"/>
+        </w:rPr>
+        <w:t>D#7</w:t>
+      </w:r>
+      <w:r>
+        <w:rPr>
+          <w:sz w:val="15"/>
+        </w:rPr>
+        <w:t xml:space="preserve">  </w:t>
+      </w:r>
+      <w:r>
+        <w:rPr>
+          <w:sz w:val="15"/>
+        </w:rPr>
+        <w:t>G#m7</w:t>
+      </w:r>
+    </w:p>
+    <w:p>
+      <w:pPr>
+        <w:keepLines/>
+        <w:spacing w:after="0" w:line="240" w:lineRule="auto"/>
+        <w:rPr>
+          <w:rFonts w:hint="eastAsia"/>
+        </w:rPr>
+      </w:pPr>
+      <w:r>
+        <w:rPr>
+          <w:sz w:val="15"/>
+        </w:rPr>
+        <w:t>Ele_________ison</w:t>
+      </w:r>
+    </w:p>
+    <w:p>
+      <w:pPr>
+        <w:keepNext/>
+        <w:keepLines/>
+        <w:spacing w:after="0" w:line="240" w:lineRule="auto"/>
+        <w:rPr>
+          <w:rFonts w:hint="eastAsia"/>
+        </w:rPr>
+      </w:pPr>
+      <w:r>
+        <w:rPr>
+          <w:sz w:val="15"/>
+        </w:rPr>
+        <w:t xml:space="preserve">  </w:t>
+      </w:r>
+      <w:r>
+        <w:rPr>
+          <w:sz w:val="15"/>
+        </w:rPr>
+        <w:t>C#4</w:t>
+      </w:r>
+      <w:r>
+        <w:rPr>
+          <w:sz w:val="15"/>
+        </w:rPr>
+        <w:t xml:space="preserve">  </w:t>
+      </w:r>
+      <w:r>
+        <w:rPr>
+          <w:sz w:val="15"/>
+        </w:rPr>
+        <w:t>C#7</w:t>
+      </w:r>
+      <w:r>
+        <w:rPr>
+          <w:sz w:val="15"/>
+        </w:rPr>
+        <w:t xml:space="preserve">  </w:t>
+      </w:r>
+      <w:r>
+        <w:rPr>
+          <w:sz w:val="15"/>
+        </w:rPr>
+        <w:t>F#</w:t>
+      </w:r>
+    </w:p>
+    <w:p>
+      <w:pPr>
+        <w:keepLines/>
+        <w:spacing w:after="0" w:line="240" w:lineRule="auto"/>
+        <w:rPr>
+          <w:rFonts w:hint="eastAsia"/>
+        </w:rPr>
+      </w:pPr>
+      <w:r>
+        <w:rPr>
+          <w:sz w:val="15"/>
+        </w:rPr>
+        <w:t>Ele_______ison</w:t>
+      </w:r>
+    </w:p>
+    <w:p>
+      <w:pPr>
+        <w:keepLines/>
+        <w:spacing w:after="0" w:line="240" w:lineRule="auto"/>
+        <w:rPr>
+          <w:rFonts w:hint="eastAsia"/>
+        </w:rPr>
+      </w:pPr>
+    </w:p>
+    <w:p>
+      <w:pPr>
+        <w:keepNext/>
+        <w:keepLines/>
+        <w:spacing w:after="0" w:line="240" w:lineRule="auto"/>
+        <w:rPr>
+          <w:rFonts w:hint="eastAsia"/>
+        </w:rPr>
+      </w:pPr>
+      <w:r>
+        <w:rPr>
+          <w:sz w:val="15"/>
+        </w:rPr>
+        <w:t xml:space="preserve">[Final] </w:t>
+      </w:r>
+      <w:r>
+        <w:rPr>
+          <w:sz w:val="15"/>
+        </w:rPr>
+        <w:t>E/F#</w:t>
+      </w:r>
+      <w:r>
+        <w:rPr>
+          <w:sz w:val="15"/>
+        </w:rPr>
+        <w:t xml:space="preserve">  </w:t>
+      </w:r>
+      <w:r>
+        <w:rPr>
+          <w:sz w:val="15"/>
+        </w:rPr>
+        <w:t>F#</w:t>
+      </w:r>
+      <w:r>
+        <w:rPr>
+          <w:sz w:val="15"/>
+        </w:rPr>
+        <w:t xml:space="preserve">  A7M</w:t>
       </w:r>
     </w:p>
     <w:p>
@@ -1428,14 +2474,6 @@
     </w:p>
     <w:p>
       <w:pPr>
-        <w:spacing w:before="6717"/>
-        <w:rPr>
-          <w:rFonts w:hint="eastAsia"/>
-        </w:rPr>
-      </w:pPr>
-    </w:p>
-    <w:p>
-      <w:pPr>
         <w:spacing w:after="0"/>
         <w:rPr>
           <w:rFonts w:hint="eastAsia"/>
@@ -1451,15 +2489,17 @@
         <w:tblLook w:val="04A0" w:firstRow="1" w:lastRow="0" w:firstColumn="1" w:lastColumn="0" w:noHBand="0" w:noVBand="1"/>
       </w:tblPr>
       <w:tblGrid>
-        <w:gridCol w:w="2861"/>
-        <w:gridCol w:w="2861"/>
-        <w:gridCol w:w="2861"/>
-        <w:gridCol w:w="2861"/>
+        <w:gridCol w:w="1908"/>
+        <w:gridCol w:w="1908"/>
+        <w:gridCol w:w="1908"/>
+        <w:gridCol w:w="1908"/>
+        <w:gridCol w:w="1908"/>
+        <w:gridCol w:w="1908"/>
       </w:tblGrid>
       <w:tr>
         <w:tc>
           <w:tcPr>
-            <w:tcW w:w="2861" w:type="dxa"/>
+            <w:tcW w:w="1908" w:type="dxa"/>
           </w:tcPr>
           <w:p>
             <w:pPr>
@@ -1473,8 +2513,8 @@
                 <w:noProof/>
               </w:rPr>
               <w:drawing>
-                <wp:inline distT="0" distB="0" distL="0" distR="0" wp14:anchorId="7B37B90B" wp14:editId="23C2C805">
-                  <wp:extent cx="621792" cy="829056"/>
+                <wp:inline distT="0" distB="0" distL="0" distR="0" wp14:anchorId="6F0C2E86" wp14:editId="4161CB8E">
+                  <wp:extent cx="530352" cy="707136"/>
                   <wp:effectExtent l="0" t="0" r="0" b="0"/>
                   <wp:docPr id="1" name="Picture 1"/>
                   <wp:cNvGraphicFramePr>
@@ -1484,7 +2524,7 @@
                     <a:graphicData uri="http://schemas.openxmlformats.org/drawingml/2006/picture">
                       <pic:pic xmlns:pic="http://schemas.openxmlformats.org/drawingml/2006/picture">
                         <pic:nvPicPr>
-                          <pic:cNvPr id="0" name="C.png"/>
+                          <pic:cNvPr id="0" name="A.png"/>
                           <pic:cNvPicPr/>
                         </pic:nvPicPr>
                         <pic:blipFill>
@@ -1496,7 +2536,7 @@
                         <pic:spPr>
                           <a:xfrm>
                             <a:off x="0" y="0"/>
-                            <a:ext cx="621792" cy="829056"/>
+                            <a:ext cx="530352" cy="707136"/>
                           </a:xfrm>
                           <a:prstGeom prst="rect">
                             <a:avLst/>
@@ -1512,7 +2552,7 @@
         </w:tc>
         <w:tc>
           <w:tcPr>
-            <w:tcW w:w="2861" w:type="dxa"/>
+            <w:tcW w:w="1908" w:type="dxa"/>
           </w:tcPr>
           <w:p>
             <w:pPr>
@@ -1526,8 +2566,8 @@
                 <w:noProof/>
               </w:rPr>
               <w:drawing>
-                <wp:inline distT="0" distB="0" distL="0" distR="0" wp14:anchorId="02802663" wp14:editId="094D4AC8">
-                  <wp:extent cx="621792" cy="829056"/>
+                <wp:inline distT="0" distB="0" distL="0" distR="0" wp14:anchorId="5FCAF09C" wp14:editId="077D6B57">
+                  <wp:extent cx="530352" cy="707136"/>
                   <wp:effectExtent l="0" t="0" r="0" b="0"/>
                   <wp:docPr id="2" name="Picture 2"/>
                   <wp:cNvGraphicFramePr>
@@ -1537,7 +2577,7 @@
                     <a:graphicData uri="http://schemas.openxmlformats.org/drawingml/2006/picture">
                       <pic:pic xmlns:pic="http://schemas.openxmlformats.org/drawingml/2006/picture">
                         <pic:nvPicPr>
-                          <pic:cNvPr id="0" name="D.png"/>
+                          <pic:cNvPr id="0" name="A_B.png"/>
                           <pic:cNvPicPr/>
                         </pic:nvPicPr>
                         <pic:blipFill>
@@ -1549,7 +2589,7 @@
                         <pic:spPr>
                           <a:xfrm>
                             <a:off x="0" y="0"/>
-                            <a:ext cx="621792" cy="829056"/>
+                            <a:ext cx="530352" cy="707136"/>
                           </a:xfrm>
                           <a:prstGeom prst="rect">
                             <a:avLst/>
@@ -1565,7 +2605,7 @@
         </w:tc>
         <w:tc>
           <w:tcPr>
-            <w:tcW w:w="2861" w:type="dxa"/>
+            <w:tcW w:w="1908" w:type="dxa"/>
           </w:tcPr>
           <w:p>
             <w:pPr>
@@ -1579,8 +2619,8 @@
                 <w:noProof/>
               </w:rPr>
               <w:drawing>
-                <wp:inline distT="0" distB="0" distL="0" distR="0" wp14:anchorId="753A9194" wp14:editId="62EFD111">
-                  <wp:extent cx="621792" cy="829056"/>
+                <wp:inline distT="0" distB="0" distL="0" distR="0" wp14:anchorId="718B93D6" wp14:editId="12B37188">
+                  <wp:extent cx="530352" cy="707136"/>
                   <wp:effectExtent l="0" t="0" r="0" b="0"/>
                   <wp:docPr id="3" name="Picture 3"/>
                   <wp:cNvGraphicFramePr>
@@ -1590,7 +2630,7 @@
                     <a:graphicData uri="http://schemas.openxmlformats.org/drawingml/2006/picture">
                       <pic:pic xmlns:pic="http://schemas.openxmlformats.org/drawingml/2006/picture">
                         <pic:nvPicPr>
-                          <pic:cNvPr id="0" name="Em.png"/>
+                          <pic:cNvPr id="0" name="A_Csharp.png"/>
                           <pic:cNvPicPr/>
                         </pic:nvPicPr>
                         <pic:blipFill>
@@ -1602,7 +2642,7 @@
                         <pic:spPr>
                           <a:xfrm>
                             <a:off x="0" y="0"/>
-                            <a:ext cx="621792" cy="829056"/>
+                            <a:ext cx="530352" cy="707136"/>
                           </a:xfrm>
                           <a:prstGeom prst="rect">
                             <a:avLst/>
@@ -1618,7 +2658,7 @@
         </w:tc>
         <w:tc>
           <w:tcPr>
-            <w:tcW w:w="2861" w:type="dxa"/>
+            <w:tcW w:w="1908" w:type="dxa"/>
           </w:tcPr>
           <w:p>
             <w:pPr>
@@ -1632,8 +2672,8 @@
                 <w:noProof/>
               </w:rPr>
               <w:drawing>
-                <wp:inline distT="0" distB="0" distL="0" distR="0" wp14:anchorId="253462E7" wp14:editId="65C2F6B5">
-                  <wp:extent cx="621792" cy="829056"/>
+                <wp:inline distT="0" distB="0" distL="0" distR="0" wp14:anchorId="09171A65" wp14:editId="565C39B4">
+                  <wp:extent cx="530352" cy="707136"/>
                   <wp:effectExtent l="0" t="0" r="0" b="0"/>
                   <wp:docPr id="4" name="Picture 4"/>
                   <wp:cNvGraphicFramePr>
@@ -1643,7 +2683,7 @@
                     <a:graphicData uri="http://schemas.openxmlformats.org/drawingml/2006/picture">
                       <pic:pic xmlns:pic="http://schemas.openxmlformats.org/drawingml/2006/picture">
                         <pic:nvPicPr>
-                          <pic:cNvPr id="0" name="G.png"/>
+                          <pic:cNvPr id="0" name="A9.png"/>
                           <pic:cNvPicPr/>
                         </pic:nvPicPr>
                         <pic:blipFill>
@@ -1655,7 +2695,7 @@
                         <pic:spPr>
                           <a:xfrm>
                             <a:off x="0" y="0"/>
-                            <a:ext cx="621792" cy="829056"/>
+                            <a:ext cx="530352" cy="707136"/>
                           </a:xfrm>
                           <a:prstGeom prst="rect">
                             <a:avLst/>
@@ -1667,6 +2707,1352 @@
                 </wp:inline>
               </w:drawing>
             </w:r>
+          </w:p>
+        </w:tc>
+        <w:tc>
+          <w:tcPr>
+            <w:tcW w:w="1908" w:type="dxa"/>
+          </w:tcPr>
+          <w:p>
+            <w:pPr>
+              <w:jc w:val="center"/>
+              <w:rPr>
+                <w:rFonts w:hint="eastAsia"/>
+              </w:rPr>
+            </w:pPr>
+            <w:r>
+              <w:rPr>
+                <w:noProof/>
+              </w:rPr>
+              <w:drawing>
+                <wp:inline distT="0" distB="0" distL="0" distR="0" wp14:anchorId="2B1EA441" wp14:editId="519020BD">
+                  <wp:extent cx="530352" cy="707136"/>
+                  <wp:effectExtent l="0" t="0" r="0" b="0"/>
+                  <wp:docPr id="5" name="Picture 5"/>
+                  <wp:cNvGraphicFramePr>
+                    <a:graphicFrameLocks xmlns:a="http://schemas.openxmlformats.org/drawingml/2006/main" noChangeAspect="1"/>
+                  </wp:cNvGraphicFramePr>
+                  <a:graphic xmlns:a="http://schemas.openxmlformats.org/drawingml/2006/main">
+                    <a:graphicData uri="http://schemas.openxmlformats.org/drawingml/2006/picture">
+                      <pic:pic xmlns:pic="http://schemas.openxmlformats.org/drawingml/2006/picture">
+                        <pic:nvPicPr>
+                          <pic:cNvPr id="0" name="B.png"/>
+                          <pic:cNvPicPr/>
+                        </pic:nvPicPr>
+                        <pic:blipFill>
+                          <a:blip r:embed="rId13"/>
+                          <a:stretch>
+                            <a:fillRect/>
+                          </a:stretch>
+                        </pic:blipFill>
+                        <pic:spPr>
+                          <a:xfrm>
+                            <a:off x="0" y="0"/>
+                            <a:ext cx="530352" cy="707136"/>
+                          </a:xfrm>
+                          <a:prstGeom prst="rect">
+                            <a:avLst/>
+                          </a:prstGeom>
+                        </pic:spPr>
+                      </pic:pic>
+                    </a:graphicData>
+                  </a:graphic>
+                </wp:inline>
+              </w:drawing>
+            </w:r>
+          </w:p>
+        </w:tc>
+        <w:tc>
+          <w:tcPr>
+            <w:tcW w:w="1908" w:type="dxa"/>
+          </w:tcPr>
+          <w:p>
+            <w:pPr>
+              <w:jc w:val="center"/>
+              <w:rPr>
+                <w:rFonts w:hint="eastAsia"/>
+              </w:rPr>
+            </w:pPr>
+            <w:r>
+              <w:rPr>
+                <w:noProof/>
+              </w:rPr>
+              <w:drawing>
+                <wp:inline distT="0" distB="0" distL="0" distR="0" wp14:anchorId="2144C54F" wp14:editId="66522896">
+                  <wp:extent cx="530352" cy="707136"/>
+                  <wp:effectExtent l="0" t="0" r="0" b="0"/>
+                  <wp:docPr id="6" name="Picture 6"/>
+                  <wp:cNvGraphicFramePr>
+                    <a:graphicFrameLocks xmlns:a="http://schemas.openxmlformats.org/drawingml/2006/main" noChangeAspect="1"/>
+                  </wp:cNvGraphicFramePr>
+                  <a:graphic xmlns:a="http://schemas.openxmlformats.org/drawingml/2006/main">
+                    <a:graphicData uri="http://schemas.openxmlformats.org/drawingml/2006/picture">
+                      <pic:pic xmlns:pic="http://schemas.openxmlformats.org/drawingml/2006/picture">
+                        <pic:nvPicPr>
+                          <pic:cNvPr id="0" name="B_Dsharp.png"/>
+                          <pic:cNvPicPr/>
+                        </pic:nvPicPr>
+                        <pic:blipFill>
+                          <a:blip r:embed="rId14"/>
+                          <a:stretch>
+                            <a:fillRect/>
+                          </a:stretch>
+                        </pic:blipFill>
+                        <pic:spPr>
+                          <a:xfrm>
+                            <a:off x="0" y="0"/>
+                            <a:ext cx="530352" cy="707136"/>
+                          </a:xfrm>
+                          <a:prstGeom prst="rect">
+                            <a:avLst/>
+                          </a:prstGeom>
+                        </pic:spPr>
+                      </pic:pic>
+                    </a:graphicData>
+                  </a:graphic>
+                </wp:inline>
+              </w:drawing>
+            </w:r>
+          </w:p>
+        </w:tc>
+      </w:tr>
+      <w:tr>
+        <w:tc>
+          <w:tcPr>
+            <w:tcW w:w="1908" w:type="dxa"/>
+          </w:tcPr>
+          <w:p>
+            <w:pPr>
+              <w:jc w:val="center"/>
+              <w:rPr>
+                <w:rFonts w:hint="eastAsia"/>
+              </w:rPr>
+            </w:pPr>
+            <w:r>
+              <w:rPr>
+                <w:noProof/>
+              </w:rPr>
+              <w:drawing>
+                <wp:inline distT="0" distB="0" distL="0" distR="0" wp14:anchorId="78EBE7DE" wp14:editId="0D2B26A3">
+                  <wp:extent cx="530352" cy="707136"/>
+                  <wp:effectExtent l="0" t="0" r="0" b="0"/>
+                  <wp:docPr id="7" name="Picture 7"/>
+                  <wp:cNvGraphicFramePr>
+                    <a:graphicFrameLocks xmlns:a="http://schemas.openxmlformats.org/drawingml/2006/main" noChangeAspect="1"/>
+                  </wp:cNvGraphicFramePr>
+                  <a:graphic xmlns:a="http://schemas.openxmlformats.org/drawingml/2006/main">
+                    <a:graphicData uri="http://schemas.openxmlformats.org/drawingml/2006/picture">
+                      <pic:pic xmlns:pic="http://schemas.openxmlformats.org/drawingml/2006/picture">
+                        <pic:nvPicPr>
+                          <pic:cNvPr id="0" name="Bm7.png"/>
+                          <pic:cNvPicPr/>
+                        </pic:nvPicPr>
+                        <pic:blipFill>
+                          <a:blip r:embed="rId15"/>
+                          <a:stretch>
+                            <a:fillRect/>
+                          </a:stretch>
+                        </pic:blipFill>
+                        <pic:spPr>
+                          <a:xfrm>
+                            <a:off x="0" y="0"/>
+                            <a:ext cx="530352" cy="707136"/>
+                          </a:xfrm>
+                          <a:prstGeom prst="rect">
+                            <a:avLst/>
+                          </a:prstGeom>
+                        </pic:spPr>
+                      </pic:pic>
+                    </a:graphicData>
+                  </a:graphic>
+                </wp:inline>
+              </w:drawing>
+            </w:r>
+          </w:p>
+        </w:tc>
+        <w:tc>
+          <w:tcPr>
+            <w:tcW w:w="1908" w:type="dxa"/>
+          </w:tcPr>
+          <w:p>
+            <w:pPr>
+              <w:jc w:val="center"/>
+              <w:rPr>
+                <w:rFonts w:hint="eastAsia"/>
+              </w:rPr>
+            </w:pPr>
+            <w:r>
+              <w:rPr>
+                <w:noProof/>
+              </w:rPr>
+              <w:drawing>
+                <wp:inline distT="0" distB="0" distL="0" distR="0" wp14:anchorId="4B75FFC6" wp14:editId="08E2307D">
+                  <wp:extent cx="530352" cy="707136"/>
+                  <wp:effectExtent l="0" t="0" r="0" b="0"/>
+                  <wp:docPr id="8" name="Picture 8"/>
+                  <wp:cNvGraphicFramePr>
+                    <a:graphicFrameLocks xmlns:a="http://schemas.openxmlformats.org/drawingml/2006/main" noChangeAspect="1"/>
+                  </wp:cNvGraphicFramePr>
+                  <a:graphic xmlns:a="http://schemas.openxmlformats.org/drawingml/2006/main">
+                    <a:graphicData uri="http://schemas.openxmlformats.org/drawingml/2006/picture">
+                      <pic:pic xmlns:pic="http://schemas.openxmlformats.org/drawingml/2006/picture">
+                        <pic:nvPicPr>
+                          <pic:cNvPr id="0" name="Bm7_A.png"/>
+                          <pic:cNvPicPr/>
+                        </pic:nvPicPr>
+                        <pic:blipFill>
+                          <a:blip r:embed="rId16"/>
+                          <a:stretch>
+                            <a:fillRect/>
+                          </a:stretch>
+                        </pic:blipFill>
+                        <pic:spPr>
+                          <a:xfrm>
+                            <a:off x="0" y="0"/>
+                            <a:ext cx="530352" cy="707136"/>
+                          </a:xfrm>
+                          <a:prstGeom prst="rect">
+                            <a:avLst/>
+                          </a:prstGeom>
+                        </pic:spPr>
+                      </pic:pic>
+                    </a:graphicData>
+                  </a:graphic>
+                </wp:inline>
+              </w:drawing>
+            </w:r>
+          </w:p>
+        </w:tc>
+        <w:tc>
+          <w:tcPr>
+            <w:tcW w:w="1908" w:type="dxa"/>
+          </w:tcPr>
+          <w:p>
+            <w:pPr>
+              <w:jc w:val="center"/>
+              <w:rPr>
+                <w:rFonts w:hint="eastAsia"/>
+              </w:rPr>
+            </w:pPr>
+            <w:r>
+              <w:rPr>
+                <w:noProof/>
+              </w:rPr>
+              <w:drawing>
+                <wp:inline distT="0" distB="0" distL="0" distR="0" wp14:anchorId="686AF1EA" wp14:editId="69CF9B49">
+                  <wp:extent cx="530352" cy="707136"/>
+                  <wp:effectExtent l="0" t="0" r="0" b="0"/>
+                  <wp:docPr id="9" name="Picture 9"/>
+                  <wp:cNvGraphicFramePr>
+                    <a:graphicFrameLocks xmlns:a="http://schemas.openxmlformats.org/drawingml/2006/main" noChangeAspect="1"/>
+                  </wp:cNvGraphicFramePr>
+                  <a:graphic xmlns:a="http://schemas.openxmlformats.org/drawingml/2006/main">
+                    <a:graphicData uri="http://schemas.openxmlformats.org/drawingml/2006/picture">
+                      <pic:pic xmlns:pic="http://schemas.openxmlformats.org/drawingml/2006/picture">
+                        <pic:nvPicPr>
+                          <pic:cNvPr id="0" name="Csharp4.png"/>
+                          <pic:cNvPicPr/>
+                        </pic:nvPicPr>
+                        <pic:blipFill>
+                          <a:blip r:embed="rId17"/>
+                          <a:stretch>
+                            <a:fillRect/>
+                          </a:stretch>
+                        </pic:blipFill>
+                        <pic:spPr>
+                          <a:xfrm>
+                            <a:off x="0" y="0"/>
+                            <a:ext cx="530352" cy="707136"/>
+                          </a:xfrm>
+                          <a:prstGeom prst="rect">
+                            <a:avLst/>
+                          </a:prstGeom>
+                        </pic:spPr>
+                      </pic:pic>
+                    </a:graphicData>
+                  </a:graphic>
+                </wp:inline>
+              </w:drawing>
+            </w:r>
+          </w:p>
+        </w:tc>
+        <w:tc>
+          <w:tcPr>
+            <w:tcW w:w="1908" w:type="dxa"/>
+          </w:tcPr>
+          <w:p>
+            <w:pPr>
+              <w:jc w:val="center"/>
+              <w:rPr>
+                <w:rFonts w:hint="eastAsia"/>
+              </w:rPr>
+            </w:pPr>
+            <w:r>
+              <w:rPr>
+                <w:noProof/>
+              </w:rPr>
+              <w:drawing>
+                <wp:inline distT="0" distB="0" distL="0" distR="0" wp14:anchorId="5C853455" wp14:editId="7D358188">
+                  <wp:extent cx="530352" cy="707136"/>
+                  <wp:effectExtent l="0" t="0" r="0" b="0"/>
+                  <wp:docPr id="10" name="Picture 10"/>
+                  <wp:cNvGraphicFramePr>
+                    <a:graphicFrameLocks xmlns:a="http://schemas.openxmlformats.org/drawingml/2006/main" noChangeAspect="1"/>
+                  </wp:cNvGraphicFramePr>
+                  <a:graphic xmlns:a="http://schemas.openxmlformats.org/drawingml/2006/main">
+                    <a:graphicData uri="http://schemas.openxmlformats.org/drawingml/2006/picture">
+                      <pic:pic xmlns:pic="http://schemas.openxmlformats.org/drawingml/2006/picture">
+                        <pic:nvPicPr>
+                          <pic:cNvPr id="0" name="Csharp7.png"/>
+                          <pic:cNvPicPr/>
+                        </pic:nvPicPr>
+                        <pic:blipFill>
+                          <a:blip r:embed="rId18"/>
+                          <a:stretch>
+                            <a:fillRect/>
+                          </a:stretch>
+                        </pic:blipFill>
+                        <pic:spPr>
+                          <a:xfrm>
+                            <a:off x="0" y="0"/>
+                            <a:ext cx="530352" cy="707136"/>
+                          </a:xfrm>
+                          <a:prstGeom prst="rect">
+                            <a:avLst/>
+                          </a:prstGeom>
+                        </pic:spPr>
+                      </pic:pic>
+                    </a:graphicData>
+                  </a:graphic>
+                </wp:inline>
+              </w:drawing>
+            </w:r>
+          </w:p>
+        </w:tc>
+        <w:tc>
+          <w:tcPr>
+            <w:tcW w:w="1908" w:type="dxa"/>
+          </w:tcPr>
+          <w:p>
+            <w:pPr>
+              <w:jc w:val="center"/>
+              <w:rPr>
+                <w:rFonts w:hint="eastAsia"/>
+              </w:rPr>
+            </w:pPr>
+            <w:r>
+              <w:rPr>
+                <w:noProof/>
+              </w:rPr>
+              <w:drawing>
+                <wp:inline distT="0" distB="0" distL="0" distR="0" wp14:anchorId="08B74AC0" wp14:editId="7ABB6377">
+                  <wp:extent cx="530352" cy="707136"/>
+                  <wp:effectExtent l="0" t="0" r="0" b="0"/>
+                  <wp:docPr id="11" name="Picture 11"/>
+                  <wp:cNvGraphicFramePr>
+                    <a:graphicFrameLocks xmlns:a="http://schemas.openxmlformats.org/drawingml/2006/main" noChangeAspect="1"/>
+                  </wp:cNvGraphicFramePr>
+                  <a:graphic xmlns:a="http://schemas.openxmlformats.org/drawingml/2006/main">
+                    <a:graphicData uri="http://schemas.openxmlformats.org/drawingml/2006/picture">
+                      <pic:pic xmlns:pic="http://schemas.openxmlformats.org/drawingml/2006/picture">
+                        <pic:nvPicPr>
+                          <pic:cNvPr id="0" name="Csharpm7.png"/>
+                          <pic:cNvPicPr/>
+                        </pic:nvPicPr>
+                        <pic:blipFill>
+                          <a:blip r:embed="rId19"/>
+                          <a:stretch>
+                            <a:fillRect/>
+                          </a:stretch>
+                        </pic:blipFill>
+                        <pic:spPr>
+                          <a:xfrm>
+                            <a:off x="0" y="0"/>
+                            <a:ext cx="530352" cy="707136"/>
+                          </a:xfrm>
+                          <a:prstGeom prst="rect">
+                            <a:avLst/>
+                          </a:prstGeom>
+                        </pic:spPr>
+                      </pic:pic>
+                    </a:graphicData>
+                  </a:graphic>
+                </wp:inline>
+              </w:drawing>
+            </w:r>
+          </w:p>
+        </w:tc>
+        <w:tc>
+          <w:tcPr>
+            <w:tcW w:w="1908" w:type="dxa"/>
+          </w:tcPr>
+          <w:p>
+            <w:pPr>
+              <w:jc w:val="center"/>
+              <w:rPr>
+                <w:rFonts w:hint="eastAsia"/>
+              </w:rPr>
+            </w:pPr>
+            <w:r>
+              <w:rPr>
+                <w:noProof/>
+              </w:rPr>
+              <w:drawing>
+                <wp:inline distT="0" distB="0" distL="0" distR="0" wp14:anchorId="01E3C385" wp14:editId="19D07F63">
+                  <wp:extent cx="530352" cy="707136"/>
+                  <wp:effectExtent l="0" t="0" r="0" b="0"/>
+                  <wp:docPr id="12" name="Picture 12"/>
+                  <wp:cNvGraphicFramePr>
+                    <a:graphicFrameLocks xmlns:a="http://schemas.openxmlformats.org/drawingml/2006/main" noChangeAspect="1"/>
+                  </wp:cNvGraphicFramePr>
+                  <a:graphic xmlns:a="http://schemas.openxmlformats.org/drawingml/2006/main">
+                    <a:graphicData uri="http://schemas.openxmlformats.org/drawingml/2006/picture">
+                      <pic:pic xmlns:pic="http://schemas.openxmlformats.org/drawingml/2006/picture">
+                        <pic:nvPicPr>
+                          <pic:cNvPr id="0" name="Csharpm7_B.png"/>
+                          <pic:cNvPicPr/>
+                        </pic:nvPicPr>
+                        <pic:blipFill>
+                          <a:blip r:embed="rId20"/>
+                          <a:stretch>
+                            <a:fillRect/>
+                          </a:stretch>
+                        </pic:blipFill>
+                        <pic:spPr>
+                          <a:xfrm>
+                            <a:off x="0" y="0"/>
+                            <a:ext cx="530352" cy="707136"/>
+                          </a:xfrm>
+                          <a:prstGeom prst="rect">
+                            <a:avLst/>
+                          </a:prstGeom>
+                        </pic:spPr>
+                      </pic:pic>
+                    </a:graphicData>
+                  </a:graphic>
+                </wp:inline>
+              </w:drawing>
+            </w:r>
+          </w:p>
+        </w:tc>
+      </w:tr>
+      <w:tr>
+        <w:tc>
+          <w:tcPr>
+            <w:tcW w:w="1908" w:type="dxa"/>
+          </w:tcPr>
+          <w:p>
+            <w:pPr>
+              <w:jc w:val="center"/>
+              <w:rPr>
+                <w:rFonts w:hint="eastAsia"/>
+              </w:rPr>
+            </w:pPr>
+            <w:r>
+              <w:rPr>
+                <w:noProof/>
+              </w:rPr>
+              <w:drawing>
+                <wp:inline distT="0" distB="0" distL="0" distR="0" wp14:anchorId="6EB3CA09" wp14:editId="025AC0A5">
+                  <wp:extent cx="530352" cy="707136"/>
+                  <wp:effectExtent l="0" t="0" r="0" b="0"/>
+                  <wp:docPr id="13" name="Picture 13"/>
+                  <wp:cNvGraphicFramePr>
+                    <a:graphicFrameLocks xmlns:a="http://schemas.openxmlformats.org/drawingml/2006/main" noChangeAspect="1"/>
+                  </wp:cNvGraphicFramePr>
+                  <a:graphic xmlns:a="http://schemas.openxmlformats.org/drawingml/2006/main">
+                    <a:graphicData uri="http://schemas.openxmlformats.org/drawingml/2006/picture">
+                      <pic:pic xmlns:pic="http://schemas.openxmlformats.org/drawingml/2006/picture">
+                        <pic:nvPicPr>
+                          <pic:cNvPr id="0" name="D.png"/>
+                          <pic:cNvPicPr/>
+                        </pic:nvPicPr>
+                        <pic:blipFill>
+                          <a:blip r:embed="rId21"/>
+                          <a:stretch>
+                            <a:fillRect/>
+                          </a:stretch>
+                        </pic:blipFill>
+                        <pic:spPr>
+                          <a:xfrm>
+                            <a:off x="0" y="0"/>
+                            <a:ext cx="530352" cy="707136"/>
+                          </a:xfrm>
+                          <a:prstGeom prst="rect">
+                            <a:avLst/>
+                          </a:prstGeom>
+                        </pic:spPr>
+                      </pic:pic>
+                    </a:graphicData>
+                  </a:graphic>
+                </wp:inline>
+              </w:drawing>
+            </w:r>
+          </w:p>
+        </w:tc>
+        <w:tc>
+          <w:tcPr>
+            <w:tcW w:w="1908" w:type="dxa"/>
+          </w:tcPr>
+          <w:p>
+            <w:pPr>
+              <w:jc w:val="center"/>
+              <w:rPr>
+                <w:rFonts w:hint="eastAsia"/>
+              </w:rPr>
+            </w:pPr>
+            <w:r>
+              <w:rPr>
+                <w:noProof/>
+              </w:rPr>
+              <w:drawing>
+                <wp:inline distT="0" distB="0" distL="0" distR="0" wp14:anchorId="6E9D39B4" wp14:editId="20BB9E57">
+                  <wp:extent cx="530352" cy="707136"/>
+                  <wp:effectExtent l="0" t="0" r="0" b="0"/>
+                  <wp:docPr id="14" name="Picture 14"/>
+                  <wp:cNvGraphicFramePr>
+                    <a:graphicFrameLocks xmlns:a="http://schemas.openxmlformats.org/drawingml/2006/main" noChangeAspect="1"/>
+                  </wp:cNvGraphicFramePr>
+                  <a:graphic xmlns:a="http://schemas.openxmlformats.org/drawingml/2006/main">
+                    <a:graphicData uri="http://schemas.openxmlformats.org/drawingml/2006/picture">
+                      <pic:pic xmlns:pic="http://schemas.openxmlformats.org/drawingml/2006/picture">
+                        <pic:nvPicPr>
+                          <pic:cNvPr id="0" name="Dsharp7.png"/>
+                          <pic:cNvPicPr/>
+                        </pic:nvPicPr>
+                        <pic:blipFill>
+                          <a:blip r:embed="rId22"/>
+                          <a:stretch>
+                            <a:fillRect/>
+                          </a:stretch>
+                        </pic:blipFill>
+                        <pic:spPr>
+                          <a:xfrm>
+                            <a:off x="0" y="0"/>
+                            <a:ext cx="530352" cy="707136"/>
+                          </a:xfrm>
+                          <a:prstGeom prst="rect">
+                            <a:avLst/>
+                          </a:prstGeom>
+                        </pic:spPr>
+                      </pic:pic>
+                    </a:graphicData>
+                  </a:graphic>
+                </wp:inline>
+              </w:drawing>
+            </w:r>
+          </w:p>
+        </w:tc>
+        <w:tc>
+          <w:tcPr>
+            <w:tcW w:w="1908" w:type="dxa"/>
+          </w:tcPr>
+          <w:p>
+            <w:pPr>
+              <w:jc w:val="center"/>
+              <w:rPr>
+                <w:rFonts w:hint="eastAsia"/>
+              </w:rPr>
+            </w:pPr>
+            <w:r>
+              <w:rPr>
+                <w:noProof/>
+              </w:rPr>
+              <w:drawing>
+                <wp:inline distT="0" distB="0" distL="0" distR="0" wp14:anchorId="58B62208" wp14:editId="5E44701C">
+                  <wp:extent cx="530352" cy="707136"/>
+                  <wp:effectExtent l="0" t="0" r="0" b="0"/>
+                  <wp:docPr id="15" name="Picture 15"/>
+                  <wp:cNvGraphicFramePr>
+                    <a:graphicFrameLocks xmlns:a="http://schemas.openxmlformats.org/drawingml/2006/main" noChangeAspect="1"/>
+                  </wp:cNvGraphicFramePr>
+                  <a:graphic xmlns:a="http://schemas.openxmlformats.org/drawingml/2006/main">
+                    <a:graphicData uri="http://schemas.openxmlformats.org/drawingml/2006/picture">
+                      <pic:pic xmlns:pic="http://schemas.openxmlformats.org/drawingml/2006/picture">
+                        <pic:nvPicPr>
+                          <pic:cNvPr id="0" name="D4.png"/>
+                          <pic:cNvPicPr/>
+                        </pic:nvPicPr>
+                        <pic:blipFill>
+                          <a:blip r:embed="rId23"/>
+                          <a:stretch>
+                            <a:fillRect/>
+                          </a:stretch>
+                        </pic:blipFill>
+                        <pic:spPr>
+                          <a:xfrm>
+                            <a:off x="0" y="0"/>
+                            <a:ext cx="530352" cy="707136"/>
+                          </a:xfrm>
+                          <a:prstGeom prst="rect">
+                            <a:avLst/>
+                          </a:prstGeom>
+                        </pic:spPr>
+                      </pic:pic>
+                    </a:graphicData>
+                  </a:graphic>
+                </wp:inline>
+              </w:drawing>
+            </w:r>
+          </w:p>
+        </w:tc>
+        <w:tc>
+          <w:tcPr>
+            <w:tcW w:w="1908" w:type="dxa"/>
+          </w:tcPr>
+          <w:p>
+            <w:pPr>
+              <w:jc w:val="center"/>
+              <w:rPr>
+                <w:rFonts w:hint="eastAsia"/>
+              </w:rPr>
+            </w:pPr>
+            <w:r>
+              <w:rPr>
+                <w:noProof/>
+              </w:rPr>
+              <w:drawing>
+                <wp:inline distT="0" distB="0" distL="0" distR="0" wp14:anchorId="028DCEE6" wp14:editId="1546F02D">
+                  <wp:extent cx="530352" cy="707136"/>
+                  <wp:effectExtent l="0" t="0" r="0" b="0"/>
+                  <wp:docPr id="16" name="Picture 16"/>
+                  <wp:cNvGraphicFramePr>
+                    <a:graphicFrameLocks xmlns:a="http://schemas.openxmlformats.org/drawingml/2006/main" noChangeAspect="1"/>
+                  </wp:cNvGraphicFramePr>
+                  <a:graphic xmlns:a="http://schemas.openxmlformats.org/drawingml/2006/main">
+                    <a:graphicData uri="http://schemas.openxmlformats.org/drawingml/2006/picture">
+                      <pic:pic xmlns:pic="http://schemas.openxmlformats.org/drawingml/2006/picture">
+                        <pic:nvPicPr>
+                          <pic:cNvPr id="0" name="E.png"/>
+                          <pic:cNvPicPr/>
+                        </pic:nvPicPr>
+                        <pic:blipFill>
+                          <a:blip r:embed="rId24"/>
+                          <a:stretch>
+                            <a:fillRect/>
+                          </a:stretch>
+                        </pic:blipFill>
+                        <pic:spPr>
+                          <a:xfrm>
+                            <a:off x="0" y="0"/>
+                            <a:ext cx="530352" cy="707136"/>
+                          </a:xfrm>
+                          <a:prstGeom prst="rect">
+                            <a:avLst/>
+                          </a:prstGeom>
+                        </pic:spPr>
+                      </pic:pic>
+                    </a:graphicData>
+                  </a:graphic>
+                </wp:inline>
+              </w:drawing>
+            </w:r>
+          </w:p>
+        </w:tc>
+        <w:tc>
+          <w:tcPr>
+            <w:tcW w:w="1908" w:type="dxa"/>
+          </w:tcPr>
+          <w:p>
+            <w:pPr>
+              <w:jc w:val="center"/>
+              <w:rPr>
+                <w:rFonts w:hint="eastAsia"/>
+              </w:rPr>
+            </w:pPr>
+            <w:r>
+              <w:rPr>
+                <w:noProof/>
+              </w:rPr>
+              <w:drawing>
+                <wp:inline distT="0" distB="0" distL="0" distR="0" wp14:anchorId="5D789EAD" wp14:editId="776C49C1">
+                  <wp:extent cx="530352" cy="707136"/>
+                  <wp:effectExtent l="0" t="0" r="0" b="0"/>
+                  <wp:docPr id="17" name="Picture 17"/>
+                  <wp:cNvGraphicFramePr>
+                    <a:graphicFrameLocks xmlns:a="http://schemas.openxmlformats.org/drawingml/2006/main" noChangeAspect="1"/>
+                  </wp:cNvGraphicFramePr>
+                  <a:graphic xmlns:a="http://schemas.openxmlformats.org/drawingml/2006/main">
+                    <a:graphicData uri="http://schemas.openxmlformats.org/drawingml/2006/picture">
+                      <pic:pic xmlns:pic="http://schemas.openxmlformats.org/drawingml/2006/picture">
+                        <pic:nvPicPr>
+                          <pic:cNvPr id="0" name="E_Fsharp.png"/>
+                          <pic:cNvPicPr/>
+                        </pic:nvPicPr>
+                        <pic:blipFill>
+                          <a:blip r:embed="rId25"/>
+                          <a:stretch>
+                            <a:fillRect/>
+                          </a:stretch>
+                        </pic:blipFill>
+                        <pic:spPr>
+                          <a:xfrm>
+                            <a:off x="0" y="0"/>
+                            <a:ext cx="530352" cy="707136"/>
+                          </a:xfrm>
+                          <a:prstGeom prst="rect">
+                            <a:avLst/>
+                          </a:prstGeom>
+                        </pic:spPr>
+                      </pic:pic>
+                    </a:graphicData>
+                  </a:graphic>
+                </wp:inline>
+              </w:drawing>
+            </w:r>
+          </w:p>
+        </w:tc>
+        <w:tc>
+          <w:tcPr>
+            <w:tcW w:w="1908" w:type="dxa"/>
+          </w:tcPr>
+          <w:p>
+            <w:pPr>
+              <w:jc w:val="center"/>
+              <w:rPr>
+                <w:rFonts w:hint="eastAsia"/>
+              </w:rPr>
+            </w:pPr>
+            <w:r>
+              <w:rPr>
+                <w:noProof/>
+              </w:rPr>
+              <w:drawing>
+                <wp:inline distT="0" distB="0" distL="0" distR="0" wp14:anchorId="10567B6F" wp14:editId="60CA10C9">
+                  <wp:extent cx="530352" cy="707136"/>
+                  <wp:effectExtent l="0" t="0" r="0" b="0"/>
+                  <wp:docPr id="18" name="Picture 18"/>
+                  <wp:cNvGraphicFramePr>
+                    <a:graphicFrameLocks xmlns:a="http://schemas.openxmlformats.org/drawingml/2006/main" noChangeAspect="1"/>
+                  </wp:cNvGraphicFramePr>
+                  <a:graphic xmlns:a="http://schemas.openxmlformats.org/drawingml/2006/main">
+                    <a:graphicData uri="http://schemas.openxmlformats.org/drawingml/2006/picture">
+                      <pic:pic xmlns:pic="http://schemas.openxmlformats.org/drawingml/2006/picture">
+                        <pic:nvPicPr>
+                          <pic:cNvPr id="0" name="E_Gsharp.png"/>
+                          <pic:cNvPicPr/>
+                        </pic:nvPicPr>
+                        <pic:blipFill>
+                          <a:blip r:embed="rId26"/>
+                          <a:stretch>
+                            <a:fillRect/>
+                          </a:stretch>
+                        </pic:blipFill>
+                        <pic:spPr>
+                          <a:xfrm>
+                            <a:off x="0" y="0"/>
+                            <a:ext cx="530352" cy="707136"/>
+                          </a:xfrm>
+                          <a:prstGeom prst="rect">
+                            <a:avLst/>
+                          </a:prstGeom>
+                        </pic:spPr>
+                      </pic:pic>
+                    </a:graphicData>
+                  </a:graphic>
+                </wp:inline>
+              </w:drawing>
+            </w:r>
+          </w:p>
+        </w:tc>
+      </w:tr>
+      <w:tr>
+        <w:tc>
+          <w:tcPr>
+            <w:tcW w:w="1908" w:type="dxa"/>
+          </w:tcPr>
+          <w:p>
+            <w:pPr>
+              <w:jc w:val="center"/>
+              <w:rPr>
+                <w:rFonts w:hint="eastAsia"/>
+              </w:rPr>
+            </w:pPr>
+            <w:r>
+              <w:rPr>
+                <w:noProof/>
+              </w:rPr>
+              <w:lastRenderedPageBreak/>
+              <w:drawing>
+                <wp:inline distT="0" distB="0" distL="0" distR="0" wp14:anchorId="42F2E974" wp14:editId="7BF2D955">
+                  <wp:extent cx="530352" cy="707136"/>
+                  <wp:effectExtent l="0" t="0" r="0" b="0"/>
+                  <wp:docPr id="19" name="Picture 19"/>
+                  <wp:cNvGraphicFramePr>
+                    <a:graphicFrameLocks xmlns:a="http://schemas.openxmlformats.org/drawingml/2006/main" noChangeAspect="1"/>
+                  </wp:cNvGraphicFramePr>
+                  <a:graphic xmlns:a="http://schemas.openxmlformats.org/drawingml/2006/main">
+                    <a:graphicData uri="http://schemas.openxmlformats.org/drawingml/2006/picture">
+                      <pic:pic xmlns:pic="http://schemas.openxmlformats.org/drawingml/2006/picture">
+                        <pic:nvPicPr>
+                          <pic:cNvPr id="0" name="E4.png"/>
+                          <pic:cNvPicPr/>
+                        </pic:nvPicPr>
+                        <pic:blipFill>
+                          <a:blip r:embed="rId27"/>
+                          <a:stretch>
+                            <a:fillRect/>
+                          </a:stretch>
+                        </pic:blipFill>
+                        <pic:spPr>
+                          <a:xfrm>
+                            <a:off x="0" y="0"/>
+                            <a:ext cx="530352" cy="707136"/>
+                          </a:xfrm>
+                          <a:prstGeom prst="rect">
+                            <a:avLst/>
+                          </a:prstGeom>
+                        </pic:spPr>
+                      </pic:pic>
+                    </a:graphicData>
+                  </a:graphic>
+                </wp:inline>
+              </w:drawing>
+            </w:r>
+          </w:p>
+        </w:tc>
+        <w:tc>
+          <w:tcPr>
+            <w:tcW w:w="1908" w:type="dxa"/>
+          </w:tcPr>
+          <w:p>
+            <w:pPr>
+              <w:jc w:val="center"/>
+              <w:rPr>
+                <w:rFonts w:hint="eastAsia"/>
+              </w:rPr>
+            </w:pPr>
+            <w:r>
+              <w:rPr>
+                <w:noProof/>
+              </w:rPr>
+              <w:drawing>
+                <wp:inline distT="0" distB="0" distL="0" distR="0" wp14:anchorId="2E889C0C" wp14:editId="49D7501A">
+                  <wp:extent cx="530352" cy="707136"/>
+                  <wp:effectExtent l="0" t="0" r="0" b="0"/>
+                  <wp:docPr id="20" name="Picture 20"/>
+                  <wp:cNvGraphicFramePr>
+                    <a:graphicFrameLocks xmlns:a="http://schemas.openxmlformats.org/drawingml/2006/main" noChangeAspect="1"/>
+                  </wp:cNvGraphicFramePr>
+                  <a:graphic xmlns:a="http://schemas.openxmlformats.org/drawingml/2006/main">
+                    <a:graphicData uri="http://schemas.openxmlformats.org/drawingml/2006/picture">
+                      <pic:pic xmlns:pic="http://schemas.openxmlformats.org/drawingml/2006/picture">
+                        <pic:nvPicPr>
+                          <pic:cNvPr id="0" name="E6.png"/>
+                          <pic:cNvPicPr/>
+                        </pic:nvPicPr>
+                        <pic:blipFill>
+                          <a:blip r:embed="rId28"/>
+                          <a:stretch>
+                            <a:fillRect/>
+                          </a:stretch>
+                        </pic:blipFill>
+                        <pic:spPr>
+                          <a:xfrm>
+                            <a:off x="0" y="0"/>
+                            <a:ext cx="530352" cy="707136"/>
+                          </a:xfrm>
+                          <a:prstGeom prst="rect">
+                            <a:avLst/>
+                          </a:prstGeom>
+                        </pic:spPr>
+                      </pic:pic>
+                    </a:graphicData>
+                  </a:graphic>
+                </wp:inline>
+              </w:drawing>
+            </w:r>
+          </w:p>
+        </w:tc>
+        <w:tc>
+          <w:tcPr>
+            <w:tcW w:w="1908" w:type="dxa"/>
+          </w:tcPr>
+          <w:p>
+            <w:pPr>
+              <w:jc w:val="center"/>
+              <w:rPr>
+                <w:rFonts w:hint="eastAsia"/>
+              </w:rPr>
+            </w:pPr>
+            <w:r>
+              <w:rPr>
+                <w:noProof/>
+              </w:rPr>
+              <w:drawing>
+                <wp:inline distT="0" distB="0" distL="0" distR="0" wp14:anchorId="6428C3D2" wp14:editId="0AED28FB">
+                  <wp:extent cx="530352" cy="707136"/>
+                  <wp:effectExtent l="0" t="0" r="0" b="0"/>
+                  <wp:docPr id="21" name="Picture 21"/>
+                  <wp:cNvGraphicFramePr>
+                    <a:graphicFrameLocks xmlns:a="http://schemas.openxmlformats.org/drawingml/2006/main" noChangeAspect="1"/>
+                  </wp:cNvGraphicFramePr>
+                  <a:graphic xmlns:a="http://schemas.openxmlformats.org/drawingml/2006/main">
+                    <a:graphicData uri="http://schemas.openxmlformats.org/drawingml/2006/picture">
+                      <pic:pic xmlns:pic="http://schemas.openxmlformats.org/drawingml/2006/picture">
+                        <pic:nvPicPr>
+                          <pic:cNvPr id="0" name="E7.png"/>
+                          <pic:cNvPicPr/>
+                        </pic:nvPicPr>
+                        <pic:blipFill>
+                          <a:blip r:embed="rId29"/>
+                          <a:stretch>
+                            <a:fillRect/>
+                          </a:stretch>
+                        </pic:blipFill>
+                        <pic:spPr>
+                          <a:xfrm>
+                            <a:off x="0" y="0"/>
+                            <a:ext cx="530352" cy="707136"/>
+                          </a:xfrm>
+                          <a:prstGeom prst="rect">
+                            <a:avLst/>
+                          </a:prstGeom>
+                        </pic:spPr>
+                      </pic:pic>
+                    </a:graphicData>
+                  </a:graphic>
+                </wp:inline>
+              </w:drawing>
+            </w:r>
+          </w:p>
+        </w:tc>
+        <w:tc>
+          <w:tcPr>
+            <w:tcW w:w="1908" w:type="dxa"/>
+          </w:tcPr>
+          <w:p>
+            <w:pPr>
+              <w:jc w:val="center"/>
+              <w:rPr>
+                <w:rFonts w:hint="eastAsia"/>
+              </w:rPr>
+            </w:pPr>
+            <w:r>
+              <w:rPr>
+                <w:noProof/>
+              </w:rPr>
+              <w:drawing>
+                <wp:inline distT="0" distB="0" distL="0" distR="0" wp14:anchorId="4749E8EB" wp14:editId="79796100">
+                  <wp:extent cx="530352" cy="707136"/>
+                  <wp:effectExtent l="0" t="0" r="0" b="0"/>
+                  <wp:docPr id="22" name="Picture 22"/>
+                  <wp:cNvGraphicFramePr>
+                    <a:graphicFrameLocks xmlns:a="http://schemas.openxmlformats.org/drawingml/2006/main" noChangeAspect="1"/>
+                  </wp:cNvGraphicFramePr>
+                  <a:graphic xmlns:a="http://schemas.openxmlformats.org/drawingml/2006/main">
+                    <a:graphicData uri="http://schemas.openxmlformats.org/drawingml/2006/picture">
+                      <pic:pic xmlns:pic="http://schemas.openxmlformats.org/drawingml/2006/picture">
+                        <pic:nvPicPr>
+                          <pic:cNvPr id="0" name="Fsharp.png"/>
+                          <pic:cNvPicPr/>
+                        </pic:nvPicPr>
+                        <pic:blipFill>
+                          <a:blip r:embed="rId30"/>
+                          <a:stretch>
+                            <a:fillRect/>
+                          </a:stretch>
+                        </pic:blipFill>
+                        <pic:spPr>
+                          <a:xfrm>
+                            <a:off x="0" y="0"/>
+                            <a:ext cx="530352" cy="707136"/>
+                          </a:xfrm>
+                          <a:prstGeom prst="rect">
+                            <a:avLst/>
+                          </a:prstGeom>
+                        </pic:spPr>
+                      </pic:pic>
+                    </a:graphicData>
+                  </a:graphic>
+                </wp:inline>
+              </w:drawing>
+            </w:r>
+          </w:p>
+        </w:tc>
+        <w:tc>
+          <w:tcPr>
+            <w:tcW w:w="1908" w:type="dxa"/>
+          </w:tcPr>
+          <w:p>
+            <w:pPr>
+              <w:jc w:val="center"/>
+              <w:rPr>
+                <w:rFonts w:hint="eastAsia"/>
+              </w:rPr>
+            </w:pPr>
+            <w:r>
+              <w:rPr>
+                <w:noProof/>
+              </w:rPr>
+              <w:drawing>
+                <wp:inline distT="0" distB="0" distL="0" distR="0" wp14:anchorId="408B30D7" wp14:editId="36DD7B0D">
+                  <wp:extent cx="530352" cy="707136"/>
+                  <wp:effectExtent l="0" t="0" r="0" b="0"/>
+                  <wp:docPr id="23" name="Picture 23"/>
+                  <wp:cNvGraphicFramePr>
+                    <a:graphicFrameLocks xmlns:a="http://schemas.openxmlformats.org/drawingml/2006/main" noChangeAspect="1"/>
+                  </wp:cNvGraphicFramePr>
+                  <a:graphic xmlns:a="http://schemas.openxmlformats.org/drawingml/2006/main">
+                    <a:graphicData uri="http://schemas.openxmlformats.org/drawingml/2006/picture">
+                      <pic:pic xmlns:pic="http://schemas.openxmlformats.org/drawingml/2006/picture">
+                        <pic:nvPicPr>
+                          <pic:cNvPr id="0" name="Fsharp_Csharp.png"/>
+                          <pic:cNvPicPr/>
+                        </pic:nvPicPr>
+                        <pic:blipFill>
+                          <a:blip r:embed="rId31"/>
+                          <a:stretch>
+                            <a:fillRect/>
+                          </a:stretch>
+                        </pic:blipFill>
+                        <pic:spPr>
+                          <a:xfrm>
+                            <a:off x="0" y="0"/>
+                            <a:ext cx="530352" cy="707136"/>
+                          </a:xfrm>
+                          <a:prstGeom prst="rect">
+                            <a:avLst/>
+                          </a:prstGeom>
+                        </pic:spPr>
+                      </pic:pic>
+                    </a:graphicData>
+                  </a:graphic>
+                </wp:inline>
+              </w:drawing>
+            </w:r>
+          </w:p>
+        </w:tc>
+        <w:tc>
+          <w:tcPr>
+            <w:tcW w:w="1908" w:type="dxa"/>
+          </w:tcPr>
+          <w:p>
+            <w:pPr>
+              <w:jc w:val="center"/>
+              <w:rPr>
+                <w:rFonts w:hint="eastAsia"/>
+              </w:rPr>
+            </w:pPr>
+            <w:r>
+              <w:rPr>
+                <w:noProof/>
+              </w:rPr>
+              <w:drawing>
+                <wp:inline distT="0" distB="0" distL="0" distR="0" wp14:anchorId="69C67E7B" wp14:editId="7EEF2FF0">
+                  <wp:extent cx="530352" cy="707136"/>
+                  <wp:effectExtent l="0" t="0" r="0" b="0"/>
+                  <wp:docPr id="24" name="Picture 24"/>
+                  <wp:cNvGraphicFramePr>
+                    <a:graphicFrameLocks xmlns:a="http://schemas.openxmlformats.org/drawingml/2006/main" noChangeAspect="1"/>
+                  </wp:cNvGraphicFramePr>
+                  <a:graphic xmlns:a="http://schemas.openxmlformats.org/drawingml/2006/main">
+                    <a:graphicData uri="http://schemas.openxmlformats.org/drawingml/2006/picture">
+                      <pic:pic xmlns:pic="http://schemas.openxmlformats.org/drawingml/2006/picture">
+                        <pic:nvPicPr>
+                          <pic:cNvPr id="0" name="Fsharp4.png"/>
+                          <pic:cNvPicPr/>
+                        </pic:nvPicPr>
+                        <pic:blipFill>
+                          <a:blip r:embed="rId32"/>
+                          <a:stretch>
+                            <a:fillRect/>
+                          </a:stretch>
+                        </pic:blipFill>
+                        <pic:spPr>
+                          <a:xfrm>
+                            <a:off x="0" y="0"/>
+                            <a:ext cx="530352" cy="707136"/>
+                          </a:xfrm>
+                          <a:prstGeom prst="rect">
+                            <a:avLst/>
+                          </a:prstGeom>
+                        </pic:spPr>
+                      </pic:pic>
+                    </a:graphicData>
+                  </a:graphic>
+                </wp:inline>
+              </w:drawing>
+            </w:r>
+          </w:p>
+        </w:tc>
+      </w:tr>
+      <w:tr>
+        <w:tc>
+          <w:tcPr>
+            <w:tcW w:w="1908" w:type="dxa"/>
+          </w:tcPr>
+          <w:p>
+            <w:pPr>
+              <w:jc w:val="center"/>
+              <w:rPr>
+                <w:rFonts w:hint="eastAsia"/>
+              </w:rPr>
+            </w:pPr>
+            <w:r>
+              <w:rPr>
+                <w:noProof/>
+              </w:rPr>
+              <w:drawing>
+                <wp:inline distT="0" distB="0" distL="0" distR="0" wp14:anchorId="390F02AC" wp14:editId="0FE65D53">
+                  <wp:extent cx="530352" cy="707136"/>
+                  <wp:effectExtent l="0" t="0" r="0" b="0"/>
+                  <wp:docPr id="25" name="Picture 25"/>
+                  <wp:cNvGraphicFramePr>
+                    <a:graphicFrameLocks xmlns:a="http://schemas.openxmlformats.org/drawingml/2006/main" noChangeAspect="1"/>
+                  </wp:cNvGraphicFramePr>
+                  <a:graphic xmlns:a="http://schemas.openxmlformats.org/drawingml/2006/main">
+                    <a:graphicData uri="http://schemas.openxmlformats.org/drawingml/2006/picture">
+                      <pic:pic xmlns:pic="http://schemas.openxmlformats.org/drawingml/2006/picture">
+                        <pic:nvPicPr>
+                          <pic:cNvPr id="0" name="Fsharp7.png"/>
+                          <pic:cNvPicPr/>
+                        </pic:nvPicPr>
+                        <pic:blipFill>
+                          <a:blip r:embed="rId33"/>
+                          <a:stretch>
+                            <a:fillRect/>
+                          </a:stretch>
+                        </pic:blipFill>
+                        <pic:spPr>
+                          <a:xfrm>
+                            <a:off x="0" y="0"/>
+                            <a:ext cx="530352" cy="707136"/>
+                          </a:xfrm>
+                          <a:prstGeom prst="rect">
+                            <a:avLst/>
+                          </a:prstGeom>
+                        </pic:spPr>
+                      </pic:pic>
+                    </a:graphicData>
+                  </a:graphic>
+                </wp:inline>
+              </w:drawing>
+            </w:r>
+          </w:p>
+        </w:tc>
+        <w:tc>
+          <w:tcPr>
+            <w:tcW w:w="1908" w:type="dxa"/>
+          </w:tcPr>
+          <w:p>
+            <w:pPr>
+              <w:jc w:val="center"/>
+              <w:rPr>
+                <w:rFonts w:hint="eastAsia"/>
+              </w:rPr>
+            </w:pPr>
+            <w:r>
+              <w:rPr>
+                <w:noProof/>
+              </w:rPr>
+              <w:drawing>
+                <wp:inline distT="0" distB="0" distL="0" distR="0" wp14:anchorId="1396EEA7" wp14:editId="204E4AAC">
+                  <wp:extent cx="530352" cy="707136"/>
+                  <wp:effectExtent l="0" t="0" r="0" b="0"/>
+                  <wp:docPr id="26" name="Picture 26"/>
+                  <wp:cNvGraphicFramePr>
+                    <a:graphicFrameLocks xmlns:a="http://schemas.openxmlformats.org/drawingml/2006/main" noChangeAspect="1"/>
+                  </wp:cNvGraphicFramePr>
+                  <a:graphic xmlns:a="http://schemas.openxmlformats.org/drawingml/2006/main">
+                    <a:graphicData uri="http://schemas.openxmlformats.org/drawingml/2006/picture">
+                      <pic:pic xmlns:pic="http://schemas.openxmlformats.org/drawingml/2006/picture">
+                        <pic:nvPicPr>
+                          <pic:cNvPr id="0" name="Fsharp7_Asharp.png"/>
+                          <pic:cNvPicPr/>
+                        </pic:nvPicPr>
+                        <pic:blipFill>
+                          <a:blip r:embed="rId34"/>
+                          <a:stretch>
+                            <a:fillRect/>
+                          </a:stretch>
+                        </pic:blipFill>
+                        <pic:spPr>
+                          <a:xfrm>
+                            <a:off x="0" y="0"/>
+                            <a:ext cx="530352" cy="707136"/>
+                          </a:xfrm>
+                          <a:prstGeom prst="rect">
+                            <a:avLst/>
+                          </a:prstGeom>
+                        </pic:spPr>
+                      </pic:pic>
+                    </a:graphicData>
+                  </a:graphic>
+                </wp:inline>
+              </w:drawing>
+            </w:r>
+          </w:p>
+        </w:tc>
+        <w:tc>
+          <w:tcPr>
+            <w:tcW w:w="1908" w:type="dxa"/>
+          </w:tcPr>
+          <w:p>
+            <w:pPr>
+              <w:jc w:val="center"/>
+              <w:rPr>
+                <w:rFonts w:hint="eastAsia"/>
+              </w:rPr>
+            </w:pPr>
+            <w:r>
+              <w:rPr>
+                <w:noProof/>
+              </w:rPr>
+              <w:drawing>
+                <wp:inline distT="0" distB="0" distL="0" distR="0" wp14:anchorId="76935F54" wp14:editId="0EBD1839">
+                  <wp:extent cx="530352" cy="707136"/>
+                  <wp:effectExtent l="0" t="0" r="0" b="0"/>
+                  <wp:docPr id="27" name="Picture 27"/>
+                  <wp:cNvGraphicFramePr>
+                    <a:graphicFrameLocks xmlns:a="http://schemas.openxmlformats.org/drawingml/2006/main" noChangeAspect="1"/>
+                  </wp:cNvGraphicFramePr>
+                  <a:graphic xmlns:a="http://schemas.openxmlformats.org/drawingml/2006/main">
+                    <a:graphicData uri="http://schemas.openxmlformats.org/drawingml/2006/picture">
+                      <pic:pic xmlns:pic="http://schemas.openxmlformats.org/drawingml/2006/picture">
+                        <pic:nvPicPr>
+                          <pic:cNvPr id="0" name="Fsharpm7.png"/>
+                          <pic:cNvPicPr/>
+                        </pic:nvPicPr>
+                        <pic:blipFill>
+                          <a:blip r:embed="rId35"/>
+                          <a:stretch>
+                            <a:fillRect/>
+                          </a:stretch>
+                        </pic:blipFill>
+                        <pic:spPr>
+                          <a:xfrm>
+                            <a:off x="0" y="0"/>
+                            <a:ext cx="530352" cy="707136"/>
+                          </a:xfrm>
+                          <a:prstGeom prst="rect">
+                            <a:avLst/>
+                          </a:prstGeom>
+                        </pic:spPr>
+                      </pic:pic>
+                    </a:graphicData>
+                  </a:graphic>
+                </wp:inline>
+              </w:drawing>
+            </w:r>
+          </w:p>
+        </w:tc>
+        <w:tc>
+          <w:tcPr>
+            <w:tcW w:w="1908" w:type="dxa"/>
+          </w:tcPr>
+          <w:p>
+            <w:pPr>
+              <w:jc w:val="center"/>
+              <w:rPr>
+                <w:rFonts w:hint="eastAsia"/>
+              </w:rPr>
+            </w:pPr>
+            <w:r>
+              <w:rPr>
+                <w:noProof/>
+              </w:rPr>
+              <w:drawing>
+                <wp:inline distT="0" distB="0" distL="0" distR="0" wp14:anchorId="0756FC2E" wp14:editId="2F153067">
+                  <wp:extent cx="530352" cy="707136"/>
+                  <wp:effectExtent l="0" t="0" r="0" b="0"/>
+                  <wp:docPr id="28" name="Picture 28"/>
+                  <wp:cNvGraphicFramePr>
+                    <a:graphicFrameLocks xmlns:a="http://schemas.openxmlformats.org/drawingml/2006/main" noChangeAspect="1"/>
+                  </wp:cNvGraphicFramePr>
+                  <a:graphic xmlns:a="http://schemas.openxmlformats.org/drawingml/2006/main">
+                    <a:graphicData uri="http://schemas.openxmlformats.org/drawingml/2006/picture">
+                      <pic:pic xmlns:pic="http://schemas.openxmlformats.org/drawingml/2006/picture">
+                        <pic:nvPicPr>
+                          <pic:cNvPr id="0" name="Gsharpm7.png"/>
+                          <pic:cNvPicPr/>
+                        </pic:nvPicPr>
+                        <pic:blipFill>
+                          <a:blip r:embed="rId36"/>
+                          <a:stretch>
+                            <a:fillRect/>
+                          </a:stretch>
+                        </pic:blipFill>
+                        <pic:spPr>
+                          <a:xfrm>
+                            <a:off x="0" y="0"/>
+                            <a:ext cx="530352" cy="707136"/>
+                          </a:xfrm>
+                          <a:prstGeom prst="rect">
+                            <a:avLst/>
+                          </a:prstGeom>
+                        </pic:spPr>
+                      </pic:pic>
+                    </a:graphicData>
+                  </a:graphic>
+                </wp:inline>
+              </w:drawing>
+            </w:r>
+          </w:p>
+        </w:tc>
+        <w:tc>
+          <w:tcPr>
+            <w:tcW w:w="1908" w:type="dxa"/>
+          </w:tcPr>
+          <w:p>
+            <w:pPr>
+              <w:jc w:val="center"/>
+              <w:rPr>
+                <w:rFonts w:hint="eastAsia"/>
+              </w:rPr>
+            </w:pPr>
+            <w:r>
+              <w:rPr>
+                <w:noProof/>
+              </w:rPr>
+              <w:drawing>
+                <wp:inline distT="0" distB="0" distL="0" distR="0" wp14:anchorId="5AEEA207" wp14:editId="0FCAD2BE">
+                  <wp:extent cx="530352" cy="707136"/>
+                  <wp:effectExtent l="0" t="0" r="0" b="0"/>
+                  <wp:docPr id="29" name="Picture 29"/>
+                  <wp:cNvGraphicFramePr>
+                    <a:graphicFrameLocks xmlns:a="http://schemas.openxmlformats.org/drawingml/2006/main" noChangeAspect="1"/>
+                  </wp:cNvGraphicFramePr>
+                  <a:graphic xmlns:a="http://schemas.openxmlformats.org/drawingml/2006/main">
+                    <a:graphicData uri="http://schemas.openxmlformats.org/drawingml/2006/picture">
+                      <pic:pic xmlns:pic="http://schemas.openxmlformats.org/drawingml/2006/picture">
+                        <pic:nvPicPr>
+                          <pic:cNvPr id="0" name="G_A.png"/>
+                          <pic:cNvPicPr/>
+                        </pic:nvPicPr>
+                        <pic:blipFill>
+                          <a:blip r:embed="rId37"/>
+                          <a:stretch>
+                            <a:fillRect/>
+                          </a:stretch>
+                        </pic:blipFill>
+                        <pic:spPr>
+                          <a:xfrm>
+                            <a:off x="0" y="0"/>
+                            <a:ext cx="530352" cy="707136"/>
+                          </a:xfrm>
+                          <a:prstGeom prst="rect">
+                            <a:avLst/>
+                          </a:prstGeom>
+                        </pic:spPr>
+                      </pic:pic>
+                    </a:graphicData>
+                  </a:graphic>
+                </wp:inline>
+              </w:drawing>
+            </w:r>
+          </w:p>
+        </w:tc>
+        <w:tc>
+          <w:tcPr>
+            <w:tcW w:w="1908" w:type="dxa"/>
+          </w:tcPr>
+          <w:p>
+            <w:pPr>
+              <w:rPr>
+                <w:rFonts w:hint="eastAsia"/>
+              </w:rPr>
+            </w:pPr>
           </w:p>
         </w:tc>
       </w:tr>
@@ -2006,31 +4392,31 @@
       </w:rPr>
     </w:lvl>
   </w:abstractNum>
-  <w:num w:numId="1" w16cid:durableId="1209806675">
+  <w:num w:numId="1" w16cid:durableId="1144590059">
     <w:abstractNumId w:val="8"/>
   </w:num>
-  <w:num w:numId="2" w16cid:durableId="1421753450">
+  <w:num w:numId="2" w16cid:durableId="415983734">
     <w:abstractNumId w:val="6"/>
   </w:num>
-  <w:num w:numId="3" w16cid:durableId="1833138589">
+  <w:num w:numId="3" w16cid:durableId="803079121">
     <w:abstractNumId w:val="5"/>
   </w:num>
-  <w:num w:numId="4" w16cid:durableId="27605005">
+  <w:num w:numId="4" w16cid:durableId="283389432">
     <w:abstractNumId w:val="4"/>
   </w:num>
-  <w:num w:numId="5" w16cid:durableId="377828026">
+  <w:num w:numId="5" w16cid:durableId="1479498770">
     <w:abstractNumId w:val="7"/>
   </w:num>
-  <w:num w:numId="6" w16cid:durableId="1329164964">
+  <w:num w:numId="6" w16cid:durableId="1753502706">
     <w:abstractNumId w:val="3"/>
   </w:num>
-  <w:num w:numId="7" w16cid:durableId="1762871570">
+  <w:num w:numId="7" w16cid:durableId="256600684">
     <w:abstractNumId w:val="2"/>
   </w:num>
-  <w:num w:numId="8" w16cid:durableId="1368068474">
+  <w:num w:numId="8" w16cid:durableId="79836535">
     <w:abstractNumId w:val="1"/>
   </w:num>
-  <w:num w:numId="9" w16cid:durableId="2117946483">
+  <w:num w:numId="9" w16cid:durableId="1663242571">
     <w:abstractNumId w:val="0"/>
   </w:num>
 </w:numbering>
@@ -13421,7 +15807,7 @@
     <w:autoRedefine/>
     <w:uiPriority w:val="39"/>
     <w:unhideWhenUsed/>
-    <w:rsid w:val="00AC31B7"/>
+    <w:rsid w:val="00722B5F"/>
     <w:pPr>
       <w:spacing w:after="100"/>
     </w:pPr>
@@ -13431,7 +15817,7 @@
     <w:basedOn w:val="Fontepargpadro"/>
     <w:uiPriority w:val="99"/>
     <w:unhideWhenUsed/>
-    <w:rsid w:val="00AC31B7"/>
+    <w:rsid w:val="00722B5F"/>
     <w:rPr>
       <w:color w:val="0000FF" w:themeColor="hyperlink"/>
       <w:u w:val="single"/>

</xml_diff>

<commit_message>
Fix COM error when updating TOC with Visible=False
</commit_message>
<xml_diff>
--- a/backend/Livreto.docx
+++ b/backend/Livreto.docx
@@ -45,7 +45,7 @@
       <w:pPr>
         <w:pStyle w:val="Ttulo1"/>
       </w:pPr>
-      <w:bookmarkStart w:id="0" w:name="_Toc224141971"/>
+      <w:bookmarkStart w:id="0" w:name="_Toc224142745"/>
       <w:r>
         <w:lastRenderedPageBreak/>
         <w:t>Sumário</w:t>
@@ -80,7 +80,7 @@
         </w:rPr>
         <w:fldChar w:fldCharType="separate"/>
       </w:r>
-      <w:hyperlink w:anchor="_Toc224141971" w:history="1">
+      <w:hyperlink w:anchor="_Toc224142745" w:history="1">
         <w:r>
           <w:rPr>
             <w:rStyle w:val="Hyperlink"/>
@@ -107,7 +107,7 @@
             <w:noProof/>
             <w:webHidden/>
           </w:rPr>
-          <w:instrText xml:space="preserve"> PAGEREF _Toc224141971 \h </w:instrText>
+          <w:instrText xml:space="preserve"> PAGEREF _Toc224142745 \h </w:instrText>
         </w:r>
         <w:r>
           <w:rPr>
@@ -154,7 +154,7 @@
           <w14:ligatures w14:val="standardContextual"/>
         </w:rPr>
       </w:pPr>
-      <w:hyperlink w:anchor="_Toc224141972" w:history="1">
+      <w:hyperlink w:anchor="_Toc224142746" w:history="1">
         <w:r>
           <w:rPr>
             <w:rStyle w:val="Hyperlink"/>
@@ -181,7 +181,7 @@
             <w:noProof/>
             <w:webHidden/>
           </w:rPr>
-          <w:instrText xml:space="preserve"> PAGEREF _Toc224141972 \h </w:instrText>
+          <w:instrText xml:space="preserve"> PAGEREF _Toc224142746 \h </w:instrText>
         </w:r>
         <w:r>
           <w:rPr>
@@ -228,7 +228,7 @@
           <w14:ligatures w14:val="standardContextual"/>
         </w:rPr>
       </w:pPr>
-      <w:hyperlink w:anchor="_Toc224141973" w:history="1">
+      <w:hyperlink w:anchor="_Toc224142747" w:history="1">
         <w:r>
           <w:rPr>
             <w:rStyle w:val="Hyperlink"/>
@@ -255,7 +255,7 @@
             <w:noProof/>
             <w:webHidden/>
           </w:rPr>
-          <w:instrText xml:space="preserve"> PAGEREF _Toc224141973 \h </w:instrText>
+          <w:instrText xml:space="preserve"> PAGEREF _Toc224142747 \h </w:instrText>
         </w:r>
         <w:r>
           <w:rPr>
@@ -325,7 +325,7 @@
         <w:pStyle w:val="Ttulo1"/>
         <w:spacing w:before="0" w:after="40"/>
       </w:pPr>
-      <w:bookmarkStart w:id="1" w:name="_Toc224141972"/>
+      <w:bookmarkStart w:id="1" w:name="_Toc224142746"/>
       <w:r>
         <w:lastRenderedPageBreak/>
         <w:t>Song 1 - Artist 1</w:t>
@@ -443,7 +443,7 @@
               </w:rPr>
               <w:lastRenderedPageBreak/>
               <w:drawing>
-                <wp:inline distT="0" distB="0" distL="0" distR="0" wp14:anchorId="78381E7C" wp14:editId="1BF663A6">
+                <wp:inline distT="0" distB="0" distL="0" distR="0" wp14:anchorId="5A1FDE91" wp14:editId="13AA5617">
                   <wp:extent cx="621792" cy="829056"/>
                   <wp:effectExtent l="0" t="0" r="0" b="0"/>
                   <wp:docPr id="1" name="Picture 1"/>
@@ -496,7 +496,7 @@
                 <w:noProof/>
               </w:rPr>
               <w:drawing>
-                <wp:inline distT="0" distB="0" distL="0" distR="0" wp14:anchorId="5659A0A9" wp14:editId="47754691">
+                <wp:inline distT="0" distB="0" distL="0" distR="0" wp14:anchorId="08B57C09" wp14:editId="35642A48">
                   <wp:extent cx="621792" cy="829056"/>
                   <wp:effectExtent l="0" t="0" r="0" b="0"/>
                   <wp:docPr id="2" name="Picture 2"/>
@@ -549,7 +549,7 @@
                 <w:noProof/>
               </w:rPr>
               <w:drawing>
-                <wp:inline distT="0" distB="0" distL="0" distR="0" wp14:anchorId="7920F3FA" wp14:editId="003CACB8">
+                <wp:inline distT="0" distB="0" distL="0" distR="0" wp14:anchorId="5EB6CACB" wp14:editId="258EC841">
                   <wp:extent cx="621792" cy="829056"/>
                   <wp:effectExtent l="0" t="0" r="0" b="0"/>
                   <wp:docPr id="3" name="Picture 3"/>
@@ -602,7 +602,7 @@
                 <w:noProof/>
               </w:rPr>
               <w:drawing>
-                <wp:inline distT="0" distB="0" distL="0" distR="0" wp14:anchorId="32BABBBA" wp14:editId="40C0A0D8">
+                <wp:inline distT="0" distB="0" distL="0" distR="0" wp14:anchorId="71A53EC6" wp14:editId="6B6637F9">
                   <wp:extent cx="621792" cy="829056"/>
                   <wp:effectExtent l="0" t="0" r="0" b="0"/>
                   <wp:docPr id="4" name="Picture 4"/>
@@ -659,7 +659,7 @@
         <w:pStyle w:val="Ttulo1"/>
         <w:spacing w:before="0" w:after="40"/>
       </w:pPr>
-      <w:bookmarkStart w:id="2" w:name="_Toc224141973"/>
+      <w:bookmarkStart w:id="2" w:name="_Toc224142747"/>
       <w:r>
         <w:lastRenderedPageBreak/>
         <w:t>Song 2 - Artist 2</w:t>
@@ -777,7 +777,7 @@
               </w:rPr>
               <w:lastRenderedPageBreak/>
               <w:drawing>
-                <wp:inline distT="0" distB="0" distL="0" distR="0" wp14:anchorId="38E75144" wp14:editId="1D256C88">
+                <wp:inline distT="0" distB="0" distL="0" distR="0" wp14:anchorId="4B7E4A03" wp14:editId="46EA26FD">
                   <wp:extent cx="621792" cy="829056"/>
                   <wp:effectExtent l="0" t="0" r="0" b="0"/>
                   <wp:docPr id="5" name="Picture 5"/>
@@ -830,7 +830,7 @@
                 <w:noProof/>
               </w:rPr>
               <w:drawing>
-                <wp:inline distT="0" distB="0" distL="0" distR="0" wp14:anchorId="3FC1542E" wp14:editId="76C73A14">
+                <wp:inline distT="0" distB="0" distL="0" distR="0" wp14:anchorId="1FE67FD8" wp14:editId="68C34354">
                   <wp:extent cx="621792" cy="829056"/>
                   <wp:effectExtent l="0" t="0" r="0" b="0"/>
                   <wp:docPr id="6" name="Picture 6"/>
@@ -883,7 +883,7 @@
                 <w:noProof/>
               </w:rPr>
               <w:drawing>
-                <wp:inline distT="0" distB="0" distL="0" distR="0" wp14:anchorId="540C1B82" wp14:editId="6F882902">
+                <wp:inline distT="0" distB="0" distL="0" distR="0" wp14:anchorId="25FAE0C2" wp14:editId="248D33E4">
                   <wp:extent cx="621792" cy="829056"/>
                   <wp:effectExtent l="0" t="0" r="0" b="0"/>
                   <wp:docPr id="7" name="Picture 7"/>
@@ -936,7 +936,7 @@
                 <w:noProof/>
               </w:rPr>
               <w:drawing>
-                <wp:inline distT="0" distB="0" distL="0" distR="0" wp14:anchorId="559A2950" wp14:editId="162FB802">
+                <wp:inline distT="0" distB="0" distL="0" distR="0" wp14:anchorId="580C7B42" wp14:editId="71E16D1D">
                   <wp:extent cx="621792" cy="829056"/>
                   <wp:effectExtent l="0" t="0" r="0" b="0"/>
                   <wp:docPr id="8" name="Picture 8"/>
@@ -1309,31 +1309,31 @@
       </w:rPr>
     </w:lvl>
   </w:abstractNum>
-  <w:num w:numId="1" w16cid:durableId="1725250041">
+  <w:num w:numId="1" w16cid:durableId="59521306">
     <w:abstractNumId w:val="8"/>
   </w:num>
-  <w:num w:numId="2" w16cid:durableId="457725111">
+  <w:num w:numId="2" w16cid:durableId="1635791912">
     <w:abstractNumId w:val="6"/>
   </w:num>
-  <w:num w:numId="3" w16cid:durableId="1885756337">
+  <w:num w:numId="3" w16cid:durableId="133721180">
     <w:abstractNumId w:val="5"/>
   </w:num>
-  <w:num w:numId="4" w16cid:durableId="921909449">
+  <w:num w:numId="4" w16cid:durableId="2114207037">
     <w:abstractNumId w:val="4"/>
   </w:num>
-  <w:num w:numId="5" w16cid:durableId="57553605">
+  <w:num w:numId="5" w16cid:durableId="635837827">
     <w:abstractNumId w:val="7"/>
   </w:num>
-  <w:num w:numId="6" w16cid:durableId="1231844083">
+  <w:num w:numId="6" w16cid:durableId="100227388">
     <w:abstractNumId w:val="3"/>
   </w:num>
-  <w:num w:numId="7" w16cid:durableId="1901405804">
+  <w:num w:numId="7" w16cid:durableId="1515925155">
     <w:abstractNumId w:val="2"/>
   </w:num>
-  <w:num w:numId="8" w16cid:durableId="241913613">
+  <w:num w:numId="8" w16cid:durableId="1273702540">
     <w:abstractNumId w:val="1"/>
   </w:num>
-  <w:num w:numId="9" w16cid:durableId="1163620791">
+  <w:num w:numId="9" w16cid:durableId="814495418">
     <w:abstractNumId w:val="0"/>
   </w:num>
 </w:numbering>
@@ -12724,7 +12724,7 @@
     <w:autoRedefine/>
     <w:uiPriority w:val="39"/>
     <w:unhideWhenUsed/>
-    <w:rsid w:val="00454159"/>
+    <w:rsid w:val="00311BE6"/>
     <w:pPr>
       <w:spacing w:after="100"/>
     </w:pPr>
@@ -12734,7 +12734,7 @@
     <w:basedOn w:val="Fontepargpadro"/>
     <w:uiPriority w:val="99"/>
     <w:unhideWhenUsed/>
-    <w:rsid w:val="00454159"/>
+    <w:rsid w:val="00311BE6"/>
     <w:rPr>
       <w:color w:val="0000FF" w:themeColor="hyperlink"/>
       <w:u w:val="single"/>

</xml_diff>